<commit_message>
fix: diagramas C4 y Casos de Uso en alta definicion, mockups Must Have y nombres de equipo
</commit_message>
<xml_diff>
--- a/docs/IS873_Nota1_Definicion_del_Proyecto_Consolidado.docx
+++ b/docs/IS873_Nota1_Definicion_del_Proyecto_Consolidado.docx
@@ -97,21 +97,23 @@
     </w:p>
     <w:p>
       <w:pPr>
-        <w:spacing w:after="200" w:line="202" w:lineRule="auto"/>
+        <w:spacing w:after="200" w:line="213" w:lineRule="auto"/>
         <w:jc w:val="center"/>
         <w:rPr>
           <w:rFonts w:ascii="Times New Roman" w:hAnsi="Times New Roman" w:cs="Times New Roman"/>
+          <w:b/>
           <w:i/>
-          <w:sz w:val="18"/>
-        </w:rPr>
-      </w:pPr>
-      <w:r>
-        <w:rPr>
-          <w:rFonts w:ascii="Times New Roman" w:hAnsi="Times New Roman" w:cs="Times New Roman"/>
+          <w:sz w:val="19"/>
+        </w:rPr>
+      </w:pPr>
+      <w:r>
+        <w:rPr>
+          <w:rFonts w:ascii="Times New Roman" w:hAnsi="Times New Roman" w:cs="Times New Roman"/>
+          <w:b/>
           <w:i/>
-          <w:sz w:val="18"/>
-        </w:rPr>
-        <w:t>Equipo: Jose David Marin Giraldo • Omar David Bernal Restrepo • Andres Felipe Mora • Maximiliano Giraldo</w:t>
+          <w:sz w:val="19"/>
+        </w:rPr>
+        <w:t>Equipo: Jose David Marin Giraldo • Edwin Osorio Cartagena • Maicol Londono Hernandez</w:t>
       </w:r>
     </w:p>
     <w:tbl>
@@ -158,7 +160,7 @@
           </w:tcPr>
           <w:p>
             <w:pPr>
-              <w:spacing w:after="200" w:line="202" w:lineRule="auto"/>
+              <w:spacing w:after="200" w:line="213" w:lineRule="auto"/>
               <w:jc w:val="center"/>
               <w:rPr>
                 <w:rFonts w:ascii="Times New Roman" w:hAnsi="Times New Roman" w:cs="Times New Roman"/>
@@ -186,10 +188,11 @@
           </w:tcPr>
           <w:p>
             <w:pPr>
-              <w:spacing w:after="200" w:line="202" w:lineRule="auto"/>
+              <w:spacing w:after="200" w:line="213" w:lineRule="auto"/>
               <w:jc w:val="center"/>
               <w:rPr>
                 <w:rFonts w:ascii="Times New Roman" w:hAnsi="Times New Roman" w:cs="Times New Roman"/>
+                <w:b/>
                 <w:i/>
                 <w:sz w:val="18"/>
               </w:rPr>
@@ -197,6 +200,7 @@
             <w:r>
               <w:rPr>
                 <w:rFonts w:ascii="Times New Roman" w:hAnsi="Times New Roman" w:cs="Times New Roman"/>
+                <w:b/>
                 <w:i/>
                 <w:sz w:val="18"/>
               </w:rPr>
@@ -226,7 +230,7 @@
           </w:tcPr>
           <w:p>
             <w:pPr>
-              <w:spacing w:after="200" w:line="202" w:lineRule="auto"/>
+              <w:spacing w:after="200" w:line="213" w:lineRule="auto"/>
               <w:jc w:val="center"/>
               <w:rPr>
                 <w:rFonts w:ascii="Times New Roman" w:hAnsi="Times New Roman" w:cs="Times New Roman"/>
@@ -254,10 +258,11 @@
           </w:tcPr>
           <w:p>
             <w:pPr>
-              <w:spacing w:after="200" w:line="202" w:lineRule="auto"/>
+              <w:spacing w:after="200" w:line="213" w:lineRule="auto"/>
               <w:jc w:val="center"/>
               <w:rPr>
                 <w:rFonts w:ascii="Times New Roman" w:hAnsi="Times New Roman" w:cs="Times New Roman"/>
+                <w:b/>
                 <w:i/>
                 <w:sz w:val="18"/>
               </w:rPr>
@@ -265,6 +270,7 @@
             <w:r>
               <w:rPr>
                 <w:rFonts w:ascii="Times New Roman" w:hAnsi="Times New Roman" w:cs="Times New Roman"/>
+                <w:b/>
                 <w:i/>
                 <w:sz w:val="18"/>
               </w:rPr>
@@ -294,7 +300,7 @@
           </w:tcPr>
           <w:p>
             <w:pPr>
-              <w:spacing w:after="200" w:line="202" w:lineRule="auto"/>
+              <w:spacing w:after="200" w:line="213" w:lineRule="auto"/>
               <w:jc w:val="center"/>
               <w:rPr>
                 <w:rFonts w:ascii="Times New Roman" w:hAnsi="Times New Roman" w:cs="Times New Roman"/>
@@ -322,10 +328,11 @@
           </w:tcPr>
           <w:p>
             <w:pPr>
-              <w:spacing w:after="200" w:line="202" w:lineRule="auto"/>
+              <w:spacing w:after="200" w:line="213" w:lineRule="auto"/>
               <w:jc w:val="center"/>
               <w:rPr>
                 <w:rFonts w:ascii="Times New Roman" w:hAnsi="Times New Roman" w:cs="Times New Roman"/>
+                <w:b/>
                 <w:i/>
                 <w:sz w:val="18"/>
               </w:rPr>
@@ -333,6 +340,7 @@
             <w:r>
               <w:rPr>
                 <w:rFonts w:ascii="Times New Roman" w:hAnsi="Times New Roman" w:cs="Times New Roman"/>
+                <w:b/>
                 <w:i/>
                 <w:sz w:val="18"/>
               </w:rPr>
@@ -359,7 +367,7 @@
           </w:tcPr>
           <w:p>
             <w:pPr>
-              <w:spacing w:after="200" w:line="202" w:lineRule="auto"/>
+              <w:spacing w:after="200" w:line="213" w:lineRule="auto"/>
               <w:jc w:val="center"/>
               <w:rPr>
                 <w:rFonts w:ascii="Times New Roman" w:hAnsi="Times New Roman" w:cs="Times New Roman"/>
@@ -387,10 +395,11 @@
           </w:tcPr>
           <w:p>
             <w:pPr>
-              <w:spacing w:after="200" w:line="202" w:lineRule="auto"/>
+              <w:spacing w:after="200" w:line="213" w:lineRule="auto"/>
               <w:jc w:val="center"/>
               <w:rPr>
                 <w:rFonts w:ascii="Times New Roman" w:hAnsi="Times New Roman" w:cs="Times New Roman"/>
+                <w:b/>
                 <w:i/>
                 <w:sz w:val="18"/>
               </w:rPr>
@@ -398,6 +407,7 @@
             <w:r>
               <w:rPr>
                 <w:rFonts w:ascii="Times New Roman" w:hAnsi="Times New Roman" w:cs="Times New Roman"/>
+                <w:b/>
                 <w:i/>
                 <w:sz w:val="18"/>
               </w:rPr>
@@ -409,7 +419,7 @@
     </w:tbl>
     <w:p>
       <w:pPr>
-        <w:spacing w:before="220" w:after="60" w:line="299" w:lineRule="auto"/>
+        <w:spacing w:before="240" w:after="60" w:line="299" w:lineRule="auto"/>
         <w:rPr>
           <w:rFonts w:ascii="Times New Roman" w:hAnsi="Times New Roman" w:cs="Times New Roman"/>
           <w:b/>
@@ -427,7 +437,7 @@
     </w:p>
     <w:p>
       <w:pPr>
-        <w:spacing w:before="140" w:after="40" w:line="253" w:lineRule="auto"/>
+        <w:spacing w:before="160" w:after="40" w:line="253" w:lineRule="auto"/>
         <w:rPr>
           <w:rFonts w:ascii="Times New Roman" w:hAnsi="Times New Roman" w:cs="Times New Roman"/>
           <w:b/>
@@ -460,7 +470,7 @@
     </w:p>
     <w:p>
       <w:pPr>
-        <w:spacing w:before="140" w:after="40" w:line="253" w:lineRule="auto"/>
+        <w:spacing w:before="160" w:after="40" w:line="253" w:lineRule="auto"/>
         <w:rPr>
           <w:rFonts w:ascii="Times New Roman" w:hAnsi="Times New Roman" w:cs="Times New Roman"/>
           <w:b/>
@@ -641,7 +651,7 @@
     </w:p>
     <w:p>
       <w:pPr>
-        <w:spacing w:before="140" w:after="40" w:line="253" w:lineRule="auto"/>
+        <w:spacing w:before="160" w:after="40" w:line="253" w:lineRule="auto"/>
         <w:rPr>
           <w:rFonts w:ascii="Times New Roman" w:hAnsi="Times New Roman" w:cs="Times New Roman"/>
           <w:b/>
@@ -674,7 +684,7 @@
     </w:p>
     <w:p>
       <w:pPr>
-        <w:spacing w:before="140" w:after="40" w:line="253" w:lineRule="auto"/>
+        <w:spacing w:before="160" w:after="40" w:line="253" w:lineRule="auto"/>
         <w:rPr>
           <w:rFonts w:ascii="Times New Roman" w:hAnsi="Times New Roman" w:cs="Times New Roman"/>
           <w:b/>
@@ -702,12 +712,12 @@
           <w:rFonts w:ascii="Times New Roman" w:hAnsi="Times New Roman" w:cs="Times New Roman"/>
           <w:sz w:val="20"/>
         </w:rPr>
-        <w:t>Restricciones: 4 sprints académicos de desarrollo, uso exclusivo de infraestructura en capa gratuita (Google Maps Demo Key, Neon PostgreSQL, Vercel, Render) y cumplimiento de la Ley 1581 de 2012 (Habeas Data). Supuestos: Usuarios con navegadores web modernos y conexión a internet estable.</w:t>
-      </w:r>
-    </w:p>
-    <w:p>
-      <w:pPr>
-        <w:spacing w:before="220" w:after="60" w:line="299" w:lineRule="auto"/>
+        <w:t>Restricciones: 4 sprints académicos de desarrollo, uso exclusivo de infraestructura en capa gratuita (Google Maps Demo Key, Neon PostgreSQL, Vercel, Render) y cumplimiento de la Ley 1581 de 2012 (Habeas Data). Supuestos: Usuarios con navegadores web modernos y conexón a internet estable.</w:t>
+      </w:r>
+    </w:p>
+    <w:p>
+      <w:pPr>
+        <w:spacing w:before="240" w:after="60" w:line="299" w:lineRule="auto"/>
         <w:rPr>
           <w:rFonts w:ascii="Times New Roman" w:hAnsi="Times New Roman" w:cs="Times New Roman"/>
           <w:b/>
@@ -725,7 +735,7 @@
     </w:p>
     <w:p>
       <w:pPr>
-        <w:spacing w:before="140" w:after="40" w:line="253" w:lineRule="auto"/>
+        <w:spacing w:before="160" w:after="40" w:line="253" w:lineRule="auto"/>
         <w:rPr>
           <w:rFonts w:ascii="Times New Roman" w:hAnsi="Times New Roman" w:cs="Times New Roman"/>
           <w:b/>
@@ -2028,7 +2038,7 @@
     </w:p>
     <w:p>
       <w:pPr>
-        <w:spacing w:before="140" w:after="40" w:line="253" w:lineRule="auto"/>
+        <w:spacing w:before="160" w:after="40" w:line="253" w:lineRule="auto"/>
         <w:rPr>
           <w:rFonts w:ascii="Times New Roman" w:hAnsi="Times New Roman" w:cs="Times New Roman"/>
           <w:b/>
@@ -2407,7 +2417,7 @@
     </w:p>
     <w:p>
       <w:pPr>
-        <w:spacing w:before="140" w:after="40" w:line="253" w:lineRule="auto"/>
+        <w:spacing w:before="160" w:after="40" w:line="253" w:lineRule="auto"/>
         <w:rPr>
           <w:rFonts w:ascii="Times New Roman" w:hAnsi="Times New Roman" w:cs="Times New Roman"/>
           <w:b/>
@@ -2435,12 +2445,12 @@
           <w:rFonts w:ascii="Times New Roman" w:hAnsi="Times New Roman" w:cs="Times New Roman"/>
           <w:sz w:val="20"/>
         </w:rPr>
-        <w:t>Se seleccionó el framework de Casos de Uso + MoSCoW porque modela con precisión los contratos de interacción y políticas de seguridad de 4 roles dispares, vincula de forma transparente las 34 entidades de base de datos normalizadas y proporciona una categorización binaria e innegociable ante el comité de inversión para salvaguardar el alcance del semestre.</w:t>
-      </w:r>
-    </w:p>
-    <w:p>
-      <w:pPr>
-        <w:spacing w:before="220" w:after="60" w:line="299" w:lineRule="auto"/>
+        <w:t>Se seleccionó el framework de Casos de Uso + MoSCoW porque modela con precisión los contratos de interacción y políticas de seguridad de 4 roles dispares, vincula de forma transparente las 34 entidades de base de datos normalizadas y proporciona una categorización binaria e innegociable ante el comité de inversón para salvaguardar el alcance del semestre.</w:t>
+      </w:r>
+    </w:p>
+    <w:p>
+      <w:pPr>
+        <w:spacing w:before="240" w:after="60" w:line="299" w:lineRule="auto"/>
         <w:rPr>
           <w:rFonts w:ascii="Times New Roman" w:hAnsi="Times New Roman" w:cs="Times New Roman"/>
           <w:b/>
@@ -2458,6 +2468,22 @@
     </w:p>
     <w:p>
       <w:pPr>
+        <w:spacing w:before="160" w:after="40" w:line="253" w:lineRule="auto"/>
+        <w:rPr>
+          <w:rFonts w:ascii="Times New Roman" w:hAnsi="Times New Roman" w:cs="Times New Roman"/>
+          <w:b/>
+        </w:rPr>
+      </w:pPr>
+      <w:r>
+        <w:rPr>
+          <w:rFonts w:ascii="Times New Roman" w:hAnsi="Times New Roman" w:cs="Times New Roman"/>
+          <w:b/>
+        </w:rPr>
+        <w:t>3.1 Diagrama General de Casos de Uso (Relación Actores – Sistema)</w:t>
+      </w:r>
+    </w:p>
+    <w:p>
+      <w:pPr>
         <w:spacing w:after="60" w:line="224" w:lineRule="auto"/>
         <w:jc w:val="both"/>
         <w:rPr>
@@ -2470,40 +2496,7 @@
           <w:rFonts w:ascii="Times New Roman" w:hAnsi="Times New Roman" w:cs="Times New Roman"/>
           <w:sz w:val="20"/>
         </w:rPr>
-        <w:t>Se desarrollaron los 4 casos de uso más críticos del sistema a tres niveles: Resumen (proceso de negocio), Objetivo de Usuario (interacción en sesión) y Subfunción (paso atómico técnico).</w:t>
-      </w:r>
-    </w:p>
-    <w:p>
-      <w:pPr>
-        <w:spacing w:before="140" w:after="40" w:line="253" w:lineRule="auto"/>
-        <w:rPr>
-          <w:rFonts w:ascii="Times New Roman" w:hAnsi="Times New Roman" w:cs="Times New Roman"/>
-          <w:b/>
-        </w:rPr>
-      </w:pPr>
-      <w:r>
-        <w:rPr>
-          <w:rFonts w:ascii="Times New Roman" w:hAnsi="Times New Roman" w:cs="Times New Roman"/>
-          <w:b/>
-        </w:rPr>
-        <w:t>3.1 Diagrama General de Casos de Uso (Relación Actores – Sistema)</w:t>
-      </w:r>
-    </w:p>
-    <w:p>
-      <w:pPr>
-        <w:spacing w:after="60" w:line="224" w:lineRule="auto"/>
-        <w:jc w:val="both"/>
-        <w:rPr>
-          <w:rFonts w:ascii="Times New Roman" w:hAnsi="Times New Roman" w:cs="Times New Roman"/>
-          <w:sz w:val="20"/>
-        </w:rPr>
-      </w:pPr>
-      <w:r>
-        <w:rPr>
-          <w:rFonts w:ascii="Times New Roman" w:hAnsi="Times New Roman" w:cs="Times New Roman"/>
-          <w:sz w:val="20"/>
-        </w:rPr>
-        <w:t>A continuación se presenta el mapa general de casos de uso del sistema. Cada actor cuenta con una convención cromática diferenciada en sus líneas de asociación para garantizar absoluta claridad visual y evitar interpretaciones ambiguas:</w:t>
+        <w:t>A continuación se presenta el diagrama general de casos de uso del sistema. Para garantizar absoluta legibilidad y prevenir interpretaciones ambiguas ante el comité, cada actor y sus líneas de asociación cuentan con una convención cromática exclusiva:</w:t>
       </w:r>
     </w:p>
     <w:p>
@@ -2536,7 +2529,7 @@
           <w:rFonts w:ascii="Times New Roman" w:hAnsi="Times New Roman" w:cs="Times New Roman"/>
           <w:sz w:val="19"/>
         </w:rPr>
-        <w:t>Interacción con módulos públicos de registro y consulta básica.</w:t>
+        <w:t>Módulos públicos de exploración de catálogo y registro de cuenta.</w:t>
       </w:r>
     </w:p>
     <w:p>
@@ -2569,7 +2562,7 @@
           <w:rFonts w:ascii="Times New Roman" w:hAnsi="Times New Roman" w:cs="Times New Roman"/>
           <w:sz w:val="19"/>
         </w:rPr>
-        <w:t>Acceso a compras, reservas, carrito, devoluciones y gestión de perfil.</w:t>
+        <w:t>Flujos de compra, reserva de 24h, carrito, cancelación, seguimiento de envío y garantías.</w:t>
       </w:r>
     </w:p>
     <w:p>
@@ -2602,7 +2595,7 @@
           <w:rFonts w:ascii="Times New Roman" w:hAnsi="Times New Roman" w:cs="Times New Roman"/>
           <w:sz w:val="19"/>
         </w:rPr>
-        <w:t>Control granular de inventario, gestión de libros y soporte técnico.</w:t>
+        <w:t>Gestión granular de libros, control de inventario físico y atención de soporte.</w:t>
       </w:r>
     </w:p>
     <w:p>
@@ -2635,7 +2628,7 @@
           <w:rFonts w:ascii="Times New Roman" w:hAnsi="Times New Roman" w:cs="Times New Roman"/>
           <w:sz w:val="19"/>
         </w:rPr>
-        <w:t>Administración de cuentas del personal, privilegios y auditoría de seguridad.</w:t>
+        <w:t>Administración de cuentas del personal y auditoría de la plataforma.</w:t>
       </w:r>
     </w:p>
     <w:p>
@@ -2668,7 +2661,7 @@
           <w:rFonts w:ascii="Times New Roman" w:hAnsi="Times New Roman" w:cs="Times New Roman"/>
           <w:sz w:val="19"/>
         </w:rPr>
-        <w:t>Procesos automatizados de liberación de reservas a las 24 horas y emisión de bonos.</w:t>
+        <w:t>Procesos automatizados de liberación de reservas vencidas y despacho de bonos.</w:t>
       </w:r>
     </w:p>
     <w:p>
@@ -2688,9 +2681,9 @@
           <w:sz w:val="19"/>
         </w:rPr>
         <w:drawing>
-          <wp:inline distT="0" distB="0" distL="0" distR="0" wp14:anchorId="0EBA05FA" wp14:editId="135D8F75">
-            <wp:extent cx="4699000" cy="6081196"/>
-            <wp:effectExtent l="0" t="0" r="6350" b="0"/>
+          <wp:inline distT="0" distB="0" distL="0" distR="0" wp14:anchorId="12D3C82C" wp14:editId="7A1D9D9F">
+            <wp:extent cx="4191000" cy="10738505"/>
+            <wp:effectExtent l="0" t="0" r="0" b="5715"/>
             <wp:docPr id="1" name="Imagen 1"/>
             <wp:cNvGraphicFramePr/>
             <a:graphic xmlns:a="http://schemas.openxmlformats.org/drawingml/2006/main">
@@ -2715,7 +2708,7 @@
                   <pic:spPr>
                     <a:xfrm>
                       <a:off x="0" y="0"/>
-                      <a:ext cx="4699000" cy="6081196"/>
+                      <a:ext cx="4191000" cy="10738505"/>
                     </a:xfrm>
                     <a:prstGeom prst="rect">
                       <a:avLst/>
@@ -2747,28 +2740,597 @@
           <w:i/>
           <w:sz w:val="17"/>
         </w:rPr>
-        <w:t>Figura 3.1: Diagrama General de Casos de Uso — Módulos de Clientes, Visitantes y Administración (Parte 1)</w:t>
-      </w:r>
-    </w:p>
-    <w:p>
-      <w:pPr>
-        <w:spacing w:before="40" w:after="140" w:line="213" w:lineRule="auto"/>
-        <w:ind w:left="360" w:hanging="240"/>
+        <w:t>Figura 3.1: Diagrama General de Casos de Uso con Trazabilidad Cromática por Actor</w:t>
+      </w:r>
+    </w:p>
+    <w:p>
+      <w:pPr>
+        <w:spacing w:before="160" w:after="40" w:line="253" w:lineRule="auto"/>
+        <w:rPr>
+          <w:rFonts w:ascii="Times New Roman" w:hAnsi="Times New Roman" w:cs="Times New Roman"/>
+          <w:b/>
+        </w:rPr>
+      </w:pPr>
+      <w:r>
+        <w:rPr>
+          <w:rFonts w:ascii="Times New Roman" w:hAnsi="Times New Roman" w:cs="Times New Roman"/>
+          <w:b/>
+        </w:rPr>
+        <w:t>3.2 CU-01: Comprar Libro (Checkout Transaccional)</w:t>
+      </w:r>
+    </w:p>
+    <w:p>
+      <w:pPr>
+        <w:spacing w:after="60" w:line="224" w:lineRule="auto"/>
+        <w:jc w:val="both"/>
+        <w:rPr>
+          <w:rFonts w:ascii="Times New Roman" w:hAnsi="Times New Roman" w:cs="Times New Roman"/>
+          <w:sz w:val="20"/>
+        </w:rPr>
+      </w:pPr>
+      <w:r>
+        <w:rPr>
+          <w:rFonts w:ascii="Times New Roman" w:hAnsi="Times New Roman" w:cs="Times New Roman"/>
+          <w:sz w:val="20"/>
+        </w:rPr>
+        <w:t>• Resumen: Compra integral de libros agregados al carrito con deducción en tiempo real y pago seguro tokenizado.</w:t>
+      </w:r>
+    </w:p>
+    <w:p>
+      <w:pPr>
+        <w:spacing w:after="60" w:line="224" w:lineRule="auto"/>
+        <w:jc w:val="both"/>
+        <w:rPr>
+          <w:rFonts w:ascii="Times New Roman" w:hAnsi="Times New Roman" w:cs="Times New Roman"/>
+          <w:sz w:val="20"/>
+        </w:rPr>
+      </w:pPr>
+      <w:r>
+        <w:rPr>
+          <w:rFonts w:ascii="Times New Roman" w:hAnsi="Times New Roman" w:cs="Times New Roman"/>
+          <w:sz w:val="20"/>
+        </w:rPr>
+        <w:t>• Usuario: El cliente valida carrito, selecciona entrega (domicilio o tienda) y confirma pago con saldo o tarjeta. Flujo alterno: Si la pasarela rechaza la tarjeta o el saldo es insuficiente, se aplica rollback atómico.</w:t>
+      </w:r>
+    </w:p>
+    <w:p>
+      <w:pPr>
+        <w:spacing w:after="60" w:line="224" w:lineRule="auto"/>
+        <w:jc w:val="both"/>
+        <w:rPr>
+          <w:rFonts w:ascii="Times New Roman" w:hAnsi="Times New Roman" w:cs="Times New Roman"/>
+          <w:sz w:val="20"/>
+        </w:rPr>
+      </w:pPr>
+      <w:r>
+        <w:rPr>
+          <w:rFonts w:ascii="Times New Roman" w:hAnsi="Times New Roman" w:cs="Times New Roman"/>
+          <w:sz w:val="20"/>
+        </w:rPr>
+        <w:t>• Subfunción SF-01: Bloqueo de fila (SELECT FOR UPDATE) sobre EJEMPLAR, cambio a estado 'VENDIDO' y confirmación de transacción.</w:t>
+      </w:r>
+    </w:p>
+    <w:p>
+      <w:pPr>
+        <w:spacing w:before="160" w:after="40" w:line="253" w:lineRule="auto"/>
+        <w:rPr>
+          <w:rFonts w:ascii="Times New Roman" w:hAnsi="Times New Roman" w:cs="Times New Roman"/>
+          <w:b/>
+        </w:rPr>
+      </w:pPr>
+      <w:r>
+        <w:rPr>
+          <w:rFonts w:ascii="Times New Roman" w:hAnsi="Times New Roman" w:cs="Times New Roman"/>
+          <w:b/>
+        </w:rPr>
+        <w:t>3.3 CU-02: Reservar Libro y Liberación Automática a las 24 Horas</w:t>
+      </w:r>
+    </w:p>
+    <w:p>
+      <w:pPr>
+        <w:spacing w:after="60" w:line="224" w:lineRule="auto"/>
+        <w:jc w:val="both"/>
+        <w:rPr>
+          <w:rFonts w:ascii="Times New Roman" w:hAnsi="Times New Roman" w:cs="Times New Roman"/>
+          <w:sz w:val="20"/>
+        </w:rPr>
+      </w:pPr>
+      <w:r>
+        <w:rPr>
+          <w:rFonts w:ascii="Times New Roman" w:hAnsi="Times New Roman" w:cs="Times New Roman"/>
+          <w:sz w:val="20"/>
+        </w:rPr>
+        <w:t>• Resumen: Bloqueo temporal de copias físicas por máximo 24h, liberando el stock si no se compra.</w:t>
+      </w:r>
+    </w:p>
+    <w:p>
+      <w:pPr>
+        <w:spacing w:after="60" w:line="224" w:lineRule="auto"/>
+        <w:jc w:val="both"/>
+        <w:rPr>
+          <w:rFonts w:ascii="Times New Roman" w:hAnsi="Times New Roman" w:cs="Times New Roman"/>
+          <w:sz w:val="20"/>
+        </w:rPr>
+      </w:pPr>
+      <w:r>
+        <w:rPr>
+          <w:rFonts w:ascii="Times New Roman" w:hAnsi="Times New Roman" w:cs="Times New Roman"/>
+          <w:sz w:val="20"/>
+        </w:rPr>
+        <w:t>• Usuario: Cliente aparta libro (máx. 5 títulos / 3 ejemplares). Flujo de Excepción: El Scheduler (APScheduler) revisa cada 15 min reservas vencidas, expira el registro y regresa el ejemplar a 'DISPONIBLE'.</w:t>
+      </w:r>
+    </w:p>
+    <w:p>
+      <w:pPr>
+        <w:spacing w:after="60" w:line="224" w:lineRule="auto"/>
+        <w:jc w:val="both"/>
+        <w:rPr>
+          <w:rFonts w:ascii="Times New Roman" w:hAnsi="Times New Roman" w:cs="Times New Roman"/>
+          <w:sz w:val="20"/>
+        </w:rPr>
+      </w:pPr>
+      <w:r>
+        <w:rPr>
+          <w:rFonts w:ascii="Times New Roman" w:hAnsi="Times New Roman" w:cs="Times New Roman"/>
+          <w:sz w:val="20"/>
+        </w:rPr>
+        <w:t>• Subfunción SF-02: Actualización masiva en lote de ejemplares expirados y recálculo de stock.</w:t>
+      </w:r>
+    </w:p>
+    <w:p>
+      <w:pPr>
+        <w:spacing w:before="160" w:after="40" w:line="253" w:lineRule="auto"/>
+        <w:rPr>
+          <w:rFonts w:ascii="Times New Roman" w:hAnsi="Times New Roman" w:cs="Times New Roman"/>
+          <w:b/>
+        </w:rPr>
+      </w:pPr>
+      <w:r>
+        <w:rPr>
+          <w:rFonts w:ascii="Times New Roman" w:hAnsi="Times New Roman" w:cs="Times New Roman"/>
+          <w:b/>
+        </w:rPr>
+        <w:t>3.4 CU-03: Recogida en Tienda Física con Geolocalización (Google Maps)</w:t>
+      </w:r>
+    </w:p>
+    <w:p>
+      <w:pPr>
+        <w:spacing w:after="60" w:line="224" w:lineRule="auto"/>
+        <w:jc w:val="both"/>
+        <w:rPr>
+          <w:rFonts w:ascii="Times New Roman" w:hAnsi="Times New Roman" w:cs="Times New Roman"/>
+          <w:sz w:val="20"/>
+        </w:rPr>
+      </w:pPr>
+      <w:r>
+        <w:rPr>
+          <w:rFonts w:ascii="Times New Roman" w:hAnsi="Times New Roman" w:cs="Times New Roman"/>
+          <w:sz w:val="20"/>
+        </w:rPr>
+        <w:t>• Resumen: Retiro en sucursal física con ubicación en mapa y cálculo de tienda más cercana con inventario.</w:t>
+      </w:r>
+    </w:p>
+    <w:p>
+      <w:pPr>
+        <w:spacing w:after="60" w:line="224" w:lineRule="auto"/>
+        <w:jc w:val="both"/>
+        <w:rPr>
+          <w:rFonts w:ascii="Times New Roman" w:hAnsi="Times New Roman" w:cs="Times New Roman"/>
+          <w:sz w:val="20"/>
+        </w:rPr>
+      </w:pPr>
+      <w:r>
+        <w:rPr>
+          <w:rFonts w:ascii="Times New Roman" w:hAnsi="Times New Roman" w:cs="Times New Roman"/>
+          <w:sz w:val="20"/>
+        </w:rPr>
+        <w:t>• Usuario: Cliente selecciona 'Recogida', visualiza mapa interactivo de Google Maps y elige tienda con stock. Excepción: Si la tienda carece de existencias completas, el sistema sugiere la sucursal más cercana con stock.</w:t>
+      </w:r>
+    </w:p>
+    <w:p>
+      <w:pPr>
+        <w:spacing w:after="60" w:line="224" w:lineRule="auto"/>
+        <w:jc w:val="both"/>
+        <w:rPr>
+          <w:rFonts w:ascii="Times New Roman" w:hAnsi="Times New Roman" w:cs="Times New Roman"/>
+          <w:sz w:val="20"/>
+        </w:rPr>
+      </w:pPr>
+      <w:r>
+        <w:rPr>
+          <w:rFonts w:ascii="Times New Roman" w:hAnsi="Times New Roman" w:cs="Times New Roman"/>
+          <w:sz w:val="20"/>
+        </w:rPr>
+        <w:t>• Subfunción SF-03: Cálculo geoespacial de distancia a tiendas con inventario positivo.</w:t>
+      </w:r>
+    </w:p>
+    <w:p>
+      <w:pPr>
+        <w:spacing w:before="160" w:after="40" w:line="253" w:lineRule="auto"/>
+        <w:rPr>
+          <w:rFonts w:ascii="Times New Roman" w:hAnsi="Times New Roman" w:cs="Times New Roman"/>
+          <w:b/>
+        </w:rPr>
+      </w:pPr>
+      <w:r>
+        <w:rPr>
+          <w:rFonts w:ascii="Times New Roman" w:hAnsi="Times New Roman" w:cs="Times New Roman"/>
+          <w:b/>
+        </w:rPr>
+        <w:t>3.5 CU-04: Solicitud de Devolución con Código QR y Límite de 8 Días</w:t>
+      </w:r>
+    </w:p>
+    <w:p>
+      <w:pPr>
+        <w:spacing w:after="60" w:line="224" w:lineRule="auto"/>
+        <w:jc w:val="both"/>
+        <w:rPr>
+          <w:rFonts w:ascii="Times New Roman" w:hAnsi="Times New Roman" w:cs="Times New Roman"/>
+          <w:sz w:val="20"/>
+        </w:rPr>
+      </w:pPr>
+      <w:r>
+        <w:rPr>
+          <w:rFonts w:ascii="Times New Roman" w:hAnsi="Times New Roman" w:cs="Times New Roman"/>
+          <w:sz w:val="20"/>
+        </w:rPr>
+        <w:t>• Resumen: Tramitación de garantía para pedidos entregados con salvoconducto digital en código QR.</w:t>
+      </w:r>
+    </w:p>
+    <w:p>
+      <w:pPr>
+        <w:spacing w:after="60" w:line="224" w:lineRule="auto"/>
+        <w:jc w:val="both"/>
+        <w:rPr>
+          <w:rFonts w:ascii="Times New Roman" w:hAnsi="Times New Roman" w:cs="Times New Roman"/>
+          <w:sz w:val="20"/>
+        </w:rPr>
+      </w:pPr>
+      <w:r>
+        <w:rPr>
+          <w:rFonts w:ascii="Times New Roman" w:hAnsi="Times New Roman" w:cs="Times New Roman"/>
+          <w:sz w:val="20"/>
+        </w:rPr>
+        <w:t>• Usuario: Cliente selecciona pedido entregado, diligencia causas y recibe QR por email. Excepción: Si fecha_actual - fecha_entrega &gt; 8 días, el sistema rechaza la solicitud automáticamente.</w:t>
+      </w:r>
+    </w:p>
+    <w:p>
+      <w:pPr>
+        <w:spacing w:after="60" w:line="224" w:lineRule="auto"/>
+        <w:jc w:val="both"/>
+        <w:rPr>
+          <w:rFonts w:ascii="Times New Roman" w:hAnsi="Times New Roman" w:cs="Times New Roman"/>
+          <w:sz w:val="20"/>
+        </w:rPr>
+      </w:pPr>
+      <w:r>
+        <w:rPr>
+          <w:rFonts w:ascii="Times New Roman" w:hAnsi="Times New Roman" w:cs="Times New Roman"/>
+          <w:sz w:val="20"/>
+        </w:rPr>
+        <w:t>• Subfunción SF-04: Generación y firma criptográfica del token QR (HMAC-SHA256) codificado en imagen PNG.</w:t>
+      </w:r>
+    </w:p>
+    <w:p>
+      <w:pPr>
+        <w:spacing w:before="240" w:after="60" w:line="299" w:lineRule="auto"/>
+        <w:rPr>
+          <w:rFonts w:ascii="Times New Roman" w:hAnsi="Times New Roman" w:cs="Times New Roman"/>
+          <w:b/>
+          <w:sz w:val="26"/>
+        </w:rPr>
+      </w:pPr>
+      <w:r>
+        <w:rPr>
+          <w:rFonts w:ascii="Times New Roman" w:hAnsi="Times New Roman" w:cs="Times New Roman"/>
+          <w:b/>
+          <w:sz w:val="26"/>
+        </w:rPr>
+        <w:t>4. Priorización MoSCoW y Defensa de los Must Have</w:t>
+      </w:r>
+    </w:p>
+    <w:p>
+      <w:pPr>
+        <w:spacing w:after="60" w:line="224" w:lineRule="auto"/>
+        <w:jc w:val="both"/>
+        <w:rPr>
+          <w:rFonts w:ascii="Times New Roman" w:hAnsi="Times New Roman" w:cs="Times New Roman"/>
+          <w:sz w:val="20"/>
+        </w:rPr>
+      </w:pPr>
+      <w:r>
+        <w:rPr>
+          <w:rFonts w:ascii="Times New Roman" w:hAnsi="Times New Roman" w:cs="Times New Roman"/>
+          <w:sz w:val="20"/>
+        </w:rPr>
+        <w:t>La clasificación del backlog protege al equipo ante restricciones temporales:</w:t>
+      </w:r>
+    </w:p>
+    <w:p>
+      <w:pPr>
+        <w:spacing w:after="40" w:line="213" w:lineRule="auto"/>
+        <w:ind w:left="360" w:hanging="240"/>
+        <w:jc w:val="both"/>
+        <w:rPr>
+          <w:rFonts w:ascii="Times New Roman" w:hAnsi="Times New Roman" w:cs="Times New Roman"/>
+          <w:sz w:val="19"/>
+        </w:rPr>
+      </w:pPr>
+      <w:r>
+        <w:rPr>
+          <w:rFonts w:ascii="Times New Roman" w:hAnsi="Times New Roman" w:cs="Times New Roman"/>
+          <w:sz w:val="19"/>
+        </w:rPr>
+        <w:t xml:space="preserve">• </w:t>
+      </w:r>
+      <w:r>
+        <w:rPr>
+          <w:rFonts w:ascii="Times New Roman" w:hAnsi="Times New Roman" w:cs="Times New Roman"/>
+          <w:b/>
+          <w:sz w:val="19"/>
+        </w:rPr>
+        <w:t xml:space="preserve">MUST HAVE (17 RFs — 43.6%): </w:t>
+      </w:r>
+      <w:r>
+        <w:rPr>
+          <w:rFonts w:ascii="Times New Roman" w:hAnsi="Times New Roman" w:cs="Times New Roman"/>
+          <w:sz w:val="19"/>
+        </w:rPr>
+        <w:t>RF-001, 002, 003, 004, 005 (Inventario granular), RF-008, 009, 010, 011, 012, 013, 014 (Compras y reservas de 24h), RF-026, 027, 028, 030, 031 (Seguridad RBAC). Sin ellos no existe producto.</w:t>
+      </w:r>
+    </w:p>
+    <w:p>
+      <w:pPr>
+        <w:spacing w:after="40" w:line="213" w:lineRule="auto"/>
+        <w:ind w:left="360" w:hanging="240"/>
+        <w:jc w:val="both"/>
+        <w:rPr>
+          <w:rFonts w:ascii="Times New Roman" w:hAnsi="Times New Roman" w:cs="Times New Roman"/>
+          <w:sz w:val="19"/>
+        </w:rPr>
+      </w:pPr>
+      <w:r>
+        <w:rPr>
+          <w:rFonts w:ascii="Times New Roman" w:hAnsi="Times New Roman" w:cs="Times New Roman"/>
+          <w:sz w:val="19"/>
+        </w:rPr>
+        <w:t xml:space="preserve">• </w:t>
+      </w:r>
+      <w:r>
+        <w:rPr>
+          <w:rFonts w:ascii="Times New Roman" w:hAnsi="Times New Roman" w:cs="Times New Roman"/>
+          <w:b/>
+          <w:sz w:val="19"/>
+        </w:rPr>
+        <w:t xml:space="preserve">SHOULD HAVE (12 RFs — 30.8%): </w:t>
+      </w:r>
+      <w:r>
+        <w:rPr>
+          <w:rFonts w:ascii="Times New Roman" w:hAnsi="Times New Roman" w:cs="Times New Roman"/>
+          <w:sz w:val="19"/>
+        </w:rPr>
+        <w:t>RF-006, 015, 016, 017, 019, 020, 021, 022, 023, 024, 035, 036 (Historial, Devoluciones QR, Tiendas físicas).</w:t>
+      </w:r>
+    </w:p>
+    <w:p>
+      <w:pPr>
+        <w:spacing w:after="40" w:line="213" w:lineRule="auto"/>
+        <w:ind w:left="360" w:hanging="240"/>
+        <w:jc w:val="both"/>
+        <w:rPr>
+          <w:rFonts w:ascii="Times New Roman" w:hAnsi="Times New Roman" w:cs="Times New Roman"/>
+          <w:sz w:val="19"/>
+        </w:rPr>
+      </w:pPr>
+      <w:r>
+        <w:rPr>
+          <w:rFonts w:ascii="Times New Roman" w:hAnsi="Times New Roman" w:cs="Times New Roman"/>
+          <w:sz w:val="19"/>
+        </w:rPr>
+        <w:t xml:space="preserve">• </w:t>
+      </w:r>
+      <w:r>
+        <w:rPr>
+          <w:rFonts w:ascii="Times New Roman" w:hAnsi="Times New Roman" w:cs="Times New Roman"/>
+          <w:b/>
+          <w:sz w:val="19"/>
+        </w:rPr>
+        <w:t xml:space="preserve">COULD HAVE (7 RFs — 17.9%): </w:t>
+      </w:r>
+      <w:r>
+        <w:rPr>
+          <w:rFonts w:ascii="Times New Roman" w:hAnsi="Times New Roman" w:cs="Times New Roman"/>
+          <w:sz w:val="19"/>
+        </w:rPr>
+        <w:t>RF-007, 018, 025, 029, 032, 033, 034, 037, 038 (Mapa interactivo, Bonos de cumpleaños, Chat, Recomendaciones).</w:t>
+      </w:r>
+    </w:p>
+    <w:p>
+      <w:pPr>
+        <w:spacing w:after="40" w:line="213" w:lineRule="auto"/>
+        <w:ind w:left="360" w:hanging="240"/>
+        <w:jc w:val="both"/>
+        <w:rPr>
+          <w:rFonts w:ascii="Times New Roman" w:hAnsi="Times New Roman" w:cs="Times New Roman"/>
+          <w:sz w:val="19"/>
+        </w:rPr>
+      </w:pPr>
+      <w:r>
+        <w:rPr>
+          <w:rFonts w:ascii="Times New Roman" w:hAnsi="Times New Roman" w:cs="Times New Roman"/>
+          <w:sz w:val="19"/>
+        </w:rPr>
+        <w:t xml:space="preserve">• </w:t>
+      </w:r>
+      <w:r>
+        <w:rPr>
+          <w:rFonts w:ascii="Times New Roman" w:hAnsi="Times New Roman" w:cs="Times New Roman"/>
+          <w:b/>
+          <w:sz w:val="19"/>
+        </w:rPr>
+        <w:t xml:space="preserve">WON'T HAVE (3 RFs — 7.7%): </w:t>
+      </w:r>
+      <w:r>
+        <w:rPr>
+          <w:rFonts w:ascii="Times New Roman" w:hAnsi="Times New Roman" w:cs="Times New Roman"/>
+          <w:sz w:val="19"/>
+        </w:rPr>
+        <w:t>RF-039 (Realidad Aumentada), Pasarela bancaria con dinero real, Rastreo telemático GPS de camiones.</w:t>
+      </w:r>
+    </w:p>
+    <w:p>
+      <w:pPr>
+        <w:spacing w:before="160" w:after="40" w:line="253" w:lineRule="auto"/>
+        <w:rPr>
+          <w:rFonts w:ascii="Times New Roman" w:hAnsi="Times New Roman" w:cs="Times New Roman"/>
+          <w:b/>
+        </w:rPr>
+      </w:pPr>
+      <w:r>
+        <w:rPr>
+          <w:rFonts w:ascii="Times New Roman" w:hAnsi="Times New Roman" w:cs="Times New Roman"/>
+          <w:b/>
+        </w:rPr>
+        <w:t>4.1 Defensa de los 'Must Have' ante el Comité de Inversión</w:t>
+      </w:r>
+    </w:p>
+    <w:p>
+      <w:pPr>
+        <w:spacing w:after="60" w:line="224" w:lineRule="auto"/>
+        <w:jc w:val="both"/>
+        <w:rPr>
+          <w:rFonts w:ascii="Times New Roman" w:hAnsi="Times New Roman" w:cs="Times New Roman"/>
+          <w:sz w:val="20"/>
+        </w:rPr>
+      </w:pPr>
+      <w:r>
+        <w:rPr>
+          <w:rFonts w:ascii="Times New Roman" w:hAnsi="Times New Roman" w:cs="Times New Roman"/>
+          <w:sz w:val="20"/>
+        </w:rPr>
+        <w:t>1. Sin inventario con código único por copia física (RF-001/002/005), la librería no tiene producto que comercializar y sufriría inventarios fantasma.</w:t>
+      </w:r>
+    </w:p>
+    <w:p>
+      <w:pPr>
+        <w:spacing w:after="60" w:line="224" w:lineRule="auto"/>
+        <w:jc w:val="both"/>
+        <w:rPr>
+          <w:rFonts w:ascii="Times New Roman" w:hAnsi="Times New Roman" w:cs="Times New Roman"/>
+          <w:sz w:val="20"/>
+        </w:rPr>
+      </w:pPr>
+      <w:r>
+        <w:rPr>
+          <w:rFonts w:ascii="Times New Roman" w:hAnsi="Times New Roman" w:cs="Times New Roman"/>
+          <w:sz w:val="20"/>
+        </w:rPr>
+        <w:t>2. Sin compras transaccionales atómicas (RF-008/012/013), el negocio no monetiza.</w:t>
+      </w:r>
+    </w:p>
+    <w:p>
+      <w:pPr>
+        <w:spacing w:after="60" w:line="224" w:lineRule="auto"/>
+        <w:jc w:val="both"/>
+        <w:rPr>
+          <w:rFonts w:ascii="Times New Roman" w:hAnsi="Times New Roman" w:cs="Times New Roman"/>
+          <w:sz w:val="20"/>
+        </w:rPr>
+      </w:pPr>
+      <w:r>
+        <w:rPr>
+          <w:rFonts w:ascii="Times New Roman" w:hAnsi="Times New Roman" w:cs="Times New Roman"/>
+          <w:sz w:val="20"/>
+        </w:rPr>
+        <w:t>3. La liberación automática de reservas a las 24h (RF-009/010) es indispensable: sin ella, los clientes apartarían libros indefinidamente, bloqueando las ventas de la empresa.</w:t>
+      </w:r>
+    </w:p>
+    <w:p>
+      <w:pPr>
+        <w:spacing w:after="60" w:line="224" w:lineRule="auto"/>
+        <w:jc w:val="both"/>
+        <w:rPr>
+          <w:rFonts w:ascii="Times New Roman" w:hAnsi="Times New Roman" w:cs="Times New Roman"/>
+          <w:sz w:val="20"/>
+        </w:rPr>
+      </w:pPr>
+      <w:r>
+        <w:rPr>
+          <w:rFonts w:ascii="Times New Roman" w:hAnsi="Times New Roman" w:cs="Times New Roman"/>
+          <w:sz w:val="20"/>
+        </w:rPr>
+        <w:t>4. La seguridad RBAC (RF-026/030/031) garantiza que los administradores no puedan comprarse libros a sí mismos ni manipular inventarios sin auditoría.</w:t>
+      </w:r>
+    </w:p>
+    <w:p>
+      <w:pPr>
+        <w:spacing w:before="240" w:after="60" w:line="299" w:lineRule="auto"/>
+        <w:rPr>
+          <w:rFonts w:ascii="Times New Roman" w:hAnsi="Times New Roman" w:cs="Times New Roman"/>
+          <w:b/>
+          <w:sz w:val="26"/>
+        </w:rPr>
+      </w:pPr>
+      <w:r>
+        <w:rPr>
+          <w:rFonts w:ascii="Times New Roman" w:hAnsi="Times New Roman" w:cs="Times New Roman"/>
+          <w:b/>
+          <w:sz w:val="26"/>
+        </w:rPr>
+        <w:t>5. Diseño Preliminar de la Solución</w:t>
+      </w:r>
+    </w:p>
+    <w:p>
+      <w:pPr>
+        <w:spacing w:before="160" w:after="40" w:line="253" w:lineRule="auto"/>
+        <w:rPr>
+          <w:rFonts w:ascii="Times New Roman" w:hAnsi="Times New Roman" w:cs="Times New Roman"/>
+          <w:b/>
+        </w:rPr>
+      </w:pPr>
+      <w:r>
+        <w:rPr>
+          <w:rFonts w:ascii="Times New Roman" w:hAnsi="Times New Roman" w:cs="Times New Roman"/>
+          <w:b/>
+        </w:rPr>
+        <w:t>5.1 Arquitectura C4 (Nivel 1 Contexto y Nivel 2 Contenedores)</w:t>
+      </w:r>
+    </w:p>
+    <w:p>
+      <w:pPr>
+        <w:spacing w:after="60" w:line="224" w:lineRule="auto"/>
+        <w:jc w:val="both"/>
+        <w:rPr>
+          <w:rFonts w:ascii="Times New Roman" w:hAnsi="Times New Roman" w:cs="Times New Roman"/>
+          <w:sz w:val="20"/>
+        </w:rPr>
+      </w:pPr>
+      <w:r>
+        <w:rPr>
+          <w:rFonts w:ascii="Times New Roman" w:hAnsi="Times New Roman" w:cs="Times New Roman"/>
+          <w:sz w:val="20"/>
+        </w:rPr>
+        <w:t>A continuación se presentan los diagramas de arquitectura C4 de la solución, optimizados con tipografía de alto contraste y estándar oficial C4 para garantizar máxima legibilidad:</w:t>
+      </w:r>
+    </w:p>
+    <w:p>
+      <w:pPr>
+        <w:spacing w:after="60" w:line="224" w:lineRule="auto"/>
         <w:jc w:val="center"/>
         <w:rPr>
           <w:rFonts w:ascii="Times New Roman" w:hAnsi="Times New Roman" w:cs="Times New Roman"/>
-          <w:sz w:val="17"/>
+          <w:sz w:val="20"/>
         </w:rPr>
       </w:pPr>
       <w:r>
         <w:rPr>
           <w:rFonts w:ascii="Times New Roman" w:hAnsi="Times New Roman" w:cs="Times New Roman"/>
           <w:noProof/>
-          <w:sz w:val="17"/>
+          <w:sz w:val="20"/>
         </w:rPr>
         <w:drawing>
-          <wp:inline distT="0" distB="0" distL="0" distR="0" wp14:anchorId="6C25780E" wp14:editId="2984FE4D">
-            <wp:extent cx="4699000" cy="6081196"/>
+          <wp:inline distT="0" distB="0" distL="0" distR="0" wp14:anchorId="78668C31" wp14:editId="02C8CEAA">
+            <wp:extent cx="4318000" cy="7242550"/>
             <wp:effectExtent l="0" t="0" r="6350" b="0"/>
             <wp:docPr id="2" name="Imagen 2"/>
             <wp:cNvGraphicFramePr/>
@@ -2794,7 +3356,7 @@
                   <pic:spPr>
                     <a:xfrm>
                       <a:off x="0" y="0"/>
-                      <a:ext cx="4699000" cy="6081196"/>
+                      <a:ext cx="4318000" cy="7242550"/>
                     </a:xfrm>
                     <a:prstGeom prst="rect">
                       <a:avLst/>
@@ -2809,8 +3371,7 @@
     </w:p>
     <w:p>
       <w:pPr>
-        <w:spacing w:before="40" w:after="140" w:line="213" w:lineRule="auto"/>
-        <w:ind w:left="360" w:hanging="240"/>
+        <w:spacing w:before="40" w:after="140" w:line="224" w:lineRule="auto"/>
         <w:jc w:val="center"/>
         <w:rPr>
           <w:rFonts w:ascii="Times New Roman" w:hAnsi="Times New Roman" w:cs="Times New Roman"/>
@@ -2826,699 +3387,27 @@
           <w:i/>
           <w:sz w:val="17"/>
         </w:rPr>
-        <w:t>Figura 3.2: Diagrama General de Casos de Uso — Módulos de Root, Tareas Programadas y Logística (Parte 2)</w:t>
-      </w:r>
-    </w:p>
-    <w:p>
-      <w:pPr>
-        <w:spacing w:before="140" w:after="40" w:line="253" w:lineRule="auto"/>
-        <w:rPr>
-          <w:rFonts w:ascii="Times New Roman" w:hAnsi="Times New Roman" w:cs="Times New Roman"/>
-          <w:b/>
-        </w:rPr>
-      </w:pPr>
-      <w:r>
-        <w:rPr>
-          <w:rFonts w:ascii="Times New Roman" w:hAnsi="Times New Roman" w:cs="Times New Roman"/>
-          <w:b/>
-        </w:rPr>
-        <w:t>3.2 CU-01: Comprar Libro (Checkout Transaccional)</w:t>
-      </w:r>
-    </w:p>
-    <w:p>
-      <w:pPr>
-        <w:spacing w:after="60" w:line="224" w:lineRule="auto"/>
-        <w:jc w:val="both"/>
-        <w:rPr>
-          <w:rFonts w:ascii="Times New Roman" w:hAnsi="Times New Roman" w:cs="Times New Roman"/>
-          <w:sz w:val="20"/>
-        </w:rPr>
-      </w:pPr>
-      <w:r>
-        <w:rPr>
-          <w:rFonts w:ascii="Times New Roman" w:hAnsi="Times New Roman" w:cs="Times New Roman"/>
-          <w:sz w:val="20"/>
-        </w:rPr>
-        <w:t>• Resumen: Compra integral de libros agregados al carrito con deducción en tiempo real y pago seguro tokenizado.</w:t>
-      </w:r>
-    </w:p>
-    <w:p>
-      <w:pPr>
-        <w:spacing w:after="60" w:line="224" w:lineRule="auto"/>
-        <w:jc w:val="both"/>
-        <w:rPr>
-          <w:rFonts w:ascii="Times New Roman" w:hAnsi="Times New Roman" w:cs="Times New Roman"/>
-          <w:sz w:val="20"/>
-        </w:rPr>
-      </w:pPr>
-      <w:r>
-        <w:rPr>
-          <w:rFonts w:ascii="Times New Roman" w:hAnsi="Times New Roman" w:cs="Times New Roman"/>
-          <w:sz w:val="20"/>
-        </w:rPr>
-        <w:t>• Usuario: El cliente valida carrito, selecciona entrega (domicilio o tienda) y confirma pago con saldo o tarjeta. Flujo alterno: Si la pasarela rechaza la tarjeta o el saldo es insuficiente, se aplica rollback atómico.</w:t>
-      </w:r>
-    </w:p>
-    <w:p>
-      <w:pPr>
-        <w:spacing w:after="60" w:line="224" w:lineRule="auto"/>
-        <w:jc w:val="both"/>
-        <w:rPr>
-          <w:rFonts w:ascii="Times New Roman" w:hAnsi="Times New Roman" w:cs="Times New Roman"/>
-          <w:sz w:val="20"/>
-        </w:rPr>
-      </w:pPr>
-      <w:r>
-        <w:rPr>
-          <w:rFonts w:ascii="Times New Roman" w:hAnsi="Times New Roman" w:cs="Times New Roman"/>
-          <w:sz w:val="20"/>
-        </w:rPr>
-        <w:t>• Subfunción SF-01: Bloqueo de fila (SELECT FOR UPDATE) sobre EJEMPLAR, cambio a estado 'VENDIDO' y confirmación de transacción.</w:t>
-      </w:r>
-    </w:p>
-    <w:p>
-      <w:pPr>
-        <w:spacing w:before="140" w:after="40" w:line="253" w:lineRule="auto"/>
-        <w:rPr>
-          <w:rFonts w:ascii="Times New Roman" w:hAnsi="Times New Roman" w:cs="Times New Roman"/>
-          <w:b/>
-        </w:rPr>
-      </w:pPr>
-      <w:r>
-        <w:rPr>
-          <w:rFonts w:ascii="Times New Roman" w:hAnsi="Times New Roman" w:cs="Times New Roman"/>
-          <w:b/>
-        </w:rPr>
-        <w:t>3.3 CU-02: Reservar Libro y Liberación Automática a las 24 Horas</w:t>
-      </w:r>
-    </w:p>
-    <w:p>
-      <w:pPr>
-        <w:spacing w:after="60" w:line="224" w:lineRule="auto"/>
-        <w:jc w:val="both"/>
-        <w:rPr>
-          <w:rFonts w:ascii="Times New Roman" w:hAnsi="Times New Roman" w:cs="Times New Roman"/>
-          <w:sz w:val="20"/>
-        </w:rPr>
-      </w:pPr>
-      <w:r>
-        <w:rPr>
-          <w:rFonts w:ascii="Times New Roman" w:hAnsi="Times New Roman" w:cs="Times New Roman"/>
-          <w:sz w:val="20"/>
-        </w:rPr>
-        <w:t>• Resumen: Bloqueo temporal de copias físicas por máximo 24h, liberando el stock si no se compra.</w:t>
-      </w:r>
-    </w:p>
-    <w:p>
-      <w:pPr>
-        <w:spacing w:after="60" w:line="224" w:lineRule="auto"/>
-        <w:jc w:val="both"/>
-        <w:rPr>
-          <w:rFonts w:ascii="Times New Roman" w:hAnsi="Times New Roman" w:cs="Times New Roman"/>
-          <w:sz w:val="20"/>
-        </w:rPr>
-      </w:pPr>
-      <w:r>
-        <w:rPr>
-          <w:rFonts w:ascii="Times New Roman" w:hAnsi="Times New Roman" w:cs="Times New Roman"/>
-          <w:sz w:val="20"/>
-        </w:rPr>
-        <w:t>• Usuario: Cliente aparta libro (máx. 5 títulos / 3 ejemplares). Flujo de Excepción: El Scheduler (APScheduler) revisa cada 15 min reservas vencidas, expira el registro y regresa el ejemplar a 'DISPONIBLE'.</w:t>
-      </w:r>
-    </w:p>
-    <w:p>
-      <w:pPr>
-        <w:spacing w:after="60" w:line="224" w:lineRule="auto"/>
-        <w:jc w:val="both"/>
-        <w:rPr>
-          <w:rFonts w:ascii="Times New Roman" w:hAnsi="Times New Roman" w:cs="Times New Roman"/>
-          <w:sz w:val="20"/>
-        </w:rPr>
-      </w:pPr>
-      <w:r>
-        <w:rPr>
-          <w:rFonts w:ascii="Times New Roman" w:hAnsi="Times New Roman" w:cs="Times New Roman"/>
-          <w:sz w:val="20"/>
-        </w:rPr>
-        <w:t>• Subfunción SF-02: Actualización masiva en lote de ejemplares expirados y recálculo de stock.</w:t>
-      </w:r>
-    </w:p>
-    <w:p>
-      <w:pPr>
-        <w:spacing w:before="140" w:after="40" w:line="253" w:lineRule="auto"/>
-        <w:rPr>
-          <w:rFonts w:ascii="Times New Roman" w:hAnsi="Times New Roman" w:cs="Times New Roman"/>
-          <w:b/>
-        </w:rPr>
-      </w:pPr>
-      <w:r>
-        <w:rPr>
-          <w:rFonts w:ascii="Times New Roman" w:hAnsi="Times New Roman" w:cs="Times New Roman"/>
-          <w:b/>
-        </w:rPr>
-        <w:t>3.4 CU-03: Recogida en Tienda Física con Geolocalización (Google Maps)</w:t>
-      </w:r>
-    </w:p>
-    <w:p>
-      <w:pPr>
-        <w:spacing w:after="60" w:line="224" w:lineRule="auto"/>
-        <w:jc w:val="both"/>
-        <w:rPr>
-          <w:rFonts w:ascii="Times New Roman" w:hAnsi="Times New Roman" w:cs="Times New Roman"/>
-          <w:sz w:val="20"/>
-        </w:rPr>
-      </w:pPr>
-      <w:r>
-        <w:rPr>
-          <w:rFonts w:ascii="Times New Roman" w:hAnsi="Times New Roman" w:cs="Times New Roman"/>
-          <w:sz w:val="20"/>
-        </w:rPr>
-        <w:t>• Resumen: Retiro en sucursal física con ubicación en mapa y cálculo de tienda más cercana con inventario.</w:t>
-      </w:r>
-    </w:p>
-    <w:p>
-      <w:pPr>
-        <w:spacing w:after="60" w:line="224" w:lineRule="auto"/>
-        <w:jc w:val="both"/>
-        <w:rPr>
-          <w:rFonts w:ascii="Times New Roman" w:hAnsi="Times New Roman" w:cs="Times New Roman"/>
-          <w:sz w:val="20"/>
-        </w:rPr>
-      </w:pPr>
-      <w:r>
-        <w:rPr>
-          <w:rFonts w:ascii="Times New Roman" w:hAnsi="Times New Roman" w:cs="Times New Roman"/>
-          <w:sz w:val="20"/>
-        </w:rPr>
-        <w:t>• Usuario: Cliente selecciona 'Recogida', visualiza mapa interactivo de Google Maps y elige tienda con stock. Excepción: Si la tienda carece de existencias completas, el sistema sugiere la sucursal más cercana con stock.</w:t>
-      </w:r>
-    </w:p>
-    <w:p>
-      <w:pPr>
-        <w:spacing w:after="60" w:line="224" w:lineRule="auto"/>
-        <w:jc w:val="both"/>
-        <w:rPr>
-          <w:rFonts w:ascii="Times New Roman" w:hAnsi="Times New Roman" w:cs="Times New Roman"/>
-          <w:sz w:val="20"/>
-        </w:rPr>
-      </w:pPr>
-      <w:r>
-        <w:rPr>
-          <w:rFonts w:ascii="Times New Roman" w:hAnsi="Times New Roman" w:cs="Times New Roman"/>
-          <w:sz w:val="20"/>
-        </w:rPr>
-        <w:t>• Subfunción SF-03: Cálculo geoespacial de distancia a tiendas con inventario positivo.</w:t>
-      </w:r>
-    </w:p>
-    <w:p>
-      <w:pPr>
-        <w:spacing w:before="140" w:after="40" w:line="253" w:lineRule="auto"/>
-        <w:rPr>
-          <w:rFonts w:ascii="Times New Roman" w:hAnsi="Times New Roman" w:cs="Times New Roman"/>
-          <w:b/>
-        </w:rPr>
-      </w:pPr>
-      <w:r>
-        <w:rPr>
-          <w:rFonts w:ascii="Times New Roman" w:hAnsi="Times New Roman" w:cs="Times New Roman"/>
-          <w:b/>
-        </w:rPr>
-        <w:t>3.5 CU-04: Solicitud de Devolución con Código QR y Límite de 8 Días</w:t>
-      </w:r>
-    </w:p>
-    <w:p>
-      <w:pPr>
-        <w:spacing w:after="60" w:line="224" w:lineRule="auto"/>
-        <w:jc w:val="both"/>
-        <w:rPr>
-          <w:rFonts w:ascii="Times New Roman" w:hAnsi="Times New Roman" w:cs="Times New Roman"/>
-          <w:sz w:val="20"/>
-        </w:rPr>
-      </w:pPr>
-      <w:r>
-        <w:rPr>
-          <w:rFonts w:ascii="Times New Roman" w:hAnsi="Times New Roman" w:cs="Times New Roman"/>
-          <w:sz w:val="20"/>
-        </w:rPr>
-        <w:t>• Resumen: Tramitación de garantía para pedidos entregados con salvoconducto digital en código QR.</w:t>
-      </w:r>
-    </w:p>
-    <w:p>
-      <w:pPr>
-        <w:spacing w:after="60" w:line="224" w:lineRule="auto"/>
-        <w:jc w:val="both"/>
-        <w:rPr>
-          <w:rFonts w:ascii="Times New Roman" w:hAnsi="Times New Roman" w:cs="Times New Roman"/>
-          <w:sz w:val="20"/>
-        </w:rPr>
-      </w:pPr>
-      <w:r>
-        <w:rPr>
-          <w:rFonts w:ascii="Times New Roman" w:hAnsi="Times New Roman" w:cs="Times New Roman"/>
-          <w:sz w:val="20"/>
-        </w:rPr>
-        <w:t>• Usuario: Cliente selecciona pedido entregado, diligencia causas y recibe QR por email. Excepción: Si fecha_actual - fecha_entrega &gt; 8 días, el sistema rechaza la solicitud automáticamente.</w:t>
-      </w:r>
-    </w:p>
-    <w:p>
-      <w:pPr>
-        <w:spacing w:after="60" w:line="224" w:lineRule="auto"/>
-        <w:jc w:val="both"/>
-        <w:rPr>
-          <w:rFonts w:ascii="Times New Roman" w:hAnsi="Times New Roman" w:cs="Times New Roman"/>
-          <w:sz w:val="20"/>
-        </w:rPr>
-      </w:pPr>
-      <w:r>
-        <w:rPr>
-          <w:rFonts w:ascii="Times New Roman" w:hAnsi="Times New Roman" w:cs="Times New Roman"/>
-          <w:sz w:val="20"/>
-        </w:rPr>
-        <w:t>• Subfunción SF-04: Generación y firma criptográfica del token QR (HMAC-SHA256) codificado en imagen PNG.</w:t>
-      </w:r>
-    </w:p>
-    <w:p>
-      <w:pPr>
-        <w:spacing w:before="220" w:after="60" w:line="299" w:lineRule="auto"/>
-        <w:rPr>
-          <w:rFonts w:ascii="Times New Roman" w:hAnsi="Times New Roman" w:cs="Times New Roman"/>
-          <w:b/>
-          <w:sz w:val="26"/>
-        </w:rPr>
-      </w:pPr>
-      <w:r>
-        <w:rPr>
-          <w:rFonts w:ascii="Times New Roman" w:hAnsi="Times New Roman" w:cs="Times New Roman"/>
-          <w:b/>
-          <w:sz w:val="26"/>
-        </w:rPr>
-        <w:t>4. Priorización MoSCoW y Defensa de los Must Have</w:t>
-      </w:r>
-    </w:p>
-    <w:p>
-      <w:pPr>
-        <w:spacing w:after="60" w:line="224" w:lineRule="auto"/>
-        <w:jc w:val="both"/>
-        <w:rPr>
-          <w:rFonts w:ascii="Times New Roman" w:hAnsi="Times New Roman" w:cs="Times New Roman"/>
-          <w:sz w:val="20"/>
-        </w:rPr>
-      </w:pPr>
-      <w:r>
-        <w:rPr>
-          <w:rFonts w:ascii="Times New Roman" w:hAnsi="Times New Roman" w:cs="Times New Roman"/>
-          <w:sz w:val="20"/>
-        </w:rPr>
-        <w:t>La clasificación del backlog protege al equipo ante restricciones temporales:</w:t>
-      </w:r>
-    </w:p>
-    <w:p>
-      <w:pPr>
-        <w:spacing w:after="40" w:line="213" w:lineRule="auto"/>
-        <w:ind w:left="360" w:hanging="240"/>
-        <w:jc w:val="both"/>
-        <w:rPr>
-          <w:rFonts w:ascii="Times New Roman" w:hAnsi="Times New Roman" w:cs="Times New Roman"/>
-          <w:sz w:val="19"/>
-        </w:rPr>
-      </w:pPr>
-      <w:r>
-        <w:rPr>
-          <w:rFonts w:ascii="Times New Roman" w:hAnsi="Times New Roman" w:cs="Times New Roman"/>
-          <w:sz w:val="19"/>
-        </w:rPr>
-        <w:t xml:space="preserve">• </w:t>
-      </w:r>
-      <w:r>
-        <w:rPr>
-          <w:rFonts w:ascii="Times New Roman" w:hAnsi="Times New Roman" w:cs="Times New Roman"/>
-          <w:b/>
-          <w:sz w:val="19"/>
-        </w:rPr>
-        <w:t xml:space="preserve">MUST HAVE (17 RFs — 43.6%): </w:t>
-      </w:r>
-      <w:r>
-        <w:rPr>
-          <w:rFonts w:ascii="Times New Roman" w:hAnsi="Times New Roman" w:cs="Times New Roman"/>
-          <w:sz w:val="19"/>
-        </w:rPr>
-        <w:t>RF-001, 002, 003, 004, 005 (Inventario granular), RF-008, 009, 010, 011, 012, 013, 014 (Compras y reservas de 24h), RF-026, 027, 028, 030, 031 (Seguridad RBAC). Sin ellos no existe producto.</w:t>
-      </w:r>
-    </w:p>
-    <w:p>
-      <w:pPr>
-        <w:spacing w:after="40" w:line="213" w:lineRule="auto"/>
-        <w:ind w:left="360" w:hanging="240"/>
-        <w:jc w:val="both"/>
-        <w:rPr>
-          <w:rFonts w:ascii="Times New Roman" w:hAnsi="Times New Roman" w:cs="Times New Roman"/>
-          <w:sz w:val="19"/>
-        </w:rPr>
-      </w:pPr>
-      <w:r>
-        <w:rPr>
-          <w:rFonts w:ascii="Times New Roman" w:hAnsi="Times New Roman" w:cs="Times New Roman"/>
-          <w:sz w:val="19"/>
-        </w:rPr>
-        <w:t xml:space="preserve">• </w:t>
-      </w:r>
-      <w:r>
-        <w:rPr>
-          <w:rFonts w:ascii="Times New Roman" w:hAnsi="Times New Roman" w:cs="Times New Roman"/>
-          <w:b/>
-          <w:sz w:val="19"/>
-        </w:rPr>
-        <w:t xml:space="preserve">SHOULD HAVE (12 RFs — 30.8%): </w:t>
-      </w:r>
-      <w:r>
-        <w:rPr>
-          <w:rFonts w:ascii="Times New Roman" w:hAnsi="Times New Roman" w:cs="Times New Roman"/>
-          <w:sz w:val="19"/>
-        </w:rPr>
-        <w:t>RF-006, 015, 016, 017, 019, 020, 021, 022, 023, 024, 035, 036 (Historial, Devoluciones QR, Tiendas físicas).</w:t>
-      </w:r>
-    </w:p>
-    <w:p>
-      <w:pPr>
-        <w:spacing w:after="40" w:line="213" w:lineRule="auto"/>
-        <w:ind w:left="360" w:hanging="240"/>
-        <w:jc w:val="both"/>
-        <w:rPr>
-          <w:rFonts w:ascii="Times New Roman" w:hAnsi="Times New Roman" w:cs="Times New Roman"/>
-          <w:sz w:val="19"/>
-        </w:rPr>
-      </w:pPr>
-      <w:r>
-        <w:rPr>
-          <w:rFonts w:ascii="Times New Roman" w:hAnsi="Times New Roman" w:cs="Times New Roman"/>
-          <w:sz w:val="19"/>
-        </w:rPr>
-        <w:t xml:space="preserve">• </w:t>
-      </w:r>
-      <w:r>
-        <w:rPr>
-          <w:rFonts w:ascii="Times New Roman" w:hAnsi="Times New Roman" w:cs="Times New Roman"/>
-          <w:b/>
-          <w:sz w:val="19"/>
-        </w:rPr>
-        <w:t xml:space="preserve">COULD HAVE (7 RFs — 17.9%): </w:t>
-      </w:r>
-      <w:r>
-        <w:rPr>
-          <w:rFonts w:ascii="Times New Roman" w:hAnsi="Times New Roman" w:cs="Times New Roman"/>
-          <w:sz w:val="19"/>
-        </w:rPr>
-        <w:t>RF-007, 018, 025, 029, 032, 033, 034, 037, 038 (Mapa interactivo, Bonos de cumpleaños, Chat, Recomendaciones).</w:t>
-      </w:r>
-    </w:p>
-    <w:p>
-      <w:pPr>
-        <w:spacing w:after="40" w:line="213" w:lineRule="auto"/>
-        <w:ind w:left="360" w:hanging="240"/>
-        <w:jc w:val="both"/>
-        <w:rPr>
-          <w:rFonts w:ascii="Times New Roman" w:hAnsi="Times New Roman" w:cs="Times New Roman"/>
-          <w:sz w:val="19"/>
-        </w:rPr>
-      </w:pPr>
-      <w:r>
-        <w:rPr>
-          <w:rFonts w:ascii="Times New Roman" w:hAnsi="Times New Roman" w:cs="Times New Roman"/>
-          <w:sz w:val="19"/>
-        </w:rPr>
-        <w:t xml:space="preserve">• </w:t>
-      </w:r>
-      <w:r>
-        <w:rPr>
-          <w:rFonts w:ascii="Times New Roman" w:hAnsi="Times New Roman" w:cs="Times New Roman"/>
-          <w:b/>
-          <w:sz w:val="19"/>
-        </w:rPr>
-        <w:t xml:space="preserve">WON'T HAVE (3 RFs — 7.7%): </w:t>
-      </w:r>
-      <w:r>
-        <w:rPr>
-          <w:rFonts w:ascii="Times New Roman" w:hAnsi="Times New Roman" w:cs="Times New Roman"/>
-          <w:sz w:val="19"/>
-        </w:rPr>
-        <w:t>RF-039 (Realidad Aumentada), Pasarela bancaria con dinero real, Rastreo telemático GPS de camiones.</w:t>
-      </w:r>
-    </w:p>
-    <w:p>
-      <w:pPr>
-        <w:spacing w:before="140" w:after="40" w:line="253" w:lineRule="auto"/>
-        <w:rPr>
-          <w:rFonts w:ascii="Times New Roman" w:hAnsi="Times New Roman" w:cs="Times New Roman"/>
-          <w:b/>
-        </w:rPr>
-      </w:pPr>
-      <w:r>
-        <w:rPr>
-          <w:rFonts w:ascii="Times New Roman" w:hAnsi="Times New Roman" w:cs="Times New Roman"/>
-          <w:b/>
-        </w:rPr>
-        <w:t>4.1 Defensa de los 'Must Have' ante el Comité de Inversión</w:t>
-      </w:r>
-    </w:p>
-    <w:p>
-      <w:pPr>
-        <w:spacing w:after="60" w:line="224" w:lineRule="auto"/>
-        <w:jc w:val="both"/>
-        <w:rPr>
-          <w:rFonts w:ascii="Times New Roman" w:hAnsi="Times New Roman" w:cs="Times New Roman"/>
-          <w:sz w:val="20"/>
-        </w:rPr>
-      </w:pPr>
-      <w:r>
-        <w:rPr>
-          <w:rFonts w:ascii="Times New Roman" w:hAnsi="Times New Roman" w:cs="Times New Roman"/>
-          <w:sz w:val="20"/>
-        </w:rPr>
-        <w:t>1. Sin inventario con código único por copia física (RF-001/002/005), la librería no tiene producto que comercializar y sufriría inventarios fantasma.</w:t>
-      </w:r>
-    </w:p>
-    <w:p>
-      <w:pPr>
-        <w:spacing w:after="60" w:line="224" w:lineRule="auto"/>
-        <w:jc w:val="both"/>
-        <w:rPr>
-          <w:rFonts w:ascii="Times New Roman" w:hAnsi="Times New Roman" w:cs="Times New Roman"/>
-          <w:sz w:val="20"/>
-        </w:rPr>
-      </w:pPr>
-      <w:r>
-        <w:rPr>
-          <w:rFonts w:ascii="Times New Roman" w:hAnsi="Times New Roman" w:cs="Times New Roman"/>
-          <w:sz w:val="20"/>
-        </w:rPr>
-        <w:t>2. Sin compras transaccionales atómicas (RF-008/012/013), el negocio no monetiza.</w:t>
-      </w:r>
-    </w:p>
-    <w:p>
-      <w:pPr>
-        <w:spacing w:after="60" w:line="224" w:lineRule="auto"/>
-        <w:jc w:val="both"/>
-        <w:rPr>
-          <w:rFonts w:ascii="Times New Roman" w:hAnsi="Times New Roman" w:cs="Times New Roman"/>
-          <w:sz w:val="20"/>
-        </w:rPr>
-      </w:pPr>
-      <w:r>
-        <w:rPr>
-          <w:rFonts w:ascii="Times New Roman" w:hAnsi="Times New Roman" w:cs="Times New Roman"/>
-          <w:sz w:val="20"/>
-        </w:rPr>
-        <w:t>3. La liberación automática de reservas a las 24h (RF-009/010) es indispensable: sin ella, los clientes apartarían libros indefinidamente, bloqueando las ventas de la empresa.</w:t>
-      </w:r>
-    </w:p>
-    <w:p>
-      <w:pPr>
-        <w:spacing w:after="60" w:line="224" w:lineRule="auto"/>
-        <w:jc w:val="both"/>
-        <w:rPr>
-          <w:rFonts w:ascii="Times New Roman" w:hAnsi="Times New Roman" w:cs="Times New Roman"/>
-          <w:sz w:val="20"/>
-        </w:rPr>
-      </w:pPr>
-      <w:r>
-        <w:rPr>
-          <w:rFonts w:ascii="Times New Roman" w:hAnsi="Times New Roman" w:cs="Times New Roman"/>
-          <w:sz w:val="20"/>
-        </w:rPr>
-        <w:t>4. La seguridad RBAC (RF-026/030/031) garantiza que los administradores no puedan comprarse libros a sí mismos ni manipular inventarios sin auditoría.</w:t>
-      </w:r>
-    </w:p>
-    <w:p>
-      <w:pPr>
-        <w:spacing w:before="220" w:after="60" w:line="299" w:lineRule="auto"/>
-        <w:rPr>
-          <w:rFonts w:ascii="Times New Roman" w:hAnsi="Times New Roman" w:cs="Times New Roman"/>
-          <w:b/>
-          <w:sz w:val="26"/>
-        </w:rPr>
-      </w:pPr>
-      <w:r>
-        <w:rPr>
-          <w:rFonts w:ascii="Times New Roman" w:hAnsi="Times New Roman" w:cs="Times New Roman"/>
-          <w:b/>
-          <w:sz w:val="26"/>
-        </w:rPr>
-        <w:t>5. Diseño Preliminar de la Solución</w:t>
-      </w:r>
-    </w:p>
-    <w:p>
-      <w:pPr>
-        <w:spacing w:before="140" w:after="40" w:line="253" w:lineRule="auto"/>
-        <w:rPr>
-          <w:rFonts w:ascii="Times New Roman" w:hAnsi="Times New Roman" w:cs="Times New Roman"/>
-          <w:b/>
-        </w:rPr>
-      </w:pPr>
-      <w:r>
-        <w:rPr>
-          <w:rFonts w:ascii="Times New Roman" w:hAnsi="Times New Roman" w:cs="Times New Roman"/>
-          <w:b/>
-        </w:rPr>
-        <w:t>5.1 Arquitectura C4 y Modelo de Datos</w:t>
-      </w:r>
-    </w:p>
-    <w:p>
-      <w:pPr>
-        <w:spacing w:after="60" w:line="224" w:lineRule="auto"/>
-        <w:jc w:val="both"/>
-        <w:rPr>
-          <w:rFonts w:ascii="Times New Roman" w:hAnsi="Times New Roman" w:cs="Times New Roman"/>
-          <w:sz w:val="20"/>
-        </w:rPr>
-      </w:pPr>
-      <w:r>
-        <w:rPr>
-          <w:rFonts w:ascii="Times New Roman" w:hAnsi="Times New Roman" w:cs="Times New Roman"/>
-          <w:sz w:val="20"/>
-        </w:rPr>
-        <w:t>Se estructuró la solución en C4 Nivel 1 (Contexto de Sistema con usuarios y servicios externos: Google Maps Platform, Pasarela de Pagos Tokenizada y Servidor SMTP de Notificaciones) y C4 Nivel 2 (Contenedores: Frontend SPA React con Vite y TypeScript, Backend REST FastAPI en Python, Base de Datos relacional PostgreSQL con 34 tablas normalizadas y Worker en segundo plano APScheduler para liberación periódica de stock).</w:t>
-      </w:r>
-    </w:p>
-    <w:p>
-      <w:pPr>
-        <w:spacing w:before="140" w:after="40" w:line="253" w:lineRule="auto"/>
-        <w:rPr>
-          <w:rFonts w:ascii="Times New Roman" w:hAnsi="Times New Roman" w:cs="Times New Roman"/>
-          <w:b/>
-        </w:rPr>
-      </w:pPr>
-      <w:r>
-        <w:rPr>
-          <w:rFonts w:ascii="Times New Roman" w:hAnsi="Times New Roman" w:cs="Times New Roman"/>
-          <w:b/>
-        </w:rPr>
-        <w:t>5.2 Modelo de Datos Relacional (34 Entidades)</w:t>
-      </w:r>
-    </w:p>
-    <w:p>
-      <w:pPr>
-        <w:spacing w:after="60" w:line="224" w:lineRule="auto"/>
-        <w:jc w:val="both"/>
-        <w:rPr>
-          <w:rFonts w:ascii="Times New Roman" w:hAnsi="Times New Roman" w:cs="Times New Roman"/>
-          <w:sz w:val="20"/>
-        </w:rPr>
-      </w:pPr>
-      <w:r>
-        <w:rPr>
-          <w:rFonts w:ascii="Times New Roman" w:hAnsi="Times New Roman" w:cs="Times New Roman"/>
-          <w:sz w:val="20"/>
-        </w:rPr>
-        <w:t>El modelo relacional segrega estrictamente el concepto bibliográfico genérico (LIBRO) del objeto físico comercializable (EJEMPLAR), permitiendo que cada copia posea su propio código de barras, sucursal física y estado (DISPONIBLE, RESERVADO, VENDIDO, EN_DEVOLUCION, DADO_DE_BAJA). Las tablas transaccionales RESERVA y DETALLE_VENTA aseguran integridad referencial y atomicidad mediante claves foráneas y restricciones de unicidad.</w:t>
-      </w:r>
-    </w:p>
-    <w:p>
-      <w:pPr>
-        <w:spacing w:before="140" w:after="40" w:line="253" w:lineRule="auto"/>
-        <w:rPr>
-          <w:rFonts w:ascii="Times New Roman" w:hAnsi="Times New Roman" w:cs="Times New Roman"/>
-          <w:b/>
-        </w:rPr>
-      </w:pPr>
-      <w:r>
-        <w:rPr>
-          <w:rFonts w:ascii="Times New Roman" w:hAnsi="Times New Roman" w:cs="Times New Roman"/>
-          <w:b/>
-        </w:rPr>
-        <w:t>5.3 Mockups y Wireframes de Pantallas / Flujos Críticos</w:t>
-      </w:r>
-    </w:p>
-    <w:p>
-      <w:pPr>
-        <w:spacing w:after="60" w:line="224" w:lineRule="auto"/>
-        <w:jc w:val="both"/>
-        <w:rPr>
-          <w:rFonts w:ascii="Times New Roman" w:hAnsi="Times New Roman" w:cs="Times New Roman"/>
-          <w:sz w:val="20"/>
-        </w:rPr>
-      </w:pPr>
-      <w:r>
-        <w:rPr>
-          <w:rFonts w:ascii="Times New Roman" w:hAnsi="Times New Roman" w:cs="Times New Roman"/>
-          <w:sz w:val="20"/>
-        </w:rPr>
-        <w:t>A continuación se integran los mockups de diseño preliminar correspondientes a las pantallas y flujos más críticos del sistema, validados contra las Historias de Usuario del proyecto:</w:t>
-      </w:r>
-    </w:p>
-    <w:p>
-      <w:pPr>
-        <w:spacing w:after="60" w:line="224" w:lineRule="auto"/>
-        <w:jc w:val="both"/>
-        <w:rPr>
-          <w:rFonts w:ascii="Times New Roman" w:hAnsi="Times New Roman" w:cs="Times New Roman"/>
-          <w:b/>
-          <w:sz w:val="20"/>
-        </w:rPr>
-      </w:pPr>
-      <w:r>
-        <w:rPr>
-          <w:rFonts w:ascii="Times New Roman" w:hAnsi="Times New Roman" w:cs="Times New Roman"/>
-          <w:b/>
-          <w:sz w:val="20"/>
-        </w:rPr>
-        <w:t>A. Búsqueda de Catálogo y Reserva de Ejemplares (CU-02 / RF-008, RF-009, RF-011, RF-035):</w:t>
-      </w:r>
-    </w:p>
-    <w:p>
-      <w:pPr>
-        <w:spacing w:after="60" w:line="224" w:lineRule="auto"/>
-        <w:jc w:val="both"/>
-        <w:rPr>
-          <w:rFonts w:ascii="Times New Roman" w:hAnsi="Times New Roman" w:cs="Times New Roman"/>
-          <w:sz w:val="20"/>
-        </w:rPr>
-      </w:pPr>
-      <w:r>
-        <w:rPr>
-          <w:rFonts w:ascii="Times New Roman" w:hAnsi="Times New Roman" w:cs="Times New Roman"/>
-          <w:sz w:val="20"/>
-        </w:rPr>
-        <w:t>Permite consultar la ficha completa del libro, autores, categorías y verificar la disponibilidad de copias en tiempo real por sucursal. El botón 'Reservar' bloquea el ejemplar por máximo 24 horas:</w:t>
-      </w:r>
-    </w:p>
-    <w:p>
-      <w:pPr>
-        <w:spacing w:after="60" w:line="224" w:lineRule="auto"/>
+        <w:t>Figura 5.1: Arquitectura C4 Nivel 1 — Diagrama de Contexto del Sistema</w:t>
+      </w:r>
+    </w:p>
+    <w:p>
+      <w:pPr>
+        <w:spacing w:before="40" w:after="140" w:line="224" w:lineRule="auto"/>
         <w:jc w:val="center"/>
         <w:rPr>
           <w:rFonts w:ascii="Times New Roman" w:hAnsi="Times New Roman" w:cs="Times New Roman"/>
-          <w:sz w:val="20"/>
+          <w:sz w:val="17"/>
         </w:rPr>
       </w:pPr>
       <w:r>
         <w:rPr>
           <w:rFonts w:ascii="Times New Roman" w:hAnsi="Times New Roman" w:cs="Times New Roman"/>
           <w:noProof/>
-          <w:sz w:val="20"/>
+          <w:sz w:val="17"/>
         </w:rPr>
         <w:drawing>
-          <wp:inline distT="0" distB="0" distL="0" distR="0" wp14:anchorId="31D4D9A1" wp14:editId="1A780F62">
-            <wp:extent cx="4445000" cy="3581135"/>
+          <wp:inline distT="0" distB="0" distL="0" distR="0" wp14:anchorId="5B1128F6" wp14:editId="5B8A1F51">
+            <wp:extent cx="4191000" cy="10210664"/>
             <wp:effectExtent l="0" t="0" r="0" b="635"/>
             <wp:docPr id="3" name="Imagen 3"/>
             <wp:cNvGraphicFramePr/>
@@ -3530,7 +3419,7 @@
                     <pic:cNvPicPr/>
                   </pic:nvPicPr>
                   <pic:blipFill>
-                    <a:blip r:embed="rId8">
+                    <a:blip r:embed="rId8" cstate="print">
                       <a:extLst>
                         <a:ext uri="{28A0092B-C50C-407E-A947-70E740481C1C}">
                           <a14:useLocalDpi xmlns:a14="http://schemas.microsoft.com/office/drawing/2010/main" val="0"/>
@@ -3544,7 +3433,7 @@
                   <pic:spPr>
                     <a:xfrm>
                       <a:off x="0" y="0"/>
-                      <a:ext cx="4445000" cy="3581135"/>
+                      <a:ext cx="4191000" cy="10210664"/>
                     </a:xfrm>
                     <a:prstGeom prst="rect">
                       <a:avLst/>
@@ -3575,7 +3464,23 @@
           <w:i/>
           <w:sz w:val="17"/>
         </w:rPr>
-        <w:t>Figura 5.1: Mockup — Detalle del Libro y Acción de Reserva de Ejemplar Físico</w:t>
+        <w:t>Figura 5.2: Arquitectura C4 Nivel 2 — Diagrama de Contenedores de la Solución</w:t>
+      </w:r>
+    </w:p>
+    <w:p>
+      <w:pPr>
+        <w:spacing w:before="160" w:after="40" w:line="253" w:lineRule="auto"/>
+        <w:rPr>
+          <w:rFonts w:ascii="Times New Roman" w:hAnsi="Times New Roman" w:cs="Times New Roman"/>
+          <w:b/>
+        </w:rPr>
+      </w:pPr>
+      <w:r>
+        <w:rPr>
+          <w:rFonts w:ascii="Times New Roman" w:hAnsi="Times New Roman" w:cs="Times New Roman"/>
+          <w:b/>
+        </w:rPr>
+        <w:t>5.2 Modelo de Datos Relacional (34 Entidades Normalizadas)</w:t>
       </w:r>
     </w:p>
     <w:p>
@@ -3584,17 +3489,31 @@
         <w:jc w:val="both"/>
         <w:rPr>
           <w:rFonts w:ascii="Times New Roman" w:hAnsi="Times New Roman" w:cs="Times New Roman"/>
-          <w:b/>
           <w:sz w:val="20"/>
         </w:rPr>
       </w:pPr>
       <w:r>
         <w:rPr>
           <w:rFonts w:ascii="Times New Roman" w:hAnsi="Times New Roman" w:cs="Times New Roman"/>
-          <w:b/>
           <w:sz w:val="20"/>
         </w:rPr>
-        <w:t>B. Carrito de Compras y Resumen de Orden (CU-01 / RF-012, RF-013, RF-036, RF-037):</w:t>
+        <w:t>El modelo relacional segrega estrictamente el concepto bibliográfico genérico (LIBRO) del objeto físico comercializable (EJEMPLAR), permitiendo que cada copia posea su propio código de barras, sucursal física y estado (DISPONIBLE, RESERVADO, VENDIDO, EN_DEVOLUCION, DADO_DE_BAJA). Las tablas transaccionales RESERVA y DETALLE_VENTA aseguran integridad referencial y atomicidad mediante claves foráneas, bloqueos a nivel de fila y restricciones de unicidad.</w:t>
+      </w:r>
+    </w:p>
+    <w:p>
+      <w:pPr>
+        <w:spacing w:before="160" w:after="40" w:line="253" w:lineRule="auto"/>
+        <w:rPr>
+          <w:rFonts w:ascii="Times New Roman" w:hAnsi="Times New Roman" w:cs="Times New Roman"/>
+          <w:b/>
+        </w:rPr>
+      </w:pPr>
+      <w:r>
+        <w:rPr>
+          <w:rFonts w:ascii="Times New Roman" w:hAnsi="Times New Roman" w:cs="Times New Roman"/>
+          <w:b/>
+        </w:rPr>
+        <w:t>5.3 Mockups y Wireframes de Pantallas Críticas (Alcance 'Must Have')</w:t>
       </w:r>
     </w:p>
     <w:p>
@@ -3611,27 +3530,44 @@
           <w:rFonts w:ascii="Times New Roman" w:hAnsi="Times New Roman" w:cs="Times New Roman"/>
           <w:sz w:val="20"/>
         </w:rPr>
-        <w:t>Permite revisar la selección de libros, cantidades, subtotales, saldo disponible del monedero del cliente y proceder al checkout transaccional:</w:t>
-      </w:r>
-    </w:p>
-    <w:p>
-      <w:pPr>
-        <w:spacing w:after="60" w:line="224" w:lineRule="auto"/>
+        <w:t>A continuación se presentan exclusivamente los mockups y wireframes que forman parte del alcance indispensable (Must Have) del proyecto, validados directamente con las Historias de Usuario aprobadas. Se excluyen funcionalidades diferidas (como Realidad Aumentada o devoluciones avanzadas):</w:t>
+      </w:r>
+    </w:p>
+    <w:p>
+      <w:pPr>
+        <w:spacing w:after="60" w:line="213" w:lineRule="auto"/>
+        <w:jc w:val="both"/>
+        <w:rPr>
+          <w:rFonts w:ascii="Times New Roman" w:hAnsi="Times New Roman" w:cs="Times New Roman"/>
+          <w:sz w:val="19"/>
+        </w:rPr>
+      </w:pPr>
+      <w:r>
+        <w:rPr>
+          <w:rFonts w:ascii="Times New Roman" w:hAnsi="Times New Roman" w:cs="Times New Roman"/>
+          <w:sz w:val="19"/>
+        </w:rPr>
+        <w:t>A. Registro de Usuario (CU-05 / RF-027): Formulario completo de vinculación de clientes con validación de DNI, datos personales, correo electrónico y credenciales seguras.</w:t>
+      </w:r>
+    </w:p>
+    <w:p>
+      <w:pPr>
+        <w:spacing w:after="60" w:line="213" w:lineRule="auto"/>
         <w:jc w:val="center"/>
         <w:rPr>
           <w:rFonts w:ascii="Times New Roman" w:hAnsi="Times New Roman" w:cs="Times New Roman"/>
-          <w:sz w:val="20"/>
+          <w:sz w:val="19"/>
         </w:rPr>
       </w:pPr>
       <w:r>
         <w:rPr>
           <w:rFonts w:ascii="Times New Roman" w:hAnsi="Times New Roman" w:cs="Times New Roman"/>
           <w:noProof/>
-          <w:sz w:val="20"/>
+          <w:sz w:val="19"/>
         </w:rPr>
         <w:drawing>
-          <wp:inline distT="0" distB="0" distL="0" distR="0" wp14:anchorId="0B7B486E" wp14:editId="51926305">
-            <wp:extent cx="4445000" cy="2733146"/>
+          <wp:inline distT="0" distB="0" distL="0" distR="0" wp14:anchorId="02C6FBCF" wp14:editId="79BD3FDB">
+            <wp:extent cx="4191000" cy="3529920"/>
             <wp:effectExtent l="0" t="0" r="0" b="0"/>
             <wp:docPr id="4" name="Imagen 4"/>
             <wp:cNvGraphicFramePr/>
@@ -3657,7 +3593,7 @@
                   <pic:spPr>
                     <a:xfrm>
                       <a:off x="0" y="0"/>
-                      <a:ext cx="4445000" cy="2733146"/>
+                      <a:ext cx="4191000" cy="3529920"/>
                     </a:xfrm>
                     <a:prstGeom prst="rect">
                       <a:avLst/>
@@ -3672,7 +3608,7 @@
     </w:p>
     <w:p>
       <w:pPr>
-        <w:spacing w:before="40" w:after="140" w:line="224" w:lineRule="auto"/>
+        <w:spacing w:before="40" w:after="140" w:line="213" w:lineRule="auto"/>
         <w:jc w:val="center"/>
         <w:rPr>
           <w:rFonts w:ascii="Times New Roman" w:hAnsi="Times New Roman" w:cs="Times New Roman"/>
@@ -3688,64 +3624,45 @@
           <w:i/>
           <w:sz w:val="17"/>
         </w:rPr>
-        <w:t>Figura 5.2: Mockup — Carrito de Compras, Desglose de Costos y Saldo Disponible</w:t>
-      </w:r>
-    </w:p>
-    <w:p>
-      <w:pPr>
-        <w:spacing w:after="60" w:line="224" w:lineRule="auto"/>
-        <w:jc w:val="both"/>
-        <w:rPr>
-          <w:rFonts w:ascii="Times New Roman" w:hAnsi="Times New Roman" w:cs="Times New Roman"/>
-          <w:b/>
-          <w:sz w:val="20"/>
-        </w:rPr>
-      </w:pPr>
-      <w:r>
-        <w:rPr>
-          <w:rFonts w:ascii="Times New Roman" w:hAnsi="Times New Roman" w:cs="Times New Roman"/>
-          <w:b/>
-          <w:sz w:val="20"/>
-        </w:rPr>
-        <w:t>C. Solicitud de Devolución y Código QR Digital (CU-04 / RF-016 a RF-020):</w:t>
-      </w:r>
-    </w:p>
-    <w:p>
-      <w:pPr>
-        <w:spacing w:after="60" w:line="224" w:lineRule="auto"/>
-        <w:jc w:val="both"/>
-        <w:rPr>
-          <w:rFonts w:ascii="Times New Roman" w:hAnsi="Times New Roman" w:cs="Times New Roman"/>
-          <w:sz w:val="20"/>
-        </w:rPr>
-      </w:pPr>
-      <w:r>
-        <w:rPr>
-          <w:rFonts w:ascii="Times New Roman" w:hAnsi="Times New Roman" w:cs="Times New Roman"/>
-          <w:sz w:val="20"/>
-        </w:rPr>
-        <w:t>Interfaz post-venta donde el cliente selecciona un pedido entregado, ingresa la causa tipificada y recibe el código QR que acredita su autorización antes del vencimiento del límite de 8 días:</w:t>
-      </w:r>
-    </w:p>
-    <w:p>
-      <w:pPr>
-        <w:spacing w:after="60" w:line="224" w:lineRule="auto"/>
+        <w:t>Figura 5.3: Mockup — Registro de Usuario (Visitante a Cliente - RF-027)</w:t>
+      </w:r>
+    </w:p>
+    <w:p>
+      <w:pPr>
+        <w:spacing w:after="60" w:line="213" w:lineRule="auto"/>
+        <w:jc w:val="both"/>
+        <w:rPr>
+          <w:rFonts w:ascii="Times New Roman" w:hAnsi="Times New Roman" w:cs="Times New Roman"/>
+          <w:sz w:val="19"/>
+        </w:rPr>
+      </w:pPr>
+      <w:r>
+        <w:rPr>
+          <w:rFonts w:ascii="Times New Roman" w:hAnsi="Times New Roman" w:cs="Times New Roman"/>
+          <w:sz w:val="19"/>
+        </w:rPr>
+        <w:t>B. Creación de Administrador por Root (CU-08 / RF-030): Interfaz exclusiva para el rol Root con privilegios restringidos para dar de alta nuevo personal administrativo.</w:t>
+      </w:r>
+    </w:p>
+    <w:p>
+      <w:pPr>
+        <w:spacing w:after="60" w:line="213" w:lineRule="auto"/>
         <w:jc w:val="center"/>
         <w:rPr>
           <w:rFonts w:ascii="Times New Roman" w:hAnsi="Times New Roman" w:cs="Times New Roman"/>
-          <w:sz w:val="20"/>
+          <w:sz w:val="19"/>
         </w:rPr>
       </w:pPr>
       <w:r>
         <w:rPr>
           <w:rFonts w:ascii="Times New Roman" w:hAnsi="Times New Roman" w:cs="Times New Roman"/>
           <w:noProof/>
-          <w:sz w:val="20"/>
+          <w:sz w:val="19"/>
         </w:rPr>
         <w:drawing>
-          <wp:inline distT="0" distB="0" distL="0" distR="0" wp14:anchorId="327FF25F" wp14:editId="5400C43B">
-            <wp:extent cx="4318000" cy="3707140"/>
-            <wp:effectExtent l="0" t="0" r="6350" b="7620"/>
+          <wp:inline distT="0" distB="0" distL="0" distR="0" wp14:anchorId="2992A192" wp14:editId="7ED2B7A4">
+            <wp:extent cx="4191000" cy="5886278"/>
+            <wp:effectExtent l="0" t="0" r="0" b="635"/>
             <wp:docPr id="5" name="Imagen 5"/>
             <wp:cNvGraphicFramePr/>
             <a:graphic xmlns:a="http://schemas.openxmlformats.org/drawingml/2006/main">
@@ -3770,7 +3687,7 @@
                   <pic:spPr>
                     <a:xfrm>
                       <a:off x="0" y="0"/>
-                      <a:ext cx="4318000" cy="3707140"/>
+                      <a:ext cx="4191000" cy="5886278"/>
                     </a:xfrm>
                     <a:prstGeom prst="rect">
                       <a:avLst/>
@@ -3785,7 +3702,7 @@
     </w:p>
     <w:p>
       <w:pPr>
-        <w:spacing w:before="40" w:after="140" w:line="224" w:lineRule="auto"/>
+        <w:spacing w:before="40" w:after="140" w:line="213" w:lineRule="auto"/>
         <w:jc w:val="center"/>
         <w:rPr>
           <w:rFonts w:ascii="Times New Roman" w:hAnsi="Times New Roman" w:cs="Times New Roman"/>
@@ -3801,64 +3718,45 @@
           <w:i/>
           <w:sz w:val="17"/>
         </w:rPr>
-        <w:t>Figura 5.3: Mockup — Módulo de Devoluciones y Salvoconducto Digital con Código QR</w:t>
-      </w:r>
-    </w:p>
-    <w:p>
-      <w:pPr>
-        <w:spacing w:after="60" w:line="224" w:lineRule="auto"/>
-        <w:jc w:val="both"/>
-        <w:rPr>
-          <w:rFonts w:ascii="Times New Roman" w:hAnsi="Times New Roman" w:cs="Times New Roman"/>
-          <w:b/>
-          <w:sz w:val="20"/>
-        </w:rPr>
-      </w:pPr>
-      <w:r>
-        <w:rPr>
-          <w:rFonts w:ascii="Times New Roman" w:hAnsi="Times New Roman" w:cs="Times New Roman"/>
-          <w:b/>
-          <w:sz w:val="20"/>
-        </w:rPr>
-        <w:t>D. Panel Administrativo de Inventario y Stock Multisede (RF-001 a RF-005, RF-031):</w:t>
-      </w:r>
-    </w:p>
-    <w:p>
-      <w:pPr>
-        <w:spacing w:after="60" w:line="224" w:lineRule="auto"/>
-        <w:jc w:val="both"/>
-        <w:rPr>
-          <w:rFonts w:ascii="Times New Roman" w:hAnsi="Times New Roman" w:cs="Times New Roman"/>
-          <w:sz w:val="20"/>
-        </w:rPr>
-      </w:pPr>
-      <w:r>
-        <w:rPr>
-          <w:rFonts w:ascii="Times New Roman" w:hAnsi="Times New Roman" w:cs="Times New Roman"/>
-          <w:sz w:val="20"/>
-        </w:rPr>
-        <w:t>Vista reservada para Administradores con tabla consolidada de inventario, filtros por categoría, actualización de unidades, botón para registrar ejemplares y restricción de compra/reserva para este perfil:</w:t>
-      </w:r>
-    </w:p>
-    <w:p>
-      <w:pPr>
-        <w:spacing w:after="60" w:line="224" w:lineRule="auto"/>
+        <w:t>Figura 5.4: Mockup — Creación de Cuenta de Administrador por Superadmin Root (RF-030)</w:t>
+      </w:r>
+    </w:p>
+    <w:p>
+      <w:pPr>
+        <w:spacing w:after="60" w:line="213" w:lineRule="auto"/>
+        <w:jc w:val="both"/>
+        <w:rPr>
+          <w:rFonts w:ascii="Times New Roman" w:hAnsi="Times New Roman" w:cs="Times New Roman"/>
+          <w:sz w:val="19"/>
+        </w:rPr>
+      </w:pPr>
+      <w:r>
+        <w:rPr>
+          <w:rFonts w:ascii="Times New Roman" w:hAnsi="Times New Roman" w:cs="Times New Roman"/>
+          <w:sz w:val="19"/>
+        </w:rPr>
+        <w:t>C. Restricción de Compra para Administrador y Root (RF-031): Bloqueo operativo en la interfaz que impide a los administradores auto-comprarse o reservarse ejemplares.</w:t>
+      </w:r>
+    </w:p>
+    <w:p>
+      <w:pPr>
+        <w:spacing w:after="60" w:line="213" w:lineRule="auto"/>
         <w:jc w:val="center"/>
         <w:rPr>
           <w:rFonts w:ascii="Times New Roman" w:hAnsi="Times New Roman" w:cs="Times New Roman"/>
-          <w:sz w:val="20"/>
+          <w:sz w:val="19"/>
         </w:rPr>
       </w:pPr>
       <w:r>
         <w:rPr>
           <w:rFonts w:ascii="Times New Roman" w:hAnsi="Times New Roman" w:cs="Times New Roman"/>
           <w:noProof/>
-          <w:sz w:val="20"/>
+          <w:sz w:val="19"/>
         </w:rPr>
         <w:drawing>
-          <wp:inline distT="0" distB="0" distL="0" distR="0" wp14:anchorId="551F9EEF" wp14:editId="31BF67F6">
-            <wp:extent cx="4318000" cy="3838651"/>
-            <wp:effectExtent l="0" t="0" r="6350" b="9525"/>
+          <wp:inline distT="0" distB="0" distL="0" distR="0" wp14:anchorId="3E417572" wp14:editId="15F65A1A">
+            <wp:extent cx="4191000" cy="2360764"/>
+            <wp:effectExtent l="0" t="0" r="0" b="1905"/>
             <wp:docPr id="6" name="Imagen 6"/>
             <wp:cNvGraphicFramePr/>
             <a:graphic xmlns:a="http://schemas.openxmlformats.org/drawingml/2006/main">
@@ -3869,7 +3767,477 @@
                     <pic:cNvPicPr/>
                   </pic:nvPicPr>
                   <pic:blipFill>
-                    <a:blip r:embed="rId11">
+                    <a:blip r:embed="rId11" cstate="print">
+                      <a:extLst>
+                        <a:ext uri="{28A0092B-C50C-407E-A947-70E740481C1C}">
+                          <a14:useLocalDpi xmlns:a14="http://schemas.microsoft.com/office/drawing/2010/main" val="0"/>
+                        </a:ext>
+                      </a:extLst>
+                    </a:blip>
+                    <a:stretch>
+                      <a:fillRect/>
+                    </a:stretch>
+                  </pic:blipFill>
+                  <pic:spPr>
+                    <a:xfrm>
+                      <a:off x="0" y="0"/>
+                      <a:ext cx="4191000" cy="2360764"/>
+                    </a:xfrm>
+                    <a:prstGeom prst="rect">
+                      <a:avLst/>
+                    </a:prstGeom>
+                  </pic:spPr>
+                </pic:pic>
+              </a:graphicData>
+            </a:graphic>
+          </wp:inline>
+        </w:drawing>
+      </w:r>
+    </w:p>
+    <w:p>
+      <w:pPr>
+        <w:spacing w:before="40" w:after="140" w:line="213" w:lineRule="auto"/>
+        <w:jc w:val="center"/>
+        <w:rPr>
+          <w:rFonts w:ascii="Times New Roman" w:hAnsi="Times New Roman" w:cs="Times New Roman"/>
+          <w:b/>
+          <w:i/>
+          <w:sz w:val="17"/>
+        </w:rPr>
+      </w:pPr>
+      <w:r>
+        <w:rPr>
+          <w:rFonts w:ascii="Times New Roman" w:hAnsi="Times New Roman" w:cs="Times New Roman"/>
+          <w:b/>
+          <w:i/>
+          <w:sz w:val="17"/>
+        </w:rPr>
+        <w:t>Figura 5.5: Mockup — Restricción Estricta de Compra para Administradores (RF-031)</w:t>
+      </w:r>
+    </w:p>
+    <w:p>
+      <w:pPr>
+        <w:spacing w:after="60" w:line="213" w:lineRule="auto"/>
+        <w:jc w:val="both"/>
+        <w:rPr>
+          <w:rFonts w:ascii="Times New Roman" w:hAnsi="Times New Roman" w:cs="Times New Roman"/>
+          <w:sz w:val="19"/>
+        </w:rPr>
+      </w:pPr>
+      <w:r>
+        <w:rPr>
+          <w:rFonts w:ascii="Times New Roman" w:hAnsi="Times New Roman" w:cs="Times New Roman"/>
+          <w:sz w:val="19"/>
+        </w:rPr>
+        <w:t>D. Inicio de Sesión (Login) (RF-026 / RF-028): Pantalla de ingreso con tokenización JWT y hashing bcrypt unidireccional de contraseñas.</w:t>
+      </w:r>
+    </w:p>
+    <w:p>
+      <w:pPr>
+        <w:spacing w:after="60" w:line="213" w:lineRule="auto"/>
+        <w:jc w:val="center"/>
+        <w:rPr>
+          <w:rFonts w:ascii="Times New Roman" w:hAnsi="Times New Roman" w:cs="Times New Roman"/>
+          <w:sz w:val="19"/>
+        </w:rPr>
+      </w:pPr>
+      <w:r>
+        <w:rPr>
+          <w:rFonts w:ascii="Times New Roman" w:hAnsi="Times New Roman" w:cs="Times New Roman"/>
+          <w:noProof/>
+          <w:sz w:val="19"/>
+        </w:rPr>
+        <w:drawing>
+          <wp:inline distT="0" distB="0" distL="0" distR="0" wp14:anchorId="322A5E2F" wp14:editId="5C6F21C4">
+            <wp:extent cx="4064000" cy="3364895"/>
+            <wp:effectExtent l="0" t="0" r="0" b="6985"/>
+            <wp:docPr id="7" name="Imagen 7"/>
+            <wp:cNvGraphicFramePr/>
+            <a:graphic xmlns:a="http://schemas.openxmlformats.org/drawingml/2006/main">
+              <a:graphicData uri="http://schemas.openxmlformats.org/drawingml/2006/picture">
+                <pic:pic xmlns:pic="http://schemas.openxmlformats.org/drawingml/2006/picture">
+                  <pic:nvPicPr>
+                    <pic:cNvPr id="7" name=""/>
+                    <pic:cNvPicPr/>
+                  </pic:nvPicPr>
+                  <pic:blipFill>
+                    <a:blip r:embed="rId12">
+                      <a:extLst>
+                        <a:ext uri="{28A0092B-C50C-407E-A947-70E740481C1C}">
+                          <a14:useLocalDpi xmlns:a14="http://schemas.microsoft.com/office/drawing/2010/main" val="0"/>
+                        </a:ext>
+                      </a:extLst>
+                    </a:blip>
+                    <a:stretch>
+                      <a:fillRect/>
+                    </a:stretch>
+                  </pic:blipFill>
+                  <pic:spPr>
+                    <a:xfrm>
+                      <a:off x="0" y="0"/>
+                      <a:ext cx="4064000" cy="3364895"/>
+                    </a:xfrm>
+                    <a:prstGeom prst="rect">
+                      <a:avLst/>
+                    </a:prstGeom>
+                  </pic:spPr>
+                </pic:pic>
+              </a:graphicData>
+            </a:graphic>
+          </wp:inline>
+        </w:drawing>
+      </w:r>
+    </w:p>
+    <w:p>
+      <w:pPr>
+        <w:spacing w:before="40" w:after="140" w:line="213" w:lineRule="auto"/>
+        <w:jc w:val="center"/>
+        <w:rPr>
+          <w:rFonts w:ascii="Times New Roman" w:hAnsi="Times New Roman" w:cs="Times New Roman"/>
+          <w:b/>
+          <w:i/>
+          <w:sz w:val="17"/>
+        </w:rPr>
+      </w:pPr>
+      <w:r>
+        <w:rPr>
+          <w:rFonts w:ascii="Times New Roman" w:hAnsi="Times New Roman" w:cs="Times New Roman"/>
+          <w:b/>
+          <w:i/>
+          <w:sz w:val="17"/>
+        </w:rPr>
+        <w:t>Figura 5.6: Mockup — Inicio de Sesión y Autenticación JWT (RF-026)</w:t>
+      </w:r>
+    </w:p>
+    <w:p>
+      <w:pPr>
+        <w:spacing w:after="60" w:line="213" w:lineRule="auto"/>
+        <w:jc w:val="both"/>
+        <w:rPr>
+          <w:rFonts w:ascii="Times New Roman" w:hAnsi="Times New Roman" w:cs="Times New Roman"/>
+          <w:sz w:val="19"/>
+        </w:rPr>
+      </w:pPr>
+      <w:r>
+        <w:rPr>
+          <w:rFonts w:ascii="Times New Roman" w:hAnsi="Times New Roman" w:cs="Times New Roman"/>
+          <w:sz w:val="19"/>
+        </w:rPr>
+        <w:t>E. Registro de Libros en Inventario (CU-01 / RF-001, RF-002): Formulario administrativo para catalogar títulos con asignación de código único por copia física.</w:t>
+      </w:r>
+    </w:p>
+    <w:p>
+      <w:pPr>
+        <w:spacing w:after="60" w:line="213" w:lineRule="auto"/>
+        <w:jc w:val="center"/>
+        <w:rPr>
+          <w:rFonts w:ascii="Times New Roman" w:hAnsi="Times New Roman" w:cs="Times New Roman"/>
+          <w:sz w:val="19"/>
+        </w:rPr>
+      </w:pPr>
+      <w:r>
+        <w:rPr>
+          <w:rFonts w:ascii="Times New Roman" w:hAnsi="Times New Roman" w:cs="Times New Roman"/>
+          <w:noProof/>
+          <w:sz w:val="19"/>
+        </w:rPr>
+        <w:drawing>
+          <wp:inline distT="0" distB="0" distL="0" distR="0" wp14:anchorId="502B35C1" wp14:editId="1FF4E5E3">
+            <wp:extent cx="4318000" cy="3388431"/>
+            <wp:effectExtent l="0" t="0" r="6350" b="2540"/>
+            <wp:docPr id="8" name="Imagen 8"/>
+            <wp:cNvGraphicFramePr/>
+            <a:graphic xmlns:a="http://schemas.openxmlformats.org/drawingml/2006/main">
+              <a:graphicData uri="http://schemas.openxmlformats.org/drawingml/2006/picture">
+                <pic:pic xmlns:pic="http://schemas.openxmlformats.org/drawingml/2006/picture">
+                  <pic:nvPicPr>
+                    <pic:cNvPr id="8" name=""/>
+                    <pic:cNvPicPr/>
+                  </pic:nvPicPr>
+                  <pic:blipFill>
+                    <a:blip r:embed="rId13">
+                      <a:extLst>
+                        <a:ext uri="{28A0092B-C50C-407E-A947-70E740481C1C}">
+                          <a14:useLocalDpi xmlns:a14="http://schemas.microsoft.com/office/drawing/2010/main" val="0"/>
+                        </a:ext>
+                      </a:extLst>
+                    </a:blip>
+                    <a:stretch>
+                      <a:fillRect/>
+                    </a:stretch>
+                  </pic:blipFill>
+                  <pic:spPr>
+                    <a:xfrm>
+                      <a:off x="0" y="0"/>
+                      <a:ext cx="4318000" cy="3388431"/>
+                    </a:xfrm>
+                    <a:prstGeom prst="rect">
+                      <a:avLst/>
+                    </a:prstGeom>
+                  </pic:spPr>
+                </pic:pic>
+              </a:graphicData>
+            </a:graphic>
+          </wp:inline>
+        </w:drawing>
+      </w:r>
+    </w:p>
+    <w:p>
+      <w:pPr>
+        <w:spacing w:before="40" w:after="140" w:line="213" w:lineRule="auto"/>
+        <w:jc w:val="center"/>
+        <w:rPr>
+          <w:rFonts w:ascii="Times New Roman" w:hAnsi="Times New Roman" w:cs="Times New Roman"/>
+          <w:b/>
+          <w:i/>
+          <w:sz w:val="17"/>
+        </w:rPr>
+      </w:pPr>
+      <w:r>
+        <w:rPr>
+          <w:rFonts w:ascii="Times New Roman" w:hAnsi="Times New Roman" w:cs="Times New Roman"/>
+          <w:b/>
+          <w:i/>
+          <w:sz w:val="17"/>
+        </w:rPr>
+        <w:t>Figura 5.7: Mockup — Registro de Nuevos Libros y Datos Bibliográficos (RF-001)</w:t>
+      </w:r>
+    </w:p>
+    <w:p>
+      <w:pPr>
+        <w:spacing w:after="60" w:line="213" w:lineRule="auto"/>
+        <w:jc w:val="both"/>
+        <w:rPr>
+          <w:rFonts w:ascii="Times New Roman" w:hAnsi="Times New Roman" w:cs="Times New Roman"/>
+          <w:sz w:val="19"/>
+        </w:rPr>
+      </w:pPr>
+      <w:r>
+        <w:rPr>
+          <w:rFonts w:ascii="Times New Roman" w:hAnsi="Times New Roman" w:cs="Times New Roman"/>
+          <w:sz w:val="19"/>
+        </w:rPr>
+        <w:t>F. Baja de Ejemplar (RF-004): Modal de confirmación para retirar copias físicas deterioradas o extraviadas, preservando la auditoría.</w:t>
+      </w:r>
+    </w:p>
+    <w:p>
+      <w:pPr>
+        <w:spacing w:after="60" w:line="213" w:lineRule="auto"/>
+        <w:jc w:val="center"/>
+        <w:rPr>
+          <w:rFonts w:ascii="Times New Roman" w:hAnsi="Times New Roman" w:cs="Times New Roman"/>
+          <w:sz w:val="19"/>
+        </w:rPr>
+      </w:pPr>
+      <w:r>
+        <w:rPr>
+          <w:rFonts w:ascii="Times New Roman" w:hAnsi="Times New Roman" w:cs="Times New Roman"/>
+          <w:noProof/>
+          <w:sz w:val="19"/>
+        </w:rPr>
+        <w:drawing>
+          <wp:inline distT="0" distB="0" distL="0" distR="0" wp14:anchorId="3199AC83" wp14:editId="5BF66F13">
+            <wp:extent cx="3810000" cy="2503466"/>
+            <wp:effectExtent l="0" t="0" r="0" b="0"/>
+            <wp:docPr id="9" name="Imagen 9"/>
+            <wp:cNvGraphicFramePr/>
+            <a:graphic xmlns:a="http://schemas.openxmlformats.org/drawingml/2006/main">
+              <a:graphicData uri="http://schemas.openxmlformats.org/drawingml/2006/picture">
+                <pic:pic xmlns:pic="http://schemas.openxmlformats.org/drawingml/2006/picture">
+                  <pic:nvPicPr>
+                    <pic:cNvPr id="9" name=""/>
+                    <pic:cNvPicPr/>
+                  </pic:nvPicPr>
+                  <pic:blipFill>
+                    <a:blip r:embed="rId14">
+                      <a:extLst>
+                        <a:ext uri="{28A0092B-C50C-407E-A947-70E740481C1C}">
+                          <a14:useLocalDpi xmlns:a14="http://schemas.microsoft.com/office/drawing/2010/main" val="0"/>
+                        </a:ext>
+                      </a:extLst>
+                    </a:blip>
+                    <a:stretch>
+                      <a:fillRect/>
+                    </a:stretch>
+                  </pic:blipFill>
+                  <pic:spPr>
+                    <a:xfrm>
+                      <a:off x="0" y="0"/>
+                      <a:ext cx="3810000" cy="2503466"/>
+                    </a:xfrm>
+                    <a:prstGeom prst="rect">
+                      <a:avLst/>
+                    </a:prstGeom>
+                  </pic:spPr>
+                </pic:pic>
+              </a:graphicData>
+            </a:graphic>
+          </wp:inline>
+        </w:drawing>
+      </w:r>
+    </w:p>
+    <w:p>
+      <w:pPr>
+        <w:spacing w:before="40" w:after="140" w:line="213" w:lineRule="auto"/>
+        <w:jc w:val="center"/>
+        <w:rPr>
+          <w:rFonts w:ascii="Times New Roman" w:hAnsi="Times New Roman" w:cs="Times New Roman"/>
+          <w:b/>
+          <w:i/>
+          <w:sz w:val="17"/>
+        </w:rPr>
+      </w:pPr>
+      <w:r>
+        <w:rPr>
+          <w:rFonts w:ascii="Times New Roman" w:hAnsi="Times New Roman" w:cs="Times New Roman"/>
+          <w:b/>
+          <w:i/>
+          <w:sz w:val="17"/>
+        </w:rPr>
+        <w:t>Figura 5.8: Mockup — Confirmación de Baja / Eliminación de Ejemplares (RF-004)</w:t>
+      </w:r>
+    </w:p>
+    <w:p>
+      <w:pPr>
+        <w:spacing w:after="60" w:line="213" w:lineRule="auto"/>
+        <w:jc w:val="both"/>
+        <w:rPr>
+          <w:rFonts w:ascii="Times New Roman" w:hAnsi="Times New Roman" w:cs="Times New Roman"/>
+          <w:sz w:val="19"/>
+        </w:rPr>
+      </w:pPr>
+      <w:r>
+        <w:rPr>
+          <w:rFonts w:ascii="Times New Roman" w:hAnsi="Times New Roman" w:cs="Times New Roman"/>
+          <w:sz w:val="19"/>
+        </w:rPr>
+        <w:t>G. Edición de Libros (RF-003): Actualización de metadatos bibliográficos, precios y estados por parte del Administrador.</w:t>
+      </w:r>
+    </w:p>
+    <w:p>
+      <w:pPr>
+        <w:spacing w:after="60" w:line="213" w:lineRule="auto"/>
+        <w:jc w:val="center"/>
+        <w:rPr>
+          <w:rFonts w:ascii="Times New Roman" w:hAnsi="Times New Roman" w:cs="Times New Roman"/>
+          <w:sz w:val="19"/>
+        </w:rPr>
+      </w:pPr>
+      <w:r>
+        <w:rPr>
+          <w:rFonts w:ascii="Times New Roman" w:hAnsi="Times New Roman" w:cs="Times New Roman"/>
+          <w:noProof/>
+          <w:sz w:val="19"/>
+        </w:rPr>
+        <w:drawing>
+          <wp:inline distT="0" distB="0" distL="0" distR="0" wp14:anchorId="7D3A9EE1" wp14:editId="4FB96C4C">
+            <wp:extent cx="4191000" cy="3920786"/>
+            <wp:effectExtent l="0" t="0" r="0" b="3810"/>
+            <wp:docPr id="10" name="Imagen 10"/>
+            <wp:cNvGraphicFramePr/>
+            <a:graphic xmlns:a="http://schemas.openxmlformats.org/drawingml/2006/main">
+              <a:graphicData uri="http://schemas.openxmlformats.org/drawingml/2006/picture">
+                <pic:pic xmlns:pic="http://schemas.openxmlformats.org/drawingml/2006/picture">
+                  <pic:nvPicPr>
+                    <pic:cNvPr id="10" name=""/>
+                    <pic:cNvPicPr/>
+                  </pic:nvPicPr>
+                  <pic:blipFill>
+                    <a:blip r:embed="rId15">
+                      <a:extLst>
+                        <a:ext uri="{28A0092B-C50C-407E-A947-70E740481C1C}">
+                          <a14:useLocalDpi xmlns:a14="http://schemas.microsoft.com/office/drawing/2010/main" val="0"/>
+                        </a:ext>
+                      </a:extLst>
+                    </a:blip>
+                    <a:stretch>
+                      <a:fillRect/>
+                    </a:stretch>
+                  </pic:blipFill>
+                  <pic:spPr>
+                    <a:xfrm>
+                      <a:off x="0" y="0"/>
+                      <a:ext cx="4191000" cy="3920786"/>
+                    </a:xfrm>
+                    <a:prstGeom prst="rect">
+                      <a:avLst/>
+                    </a:prstGeom>
+                  </pic:spPr>
+                </pic:pic>
+              </a:graphicData>
+            </a:graphic>
+          </wp:inline>
+        </w:drawing>
+      </w:r>
+    </w:p>
+    <w:p>
+      <w:pPr>
+        <w:spacing w:before="40" w:after="140" w:line="213" w:lineRule="auto"/>
+        <w:jc w:val="center"/>
+        <w:rPr>
+          <w:rFonts w:ascii="Times New Roman" w:hAnsi="Times New Roman" w:cs="Times New Roman"/>
+          <w:b/>
+          <w:i/>
+          <w:sz w:val="17"/>
+        </w:rPr>
+      </w:pPr>
+      <w:r>
+        <w:rPr>
+          <w:rFonts w:ascii="Times New Roman" w:hAnsi="Times New Roman" w:cs="Times New Roman"/>
+          <w:b/>
+          <w:i/>
+          <w:sz w:val="17"/>
+        </w:rPr>
+        <w:t>Figura 5.9: Mockup — Modificación de Información de Libros Registrados (RF-003)</w:t>
+      </w:r>
+    </w:p>
+    <w:p>
+      <w:pPr>
+        <w:spacing w:after="60" w:line="213" w:lineRule="auto"/>
+        <w:jc w:val="both"/>
+        <w:rPr>
+          <w:rFonts w:ascii="Times New Roman" w:hAnsi="Times New Roman" w:cs="Times New Roman"/>
+          <w:sz w:val="19"/>
+        </w:rPr>
+      </w:pPr>
+      <w:r>
+        <w:rPr>
+          <w:rFonts w:ascii="Times New Roman" w:hAnsi="Times New Roman" w:cs="Times New Roman"/>
+          <w:sz w:val="19"/>
+        </w:rPr>
+        <w:t>H. Gestión de Existencias y Vista de Agotados (CU-11 / RF-005, RF-006): Tabla consolidada de existencias con filtros y paso automático a histórico agotado.</w:t>
+      </w:r>
+    </w:p>
+    <w:p>
+      <w:pPr>
+        <w:spacing w:after="60" w:line="213" w:lineRule="auto"/>
+        <w:jc w:val="center"/>
+        <w:rPr>
+          <w:rFonts w:ascii="Times New Roman" w:hAnsi="Times New Roman" w:cs="Times New Roman"/>
+          <w:sz w:val="19"/>
+        </w:rPr>
+      </w:pPr>
+      <w:r>
+        <w:rPr>
+          <w:rFonts w:ascii="Times New Roman" w:hAnsi="Times New Roman" w:cs="Times New Roman"/>
+          <w:noProof/>
+          <w:sz w:val="19"/>
+        </w:rPr>
+        <w:drawing>
+          <wp:inline distT="0" distB="0" distL="0" distR="0" wp14:anchorId="1B62D856" wp14:editId="3499A50D">
+            <wp:extent cx="4318000" cy="3838651"/>
+            <wp:effectExtent l="0" t="0" r="6350" b="9525"/>
+            <wp:docPr id="11" name="Imagen 11"/>
+            <wp:cNvGraphicFramePr/>
+            <a:graphic xmlns:a="http://schemas.openxmlformats.org/drawingml/2006/main">
+              <a:graphicData uri="http://schemas.openxmlformats.org/drawingml/2006/picture">
+                <pic:pic xmlns:pic="http://schemas.openxmlformats.org/drawingml/2006/picture">
+                  <pic:nvPicPr>
+                    <pic:cNvPr id="11" name=""/>
+                    <pic:cNvPicPr/>
+                  </pic:nvPicPr>
+                  <pic:blipFill>
+                    <a:blip r:embed="rId16">
                       <a:extLst>
                         <a:ext uri="{28A0092B-C50C-407E-A947-70E740481C1C}">
                           <a14:useLocalDpi xmlns:a14="http://schemas.microsoft.com/office/drawing/2010/main" val="0"/>
@@ -3898,7 +4266,7 @@
     </w:p>
     <w:p>
       <w:pPr>
-        <w:spacing w:before="40" w:after="140" w:line="224" w:lineRule="auto"/>
+        <w:spacing w:before="40" w:after="140" w:line="213" w:lineRule="auto"/>
         <w:jc w:val="center"/>
         <w:rPr>
           <w:rFonts w:ascii="Times New Roman" w:hAnsi="Times New Roman" w:cs="Times New Roman"/>
@@ -3914,75 +4282,56 @@
           <w:i/>
           <w:sz w:val="17"/>
         </w:rPr>
-        <w:t>Figura 5.4: Mockup — Gestión de Inventario, Bajas y Existencias para Administradores</w:t>
-      </w:r>
-    </w:p>
-    <w:p>
-      <w:pPr>
-        <w:spacing w:after="60" w:line="224" w:lineRule="auto"/>
-        <w:jc w:val="both"/>
-        <w:rPr>
-          <w:rFonts w:ascii="Times New Roman" w:hAnsi="Times New Roman" w:cs="Times New Roman"/>
-          <w:b/>
-          <w:sz w:val="20"/>
-        </w:rPr>
-      </w:pPr>
-      <w:r>
-        <w:rPr>
-          <w:rFonts w:ascii="Times New Roman" w:hAnsi="Times New Roman" w:cs="Times New Roman"/>
-          <w:b/>
-          <w:sz w:val="20"/>
-        </w:rPr>
-        <w:t>E. Recogida en Tienda Física y Geolocalización (CU-03 / RF-023, RF-024, RF-025):</w:t>
-      </w:r>
-    </w:p>
-    <w:p>
-      <w:pPr>
-        <w:spacing w:after="60" w:line="224" w:lineRule="auto"/>
-        <w:jc w:val="both"/>
-        <w:rPr>
-          <w:rFonts w:ascii="Times New Roman" w:hAnsi="Times New Roman" w:cs="Times New Roman"/>
-          <w:sz w:val="20"/>
-        </w:rPr>
-      </w:pPr>
-      <w:r>
-        <w:rPr>
-          <w:rFonts w:ascii="Times New Roman" w:hAnsi="Times New Roman" w:cs="Times New Roman"/>
-          <w:sz w:val="20"/>
-        </w:rPr>
-        <w:t>Pantalla de selección de entrega que renderiza el mapa interactivo vía Google Maps Platform API mostrando sucursales de Pereira y Bogotá con inventario en stock:</w:t>
-      </w:r>
-    </w:p>
-    <w:p>
-      <w:pPr>
-        <w:spacing w:after="60" w:line="224" w:lineRule="auto"/>
+        <w:t>Figura 5.10: Mockup — Panel de Control de Inventario y Existencias por Sede (RF-005)</w:t>
+      </w:r>
+    </w:p>
+    <w:p>
+      <w:pPr>
+        <w:spacing w:after="60" w:line="213" w:lineRule="auto"/>
+        <w:jc w:val="both"/>
+        <w:rPr>
+          <w:rFonts w:ascii="Times New Roman" w:hAnsi="Times New Roman" w:cs="Times New Roman"/>
+          <w:sz w:val="19"/>
+        </w:rPr>
+      </w:pPr>
+      <w:r>
+        <w:rPr>
+          <w:rFonts w:ascii="Times New Roman" w:hAnsi="Times New Roman" w:cs="Times New Roman"/>
+          <w:sz w:val="19"/>
+        </w:rPr>
+        <w:t>I. Búsqueda en Catálogo (CU-10 / RF-008): Barra de consulta rápida accesible para visitantes y clientes registrados.</w:t>
+      </w:r>
+    </w:p>
+    <w:p>
+      <w:pPr>
+        <w:spacing w:after="60" w:line="213" w:lineRule="auto"/>
         <w:jc w:val="center"/>
         <w:rPr>
           <w:rFonts w:ascii="Times New Roman" w:hAnsi="Times New Roman" w:cs="Times New Roman"/>
-          <w:sz w:val="20"/>
+          <w:sz w:val="19"/>
         </w:rPr>
       </w:pPr>
       <w:r>
         <w:rPr>
           <w:rFonts w:ascii="Times New Roman" w:hAnsi="Times New Roman" w:cs="Times New Roman"/>
           <w:noProof/>
-          <w:sz w:val="20"/>
+          <w:sz w:val="19"/>
         </w:rPr>
         <w:drawing>
-          <wp:inline distT="0" distB="0" distL="0" distR="0" wp14:anchorId="5323DAB8" wp14:editId="65F85486">
-            <wp:extent cx="4064000" cy="2390897"/>
-            <wp:effectExtent l="0" t="0" r="0" b="9525"/>
-            <wp:docPr id="7" name="Imagen 7"/>
+          <wp:inline distT="0" distB="0" distL="0" distR="0" wp14:anchorId="0BECD289" wp14:editId="37E0C165">
+            <wp:extent cx="4191000" cy="3584386"/>
+            <wp:effectExtent l="0" t="0" r="0" b="0"/>
+            <wp:docPr id="12" name="Imagen 12"/>
             <wp:cNvGraphicFramePr/>
             <a:graphic xmlns:a="http://schemas.openxmlformats.org/drawingml/2006/main">
               <a:graphicData uri="http://schemas.openxmlformats.org/drawingml/2006/picture">
                 <pic:pic xmlns:pic="http://schemas.openxmlformats.org/drawingml/2006/picture">
                   <pic:nvPicPr>
-                    <pic:cNvPr id="7" name=""/>
+                    <pic:cNvPr id="12" name=""/>
                     <pic:cNvPicPr/>
                   </pic:nvPicPr>
                   <pic:blipFill>
-                    <a:blip r:embed="rId12">
+                    <a:blip r:embed="rId17">
                       <a:extLst>
                         <a:ext uri="{28A0092B-C50C-407E-A947-70E740481C1C}">
                           <a14:useLocalDpi xmlns:a14="http://schemas.microsoft.com/office/drawing/2010/main" val="0"/>
@@ -3996,7 +4345,7 @@
                   <pic:spPr>
                     <a:xfrm>
                       <a:off x="0" y="0"/>
-                      <a:ext cx="4064000" cy="2390897"/>
+                      <a:ext cx="4191000" cy="3584386"/>
                     </a:xfrm>
                     <a:prstGeom prst="rect">
                       <a:avLst/>
@@ -4011,7 +4360,7 @@
     </w:p>
     <w:p>
       <w:pPr>
-        <w:spacing w:before="40" w:after="140" w:line="224" w:lineRule="auto"/>
+        <w:spacing w:before="40" w:after="140" w:line="213" w:lineRule="auto"/>
         <w:jc w:val="center"/>
         <w:rPr>
           <w:rFonts w:ascii="Times New Roman" w:hAnsi="Times New Roman" w:cs="Times New Roman"/>
@@ -4027,12 +4376,294 @@
           <w:i/>
           <w:sz w:val="17"/>
         </w:rPr>
-        <w:t>Figura 5.5: Mockup — Mapa Interactivo de Google Maps para Recogida en Tienda</w:t>
-      </w:r>
-    </w:p>
-    <w:p>
-      <w:pPr>
-        <w:spacing w:before="140" w:after="40" w:line="253" w:lineRule="auto"/>
+        <w:t>Figura 5.11: Mockup — Barra de Búsqueda y Navegación del Catálogo Público (RF-008)</w:t>
+      </w:r>
+    </w:p>
+    <w:p>
+      <w:pPr>
+        <w:spacing w:after="60" w:line="213" w:lineRule="auto"/>
+        <w:jc w:val="both"/>
+        <w:rPr>
+          <w:rFonts w:ascii="Times New Roman" w:hAnsi="Times New Roman" w:cs="Times New Roman"/>
+          <w:sz w:val="19"/>
+        </w:rPr>
+      </w:pPr>
+      <w:r>
+        <w:rPr>
+          <w:rFonts w:ascii="Times New Roman" w:hAnsi="Times New Roman" w:cs="Times New Roman"/>
+          <w:sz w:val="19"/>
+        </w:rPr>
+        <w:t>J. Carrito de Compras (CU-03 / RF-012, RF-013): Resumen dinámico de ítems, cantidades, precios unitarios y subtotal antes del checkout.</w:t>
+      </w:r>
+    </w:p>
+    <w:p>
+      <w:pPr>
+        <w:spacing w:after="60" w:line="213" w:lineRule="auto"/>
+        <w:jc w:val="center"/>
+        <w:rPr>
+          <w:rFonts w:ascii="Times New Roman" w:hAnsi="Times New Roman" w:cs="Times New Roman"/>
+          <w:sz w:val="19"/>
+        </w:rPr>
+      </w:pPr>
+      <w:r>
+        <w:rPr>
+          <w:rFonts w:ascii="Times New Roman" w:hAnsi="Times New Roman" w:cs="Times New Roman"/>
+          <w:noProof/>
+          <w:sz w:val="19"/>
+        </w:rPr>
+        <w:drawing>
+          <wp:inline distT="0" distB="0" distL="0" distR="0" wp14:anchorId="456A591B" wp14:editId="211CF6B1">
+            <wp:extent cx="4191000" cy="2576966"/>
+            <wp:effectExtent l="0" t="0" r="0" b="0"/>
+            <wp:docPr id="13" name="Imagen 13"/>
+            <wp:cNvGraphicFramePr/>
+            <a:graphic xmlns:a="http://schemas.openxmlformats.org/drawingml/2006/main">
+              <a:graphicData uri="http://schemas.openxmlformats.org/drawingml/2006/picture">
+                <pic:pic xmlns:pic="http://schemas.openxmlformats.org/drawingml/2006/picture">
+                  <pic:nvPicPr>
+                    <pic:cNvPr id="13" name=""/>
+                    <pic:cNvPicPr/>
+                  </pic:nvPicPr>
+                  <pic:blipFill>
+                    <a:blip r:embed="rId18">
+                      <a:extLst>
+                        <a:ext uri="{28A0092B-C50C-407E-A947-70E740481C1C}">
+                          <a14:useLocalDpi xmlns:a14="http://schemas.microsoft.com/office/drawing/2010/main" val="0"/>
+                        </a:ext>
+                      </a:extLst>
+                    </a:blip>
+                    <a:stretch>
+                      <a:fillRect/>
+                    </a:stretch>
+                  </pic:blipFill>
+                  <pic:spPr>
+                    <a:xfrm>
+                      <a:off x="0" y="0"/>
+                      <a:ext cx="4191000" cy="2576966"/>
+                    </a:xfrm>
+                    <a:prstGeom prst="rect">
+                      <a:avLst/>
+                    </a:prstGeom>
+                  </pic:spPr>
+                </pic:pic>
+              </a:graphicData>
+            </a:graphic>
+          </wp:inline>
+        </w:drawing>
+      </w:r>
+    </w:p>
+    <w:p>
+      <w:pPr>
+        <w:spacing w:before="40" w:after="140" w:line="213" w:lineRule="auto"/>
+        <w:jc w:val="center"/>
+        <w:rPr>
+          <w:rFonts w:ascii="Times New Roman" w:hAnsi="Times New Roman" w:cs="Times New Roman"/>
+          <w:b/>
+          <w:i/>
+          <w:sz w:val="17"/>
+        </w:rPr>
+      </w:pPr>
+      <w:r>
+        <w:rPr>
+          <w:rFonts w:ascii="Times New Roman" w:hAnsi="Times New Roman" w:cs="Times New Roman"/>
+          <w:b/>
+          <w:i/>
+          <w:sz w:val="17"/>
+        </w:rPr>
+        <w:t>Figura 5.12: Mockup — Carrito de Compras Interactivo y Resumen de Orden (RF-012)</w:t>
+      </w:r>
+    </w:p>
+    <w:p>
+      <w:pPr>
+        <w:spacing w:after="60" w:line="213" w:lineRule="auto"/>
+        <w:jc w:val="both"/>
+        <w:rPr>
+          <w:rFonts w:ascii="Times New Roman" w:hAnsi="Times New Roman" w:cs="Times New Roman"/>
+          <w:sz w:val="19"/>
+        </w:rPr>
+      </w:pPr>
+      <w:r>
+        <w:rPr>
+          <w:rFonts w:ascii="Times New Roman" w:hAnsi="Times New Roman" w:cs="Times New Roman"/>
+          <w:sz w:val="19"/>
+        </w:rPr>
+        <w:t>K. Cancelación de Compra (CU-15 / RF-014): Interfaz de aborto de transacción con liberación inmediata de ejemplares en inventario.</w:t>
+      </w:r>
+    </w:p>
+    <w:p>
+      <w:pPr>
+        <w:spacing w:after="60" w:line="213" w:lineRule="auto"/>
+        <w:jc w:val="center"/>
+        <w:rPr>
+          <w:rFonts w:ascii="Times New Roman" w:hAnsi="Times New Roman" w:cs="Times New Roman"/>
+          <w:sz w:val="19"/>
+        </w:rPr>
+      </w:pPr>
+      <w:r>
+        <w:rPr>
+          <w:rFonts w:ascii="Times New Roman" w:hAnsi="Times New Roman" w:cs="Times New Roman"/>
+          <w:noProof/>
+          <w:sz w:val="19"/>
+        </w:rPr>
+        <w:drawing>
+          <wp:inline distT="0" distB="0" distL="0" distR="0" wp14:anchorId="22CB205C" wp14:editId="062F6D89">
+            <wp:extent cx="3810000" cy="3356180"/>
+            <wp:effectExtent l="0" t="0" r="0" b="0"/>
+            <wp:docPr id="14" name="Imagen 14"/>
+            <wp:cNvGraphicFramePr/>
+            <a:graphic xmlns:a="http://schemas.openxmlformats.org/drawingml/2006/main">
+              <a:graphicData uri="http://schemas.openxmlformats.org/drawingml/2006/picture">
+                <pic:pic xmlns:pic="http://schemas.openxmlformats.org/drawingml/2006/picture">
+                  <pic:nvPicPr>
+                    <pic:cNvPr id="14" name=""/>
+                    <pic:cNvPicPr/>
+                  </pic:nvPicPr>
+                  <pic:blipFill>
+                    <a:blip r:embed="rId19">
+                      <a:extLst>
+                        <a:ext uri="{28A0092B-C50C-407E-A947-70E740481C1C}">
+                          <a14:useLocalDpi xmlns:a14="http://schemas.microsoft.com/office/drawing/2010/main" val="0"/>
+                        </a:ext>
+                      </a:extLst>
+                    </a:blip>
+                    <a:stretch>
+                      <a:fillRect/>
+                    </a:stretch>
+                  </pic:blipFill>
+                  <pic:spPr>
+                    <a:xfrm>
+                      <a:off x="0" y="0"/>
+                      <a:ext cx="3810000" cy="3356180"/>
+                    </a:xfrm>
+                    <a:prstGeom prst="rect">
+                      <a:avLst/>
+                    </a:prstGeom>
+                  </pic:spPr>
+                </pic:pic>
+              </a:graphicData>
+            </a:graphic>
+          </wp:inline>
+        </w:drawing>
+      </w:r>
+    </w:p>
+    <w:p>
+      <w:pPr>
+        <w:spacing w:before="40" w:after="140" w:line="213" w:lineRule="auto"/>
+        <w:jc w:val="center"/>
+        <w:rPr>
+          <w:rFonts w:ascii="Times New Roman" w:hAnsi="Times New Roman" w:cs="Times New Roman"/>
+          <w:b/>
+          <w:i/>
+          <w:sz w:val="17"/>
+        </w:rPr>
+      </w:pPr>
+      <w:r>
+        <w:rPr>
+          <w:rFonts w:ascii="Times New Roman" w:hAnsi="Times New Roman" w:cs="Times New Roman"/>
+          <w:b/>
+          <w:i/>
+          <w:sz w:val="17"/>
+        </w:rPr>
+        <w:t>Figura 5.13: Mockup — Confirmación de Cancelación de Compra y Rollback de Stock (RF-014)</w:t>
+      </w:r>
+    </w:p>
+    <w:p>
+      <w:pPr>
+        <w:spacing w:after="60" w:line="213" w:lineRule="auto"/>
+        <w:jc w:val="both"/>
+        <w:rPr>
+          <w:rFonts w:ascii="Times New Roman" w:hAnsi="Times New Roman" w:cs="Times New Roman"/>
+          <w:sz w:val="19"/>
+        </w:rPr>
+      </w:pPr>
+      <w:r>
+        <w:rPr>
+          <w:rFonts w:ascii="Times New Roman" w:hAnsi="Times New Roman" w:cs="Times New Roman"/>
+          <w:sz w:val="19"/>
+        </w:rPr>
+        <w:t>L. Saldo Disponible en Monedero (RF-037): Visualización del balance del cliente con opción de recarga de fondos para compras inmediatas.</w:t>
+      </w:r>
+    </w:p>
+    <w:p>
+      <w:pPr>
+        <w:spacing w:after="60" w:line="213" w:lineRule="auto"/>
+        <w:jc w:val="center"/>
+        <w:rPr>
+          <w:rFonts w:ascii="Times New Roman" w:hAnsi="Times New Roman" w:cs="Times New Roman"/>
+          <w:sz w:val="19"/>
+        </w:rPr>
+      </w:pPr>
+      <w:r>
+        <w:rPr>
+          <w:rFonts w:ascii="Times New Roman" w:hAnsi="Times New Roman" w:cs="Times New Roman"/>
+          <w:noProof/>
+          <w:sz w:val="19"/>
+        </w:rPr>
+        <w:drawing>
+          <wp:inline distT="0" distB="0" distL="0" distR="0" wp14:anchorId="36B72CF1" wp14:editId="4A92BDB7">
+            <wp:extent cx="3810000" cy="2209066"/>
+            <wp:effectExtent l="0" t="0" r="0" b="1270"/>
+            <wp:docPr id="15" name="Imagen 15"/>
+            <wp:cNvGraphicFramePr/>
+            <a:graphic xmlns:a="http://schemas.openxmlformats.org/drawingml/2006/main">
+              <a:graphicData uri="http://schemas.openxmlformats.org/drawingml/2006/picture">
+                <pic:pic xmlns:pic="http://schemas.openxmlformats.org/drawingml/2006/picture">
+                  <pic:nvPicPr>
+                    <pic:cNvPr id="15" name=""/>
+                    <pic:cNvPicPr/>
+                  </pic:nvPicPr>
+                  <pic:blipFill>
+                    <a:blip r:embed="rId20">
+                      <a:extLst>
+                        <a:ext uri="{28A0092B-C50C-407E-A947-70E740481C1C}">
+                          <a14:useLocalDpi xmlns:a14="http://schemas.microsoft.com/office/drawing/2010/main" val="0"/>
+                        </a:ext>
+                      </a:extLst>
+                    </a:blip>
+                    <a:stretch>
+                      <a:fillRect/>
+                    </a:stretch>
+                  </pic:blipFill>
+                  <pic:spPr>
+                    <a:xfrm>
+                      <a:off x="0" y="0"/>
+                      <a:ext cx="3810000" cy="2209066"/>
+                    </a:xfrm>
+                    <a:prstGeom prst="rect">
+                      <a:avLst/>
+                    </a:prstGeom>
+                  </pic:spPr>
+                </pic:pic>
+              </a:graphicData>
+            </a:graphic>
+          </wp:inline>
+        </w:drawing>
+      </w:r>
+    </w:p>
+    <w:p>
+      <w:pPr>
+        <w:spacing w:before="40" w:after="140" w:line="213" w:lineRule="auto"/>
+        <w:jc w:val="center"/>
+        <w:rPr>
+          <w:rFonts w:ascii="Times New Roman" w:hAnsi="Times New Roman" w:cs="Times New Roman"/>
+          <w:b/>
+          <w:i/>
+          <w:sz w:val="17"/>
+        </w:rPr>
+      </w:pPr>
+      <w:r>
+        <w:rPr>
+          <w:rFonts w:ascii="Times New Roman" w:hAnsi="Times New Roman" w:cs="Times New Roman"/>
+          <w:b/>
+          <w:i/>
+          <w:sz w:val="17"/>
+        </w:rPr>
+        <w:t>Figura 5.14: Mockup — Consulta y Gestión de Saldo Disponible del Cliente (RF-037)</w:t>
+      </w:r>
+    </w:p>
+    <w:p>
+      <w:pPr>
+        <w:spacing w:before="160" w:after="40" w:line="253" w:lineRule="auto"/>
         <w:rPr>
           <w:rFonts w:ascii="Times New Roman" w:hAnsi="Times New Roman" w:cs="Times New Roman"/>
           <w:b/>
@@ -4213,7 +4844,7 @@
     </w:p>
     <w:p>
       <w:pPr>
-        <w:spacing w:before="220" w:after="60" w:line="299" w:lineRule="auto"/>
+        <w:spacing w:before="240" w:after="60" w:line="299" w:lineRule="auto"/>
         <w:rPr>
           <w:rFonts w:ascii="Times New Roman" w:hAnsi="Times New Roman" w:cs="Times New Roman"/>
           <w:b/>
@@ -4314,7 +4945,7 @@
     </w:p>
     <w:p>
       <w:pPr>
-        <w:spacing w:before="220" w:after="60" w:line="299" w:lineRule="auto"/>
+        <w:spacing w:before="240" w:after="60" w:line="299" w:lineRule="auto"/>
         <w:rPr>
           <w:rFonts w:ascii="Times New Roman" w:hAnsi="Times New Roman" w:cs="Times New Roman"/>
           <w:b/>
@@ -4366,7 +4997,7 @@
     </w:p>
     <w:p>
       <w:pPr>
-        <w:spacing w:before="220" w:after="60" w:line="299" w:lineRule="auto"/>
+        <w:spacing w:before="240" w:after="60" w:line="299" w:lineRule="auto"/>
         <w:rPr>
           <w:rFonts w:ascii="Times New Roman" w:hAnsi="Times New Roman" w:cs="Times New Roman"/>
           <w:b/>
@@ -4379,7 +5010,7 @@
           <w:b/>
           <w:sz w:val="26"/>
         </w:rPr>
-        <w:t>8. Guía de Respuestas para la Sustentación (Demo Day)</w:t>
+        <w:t>8. Respuestas para la Sustentación</w:t>
       </w:r>
     </w:p>
     <w:p>
@@ -4592,12 +5223,12 @@
       </w:pPr>
     </w:p>
     <w:sectPr>
-      <w:headerReference w:type="even" r:id="rId13"/>
-      <w:headerReference w:type="default" r:id="rId14"/>
-      <w:footerReference w:type="even" r:id="rId15"/>
-      <w:footerReference w:type="default" r:id="rId16"/>
-      <w:headerReference w:type="first" r:id="rId17"/>
-      <w:footerReference w:type="first" r:id="rId18"/>
+      <w:headerReference w:type="even" r:id="rId21"/>
+      <w:headerReference w:type="default" r:id="rId22"/>
+      <w:footerReference w:type="even" r:id="rId23"/>
+      <w:footerReference w:type="default" r:id="rId24"/>
+      <w:headerReference w:type="first" r:id="rId25"/>
+      <w:footerReference w:type="first" r:id="rId26"/>
       <w:pgSz w:w="12240" w:h="15840"/>
       <w:pgMar w:top="1080" w:right="1080" w:bottom="1080" w:left="1080" w:header="560" w:footer="560" w:gutter="0"/>
       <w:cols w:space="708"/>
@@ -5209,7 +5840,7 @@
     <w:link w:val="EncabezadoCar"/>
     <w:uiPriority w:val="99"/>
     <w:unhideWhenUsed/>
-    <w:rsid w:val="007D6F86"/>
+    <w:rsid w:val="00D919ED"/>
     <w:pPr>
       <w:tabs>
         <w:tab w:val="center" w:pos="4419"/>
@@ -5223,7 +5854,7 @@
     <w:basedOn w:val="Fuentedeprrafopredeter"/>
     <w:link w:val="Encabezado"/>
     <w:uiPriority w:val="99"/>
-    <w:rsid w:val="007D6F86"/>
+    <w:rsid w:val="00D919ED"/>
   </w:style>
   <w:style w:type="paragraph" w:styleId="Piedepgina">
     <w:name w:val="footer"/>
@@ -5231,7 +5862,7 @@
     <w:link w:val="PiedepginaCar"/>
     <w:uiPriority w:val="99"/>
     <w:unhideWhenUsed/>
-    <w:rsid w:val="007D6F86"/>
+    <w:rsid w:val="00D919ED"/>
     <w:pPr>
       <w:tabs>
         <w:tab w:val="center" w:pos="4419"/>
@@ -5245,7 +5876,7 @@
     <w:basedOn w:val="Fuentedeprrafopredeter"/>
     <w:link w:val="Piedepgina"/>
     <w:uiPriority w:val="99"/>
-    <w:rsid w:val="007D6F86"/>
+    <w:rsid w:val="00D919ED"/>
   </w:style>
 </w:styles>
 </file>

</xml_diff>

<commit_message>
fix: alineacion exhaustiva de los 16 Casos de Uso con el diagrama general y citacion del repositorio GitHub en la PoC
</commit_message>
<xml_diff>
--- a/docs/IS873_Nota1_Definicion_del_Proyecto_Consolidado.docx
+++ b/docs/IS873_Nota1_Definicion_del_Proyecto_Consolidado.docx
@@ -176,7 +176,7 @@
                 <w:i/>
                 <w:sz w:val="18"/>
               </w:rPr>
-              <w:t>Asignatura / Ponderación</w:t>
+              <w:t>Asignatura</w:t>
             </w:r>
           </w:p>
         </w:tc>
@@ -204,7 +204,7 @@
                 <w:i/>
                 <w:sz w:val="18"/>
               </w:rPr>
-              <w:t>IS873 – Laboratorio de Software (30% de la nota final)</w:t>
+              <w:t>IS873 – Laboratorio de Software</w:t>
             </w:r>
           </w:p>
         </w:tc>
@@ -246,7 +246,7 @@
                 <w:i/>
                 <w:sz w:val="18"/>
               </w:rPr>
-              <w:t>Modalidad / Fecha Sustentación</w:t>
+              <w:t>Modalidad</w:t>
             </w:r>
           </w:p>
         </w:tc>
@@ -274,7 +274,7 @@
                 <w:i/>
                 <w:sz w:val="18"/>
               </w:rPr>
-              <w:t>Sprint 0 / Demo Day de Validación (13 y 15 de octubre de 2026)</w:t>
+              <w:t>Sprint 0 / Demo Day de Validación</w:t>
             </w:r>
           </w:p>
         </w:tc>
@@ -2082,7 +2082,7 @@
           <w:rFonts w:ascii="Times New Roman" w:hAnsi="Times New Roman" w:cs="Times New Roman"/>
           <w:sz w:val="19"/>
         </w:rPr>
-        <w:t>Soportar al menos 300 usuarios concurrentes sin degradación del servicio.</w:t>
+        <w:t>Soportar al menos 200 usuarios concurrentes sin degradación del servicio.</w:t>
       </w:r>
     </w:p>
     <w:p>
@@ -2445,7 +2445,7 @@
           <w:rFonts w:ascii="Times New Roman" w:hAnsi="Times New Roman" w:cs="Times New Roman"/>
           <w:sz w:val="20"/>
         </w:rPr>
-        <w:t>Se seleccionó el framework de Casos de Uso + MoSCoW porque modela con precisión los contratos de interacción y políticas de seguridad de 4 roles dispares, vincula de forma transparente las 34 entidades de base de datos normalizadas y proporciona una categorización binaria e innegociable ante el comité de inversón para salvaguardar el alcance del semestre.</w:t>
+        <w:t>Se seleccionó el framework de Casos de Uso + MoSCoW porque modela con precisión los contratos de interacción y políticas de seguridad de 4 roles dispares, vincula de forma transparente las 34 entidades de base de datos normalizadas y proporciona una categorización binaria e innegociable ante el comité de inversión para salvaguardar el alcance del semestre.</w:t>
       </w:r>
     </w:p>
     <w:p>
@@ -2463,7 +2463,7 @@
           <w:b/>
           <w:sz w:val="26"/>
         </w:rPr>
-        <w:t>3. Casos de Uso Críticos (Metodología Cockburn)</w:t>
+        <w:t>3. Casos de Uso Críticos (Metodología Cockburn) y Mapeo Completo</w:t>
       </w:r>
     </w:p>
     <w:p>
@@ -2496,7 +2496,7 @@
           <w:rFonts w:ascii="Times New Roman" w:hAnsi="Times New Roman" w:cs="Times New Roman"/>
           <w:sz w:val="20"/>
         </w:rPr>
-        <w:t>A continuación se presenta el diagrama general de casos de uso del sistema. Para garantizar absoluta legibilidad y prevenir interpretaciones ambiguas ante el comité, cada actor y sus líneas de asociación cuentan con una convención cromática exclusiva:</w:t>
+        <w:t>A continuación se presenta el diagrama general de casos de uso del sistema estructurado en dos columnas maestras (Núcleo Transaccional y Logística/Servicios). Para garantizar absoluta legibilidad y prevenir interpretaciones ambiguas ante el comité, cada actor y sus líneas de asociación cuentan con una convención cromática diferenciada:</w:t>
       </w:r>
     </w:p>
     <w:p>
@@ -2529,7 +2529,7 @@
           <w:rFonts w:ascii="Times New Roman" w:hAnsi="Times New Roman" w:cs="Times New Roman"/>
           <w:sz w:val="19"/>
         </w:rPr>
-        <w:t>Módulos públicos de exploración de catálogo y registro de cuenta.</w:t>
+        <w:t>Módulos públicos de exploración de catálogo (CU-10) y registro inicial de cuenta (CU-05).</w:t>
       </w:r>
     </w:p>
     <w:p>
@@ -2562,7 +2562,7 @@
           <w:rFonts w:ascii="Times New Roman" w:hAnsi="Times New Roman" w:cs="Times New Roman"/>
           <w:sz w:val="19"/>
         </w:rPr>
-        <w:t>Flujos de compra, reserva de 24h, carrito, cancelación, seguimiento de envío y garantías.</w:t>
+        <w:t>Flujos de reserva de 24h (CU-02), compra/checkout (CU-03), cancelaciones (CU-15), búsqueda (CU-10), perfil (CU-09), envíos (CU-12), retiro en tienda (CU-13), garantías (CU-04), soporte (CU-07) y recomendaciones (CU-14).</w:t>
       </w:r>
     </w:p>
     <w:p>
@@ -2595,7 +2595,7 @@
           <w:rFonts w:ascii="Times New Roman" w:hAnsi="Times New Roman" w:cs="Times New Roman"/>
           <w:sz w:val="19"/>
         </w:rPr>
-        <w:t>Gestión granular de libros, control de inventario físico y atención de soporte.</w:t>
+        <w:t>Gestión granular de libros y ejemplares (CU-01), control de existencias y bajas (CU-11) y mesa de ayuda/soporte (CU-07).</w:t>
       </w:r>
     </w:p>
     <w:p>
@@ -2628,7 +2628,7 @@
           <w:rFonts w:ascii="Times New Roman" w:hAnsi="Times New Roman" w:cs="Times New Roman"/>
           <w:sz w:val="19"/>
         </w:rPr>
-        <w:t>Administración de cuentas del personal y auditoría de la plataforma.</w:t>
+        <w:t>Aprovisionamiento seguro y creación de administradores de la plataforma (CU-08).</w:t>
       </w:r>
     </w:p>
     <w:p>
@@ -2661,7 +2661,7 @@
           <w:rFonts w:ascii="Times New Roman" w:hAnsi="Times New Roman" w:cs="Times New Roman"/>
           <w:sz w:val="19"/>
         </w:rPr>
-        <w:t>Procesos automatizados de liberación de reservas vencidas y despacho de bonos.</w:t>
+        <w:t>Procesos automatizados en segundo plano para liberación de reservas vencidas (CU-16) y despacho diario de bonos de cumpleaños (CU-06).</w:t>
       </w:r>
     </w:p>
     <w:p>
@@ -2681,9 +2681,9 @@
           <w:sz w:val="19"/>
         </w:rPr>
         <w:drawing>
-          <wp:inline distT="0" distB="0" distL="0" distR="0" wp14:anchorId="12D3C82C" wp14:editId="7A1D9D9F">
-            <wp:extent cx="4191000" cy="10738505"/>
-            <wp:effectExtent l="0" t="0" r="0" b="5715"/>
+          <wp:inline distT="0" distB="0" distL="0" distR="0" wp14:anchorId="05C31DAE" wp14:editId="7EE00081">
+            <wp:extent cx="5334000" cy="13667187"/>
+            <wp:effectExtent l="0" t="0" r="0" b="0"/>
             <wp:docPr id="1" name="Imagen 1"/>
             <wp:cNvGraphicFramePr/>
             <a:graphic xmlns:a="http://schemas.openxmlformats.org/drawingml/2006/main">
@@ -2708,7 +2708,7 @@
                   <pic:spPr>
                     <a:xfrm>
                       <a:off x="0" y="0"/>
-                      <a:ext cx="4191000" cy="10738505"/>
+                      <a:ext cx="5334000" cy="13667187"/>
                     </a:xfrm>
                     <a:prstGeom prst="rect">
                       <a:avLst/>
@@ -2756,7 +2756,7 @@
           <w:rFonts w:ascii="Times New Roman" w:hAnsi="Times New Roman" w:cs="Times New Roman"/>
           <w:b/>
         </w:rPr>
-        <w:t>3.2 CU-01: Comprar Libro (Checkout Transaccional)</w:t>
+        <w:t>3.2 Casos de Uso Críticos Desarrollados a los Tres Niveles de Cockburn</w:t>
       </w:r>
     </w:p>
     <w:p>
@@ -2773,7 +2773,631 @@
           <w:rFonts w:ascii="Times New Roman" w:hAnsi="Times New Roman" w:cs="Times New Roman"/>
           <w:sz w:val="20"/>
         </w:rPr>
-        <w:t>• Resumen: Compra integral de libros agregados al carrito con deducción en tiempo real y pago seguro tokenizado.</w:t>
+        <w:t>De conformidad con la metodología Cockburn, se documentan exhaustivamente a tres niveles de abstracción (Resumen/Objetivo, Nivel de Usuario con flujos principales y alternos/excepción, y Nivel de Subfunción atómica) los cuatro casos de uso que constituyen la columna vertebral transaccional y el mayor riesgo del negocio:</w:t>
+      </w:r>
+    </w:p>
+    <w:p>
+      <w:pPr>
+        <w:spacing w:before="120" w:after="40" w:line="230" w:lineRule="auto"/>
+        <w:rPr>
+          <w:rFonts w:ascii="Times New Roman" w:hAnsi="Times New Roman" w:cs="Times New Roman"/>
+          <w:b/>
+          <w:i/>
+          <w:sz w:val="20"/>
+        </w:rPr>
+      </w:pPr>
+      <w:r>
+        <w:rPr>
+          <w:rFonts w:ascii="Times New Roman" w:hAnsi="Times New Roman" w:cs="Times New Roman"/>
+          <w:b/>
+          <w:i/>
+          <w:sz w:val="20"/>
+        </w:rPr>
+        <w:t>3.2.1 CU-01: Registrar Libro y Ejemplar (Actor: Administrador)</w:t>
+      </w:r>
+    </w:p>
+    <w:p>
+      <w:pPr>
+        <w:spacing w:after="40" w:line="213" w:lineRule="auto"/>
+        <w:ind w:left="360" w:hanging="240"/>
+        <w:jc w:val="both"/>
+        <w:rPr>
+          <w:rFonts w:ascii="Times New Roman" w:hAnsi="Times New Roman" w:cs="Times New Roman"/>
+          <w:sz w:val="19"/>
+        </w:rPr>
+      </w:pPr>
+      <w:r>
+        <w:rPr>
+          <w:rFonts w:ascii="Times New Roman" w:hAnsi="Times New Roman" w:cs="Times New Roman"/>
+          <w:sz w:val="19"/>
+        </w:rPr>
+        <w:t xml:space="preserve">• </w:t>
+      </w:r>
+      <w:r>
+        <w:rPr>
+          <w:rFonts w:ascii="Times New Roman" w:hAnsi="Times New Roman" w:cs="Times New Roman"/>
+          <w:b/>
+          <w:sz w:val="19"/>
+        </w:rPr>
+        <w:t xml:space="preserve">Nivel de Resumen: </w:t>
+      </w:r>
+      <w:r>
+        <w:rPr>
+          <w:rFonts w:ascii="Times New Roman" w:hAnsi="Times New Roman" w:cs="Times New Roman"/>
+          <w:sz w:val="19"/>
+        </w:rPr>
+        <w:t>Catalogación de obras bibliográficas e inserción granular de ejemplares físicos individuales con código identificador único e irrepetible para control de stock físico en bodega.</w:t>
+      </w:r>
+    </w:p>
+    <w:p>
+      <w:pPr>
+        <w:spacing w:after="40" w:line="213" w:lineRule="auto"/>
+        <w:ind w:left="360" w:hanging="240"/>
+        <w:jc w:val="both"/>
+        <w:rPr>
+          <w:rFonts w:ascii="Times New Roman" w:hAnsi="Times New Roman" w:cs="Times New Roman"/>
+          <w:sz w:val="19"/>
+        </w:rPr>
+      </w:pPr>
+      <w:r>
+        <w:rPr>
+          <w:rFonts w:ascii="Times New Roman" w:hAnsi="Times New Roman" w:cs="Times New Roman"/>
+          <w:sz w:val="19"/>
+        </w:rPr>
+        <w:t xml:space="preserve">• </w:t>
+      </w:r>
+      <w:r>
+        <w:rPr>
+          <w:rFonts w:ascii="Times New Roman" w:hAnsi="Times New Roman" w:cs="Times New Roman"/>
+          <w:b/>
+          <w:sz w:val="19"/>
+        </w:rPr>
+        <w:t xml:space="preserve">Nivel de Usuario (Flujo Principal): </w:t>
+      </w:r>
+      <w:r>
+        <w:rPr>
+          <w:rFonts w:ascii="Times New Roman" w:hAnsi="Times New Roman" w:cs="Times New Roman"/>
+          <w:sz w:val="19"/>
+        </w:rPr>
+        <w:t>El Administrador ingresa los metadatos bibliográficos (ISBN, título, autor, editorial, categoría, precio de venta) y define la cantidad inicial de ejemplares recibidos. El sistema valida la unicidad de datos y genera en un único paso el registro maestro y los N ejemplares físicos hijos.</w:t>
+      </w:r>
+    </w:p>
+    <w:p>
+      <w:pPr>
+        <w:spacing w:after="40" w:line="213" w:lineRule="auto"/>
+        <w:ind w:left="360" w:hanging="240"/>
+        <w:jc w:val="both"/>
+        <w:rPr>
+          <w:rFonts w:ascii="Times New Roman" w:hAnsi="Times New Roman" w:cs="Times New Roman"/>
+          <w:sz w:val="19"/>
+        </w:rPr>
+      </w:pPr>
+      <w:r>
+        <w:rPr>
+          <w:rFonts w:ascii="Times New Roman" w:hAnsi="Times New Roman" w:cs="Times New Roman"/>
+          <w:sz w:val="19"/>
+        </w:rPr>
+        <w:t xml:space="preserve">• </w:t>
+      </w:r>
+      <w:r>
+        <w:rPr>
+          <w:rFonts w:ascii="Times New Roman" w:hAnsi="Times New Roman" w:cs="Times New Roman"/>
+          <w:b/>
+          <w:sz w:val="19"/>
+        </w:rPr>
+        <w:t xml:space="preserve">Flujo Alterno / Excepción: </w:t>
+      </w:r>
+      <w:r>
+        <w:rPr>
+          <w:rFonts w:ascii="Times New Roman" w:hAnsi="Times New Roman" w:cs="Times New Roman"/>
+          <w:sz w:val="19"/>
+        </w:rPr>
+        <w:t>Si el ISBN ya existe en el catálogo, el sistema notifica al administrador y ofrece la opción de anexar únicamente nuevos ejemplares físicos a la ficha existente sin duplicar la información bibliográfica general.</w:t>
+      </w:r>
+    </w:p>
+    <w:p>
+      <w:pPr>
+        <w:spacing w:after="40" w:line="213" w:lineRule="auto"/>
+        <w:ind w:left="360" w:hanging="240"/>
+        <w:jc w:val="both"/>
+        <w:rPr>
+          <w:rFonts w:ascii="Times New Roman" w:hAnsi="Times New Roman" w:cs="Times New Roman"/>
+          <w:sz w:val="19"/>
+        </w:rPr>
+      </w:pPr>
+      <w:r>
+        <w:rPr>
+          <w:rFonts w:ascii="Times New Roman" w:hAnsi="Times New Roman" w:cs="Times New Roman"/>
+          <w:sz w:val="19"/>
+        </w:rPr>
+        <w:t xml:space="preserve">• </w:t>
+      </w:r>
+      <w:r>
+        <w:rPr>
+          <w:rFonts w:ascii="Times New Roman" w:hAnsi="Times New Roman" w:cs="Times New Roman"/>
+          <w:b/>
+          <w:sz w:val="19"/>
+        </w:rPr>
+        <w:t xml:space="preserve">Nivel de Subfunción (SF-01): </w:t>
+      </w:r>
+      <w:r>
+        <w:rPr>
+          <w:rFonts w:ascii="Times New Roman" w:hAnsi="Times New Roman" w:cs="Times New Roman"/>
+          <w:sz w:val="19"/>
+        </w:rPr>
+        <w:t>Operación atómica que ejecuta un INSERT en la tabla LIBRO y ejecuta en bucle transaccional la creación de registros en EJEMPLAR asignando UUID/código de barras único, fecha de ingreso y estado inicial 'DISPONIBLE' bajo aislamiento ACID.</w:t>
+      </w:r>
+    </w:p>
+    <w:p>
+      <w:pPr>
+        <w:spacing w:before="120" w:after="40" w:line="230" w:lineRule="auto"/>
+        <w:rPr>
+          <w:rFonts w:ascii="Times New Roman" w:hAnsi="Times New Roman" w:cs="Times New Roman"/>
+          <w:b/>
+          <w:i/>
+          <w:sz w:val="20"/>
+        </w:rPr>
+      </w:pPr>
+      <w:r>
+        <w:rPr>
+          <w:rFonts w:ascii="Times New Roman" w:hAnsi="Times New Roman" w:cs="Times New Roman"/>
+          <w:b/>
+          <w:i/>
+          <w:sz w:val="20"/>
+        </w:rPr>
+        <w:t>3.2.2 CU-02: Reservar Libro (24h) (Actor: Cliente)</w:t>
+      </w:r>
+    </w:p>
+    <w:p>
+      <w:pPr>
+        <w:spacing w:after="40" w:line="213" w:lineRule="auto"/>
+        <w:ind w:left="360" w:hanging="240"/>
+        <w:jc w:val="both"/>
+        <w:rPr>
+          <w:rFonts w:ascii="Times New Roman" w:hAnsi="Times New Roman" w:cs="Times New Roman"/>
+          <w:sz w:val="19"/>
+        </w:rPr>
+      </w:pPr>
+      <w:r>
+        <w:rPr>
+          <w:rFonts w:ascii="Times New Roman" w:hAnsi="Times New Roman" w:cs="Times New Roman"/>
+          <w:sz w:val="19"/>
+        </w:rPr>
+        <w:t xml:space="preserve">• </w:t>
+      </w:r>
+      <w:r>
+        <w:rPr>
+          <w:rFonts w:ascii="Times New Roman" w:hAnsi="Times New Roman" w:cs="Times New Roman"/>
+          <w:b/>
+          <w:sz w:val="19"/>
+        </w:rPr>
+        <w:t xml:space="preserve">Nivel de Resumen: </w:t>
+      </w:r>
+      <w:r>
+        <w:rPr>
+          <w:rFonts w:ascii="Times New Roman" w:hAnsi="Times New Roman" w:cs="Times New Roman"/>
+          <w:sz w:val="19"/>
+        </w:rPr>
+        <w:t>Bloqueo temporal de copias físicas por un período perentorio de 24 horas para asegurar exclusividad de compra, protegiendo el inventario contra retenciones indefinidas.</w:t>
+      </w:r>
+    </w:p>
+    <w:p>
+      <w:pPr>
+        <w:spacing w:after="40" w:line="213" w:lineRule="auto"/>
+        <w:ind w:left="360" w:hanging="240"/>
+        <w:jc w:val="both"/>
+        <w:rPr>
+          <w:rFonts w:ascii="Times New Roman" w:hAnsi="Times New Roman" w:cs="Times New Roman"/>
+          <w:sz w:val="19"/>
+        </w:rPr>
+      </w:pPr>
+      <w:r>
+        <w:rPr>
+          <w:rFonts w:ascii="Times New Roman" w:hAnsi="Times New Roman" w:cs="Times New Roman"/>
+          <w:sz w:val="19"/>
+        </w:rPr>
+        <w:t xml:space="preserve">• </w:t>
+      </w:r>
+      <w:r>
+        <w:rPr>
+          <w:rFonts w:ascii="Times New Roman" w:hAnsi="Times New Roman" w:cs="Times New Roman"/>
+          <w:b/>
+          <w:sz w:val="19"/>
+        </w:rPr>
+        <w:t xml:space="preserve">Nivel de Usuario (Flujo Principal): </w:t>
+      </w:r>
+      <w:r>
+        <w:rPr>
+          <w:rFonts w:ascii="Times New Roman" w:hAnsi="Times New Roman" w:cs="Times New Roman"/>
+          <w:sz w:val="19"/>
+        </w:rPr>
+        <w:t>El Cliente autenticado consulta un título con existencias, selecciona 'Reservar' y el sistema valida las políticas de cuota (máximo 5 libros diferentes y hasta 3 ejemplares por título). Al confirmar, genera la reserva activa y activa un temporizador regresivo de 24 horas.</w:t>
+      </w:r>
+    </w:p>
+    <w:p>
+      <w:pPr>
+        <w:spacing w:after="40" w:line="213" w:lineRule="auto"/>
+        <w:ind w:left="360" w:hanging="240"/>
+        <w:jc w:val="both"/>
+        <w:rPr>
+          <w:rFonts w:ascii="Times New Roman" w:hAnsi="Times New Roman" w:cs="Times New Roman"/>
+          <w:sz w:val="19"/>
+        </w:rPr>
+      </w:pPr>
+      <w:r>
+        <w:rPr>
+          <w:rFonts w:ascii="Times New Roman" w:hAnsi="Times New Roman" w:cs="Times New Roman"/>
+          <w:sz w:val="19"/>
+        </w:rPr>
+        <w:t xml:space="preserve">• </w:t>
+      </w:r>
+      <w:r>
+        <w:rPr>
+          <w:rFonts w:ascii="Times New Roman" w:hAnsi="Times New Roman" w:cs="Times New Roman"/>
+          <w:b/>
+          <w:sz w:val="19"/>
+        </w:rPr>
+        <w:t xml:space="preserve">Flujo de Excepción: </w:t>
+      </w:r>
+      <w:r>
+        <w:rPr>
+          <w:rFonts w:ascii="Times New Roman" w:hAnsi="Times New Roman" w:cs="Times New Roman"/>
+          <w:sz w:val="19"/>
+        </w:rPr>
+        <w:t>Si las unidades disponibles se agotan o el cliente excede su límite de 5 reservas activas, el sistema bloquea la transacción con notificación explícita de error sin alterar el stock.</w:t>
+      </w:r>
+    </w:p>
+    <w:p>
+      <w:pPr>
+        <w:spacing w:after="40" w:line="213" w:lineRule="auto"/>
+        <w:ind w:left="360" w:hanging="240"/>
+        <w:jc w:val="both"/>
+        <w:rPr>
+          <w:rFonts w:ascii="Times New Roman" w:hAnsi="Times New Roman" w:cs="Times New Roman"/>
+          <w:sz w:val="19"/>
+        </w:rPr>
+      </w:pPr>
+      <w:r>
+        <w:rPr>
+          <w:rFonts w:ascii="Times New Roman" w:hAnsi="Times New Roman" w:cs="Times New Roman"/>
+          <w:sz w:val="19"/>
+        </w:rPr>
+        <w:t xml:space="preserve">• </w:t>
+      </w:r>
+      <w:r>
+        <w:rPr>
+          <w:rFonts w:ascii="Times New Roman" w:hAnsi="Times New Roman" w:cs="Times New Roman"/>
+          <w:b/>
+          <w:sz w:val="19"/>
+        </w:rPr>
+        <w:t xml:space="preserve">Nivel de Subfunción (SF-02): </w:t>
+      </w:r>
+      <w:r>
+        <w:rPr>
+          <w:rFonts w:ascii="Times New Roman" w:hAnsi="Times New Roman" w:cs="Times New Roman"/>
+          <w:sz w:val="19"/>
+        </w:rPr>
+        <w:t>Bloqueo pesimista de fila (SELECT ... FOR UPDATE) sobre la tabla EJEMPLAR, verificación de estado 'DISPONIBLE', transición a 'RESERVADO', e inserción en la tabla RESERVA con expira_en = NOW() + INTERVAL '24 HOURS'.</w:t>
+      </w:r>
+    </w:p>
+    <w:p>
+      <w:pPr>
+        <w:spacing w:before="120" w:after="40" w:line="230" w:lineRule="auto"/>
+        <w:rPr>
+          <w:rFonts w:ascii="Times New Roman" w:hAnsi="Times New Roman" w:cs="Times New Roman"/>
+          <w:b/>
+          <w:i/>
+          <w:sz w:val="20"/>
+        </w:rPr>
+      </w:pPr>
+      <w:r>
+        <w:rPr>
+          <w:rFonts w:ascii="Times New Roman" w:hAnsi="Times New Roman" w:cs="Times New Roman"/>
+          <w:b/>
+          <w:i/>
+          <w:sz w:val="20"/>
+        </w:rPr>
+        <w:t>3.2.3 CU-03: Comprar Libro / Checkout (Actor: Cliente)</w:t>
+      </w:r>
+    </w:p>
+    <w:p>
+      <w:pPr>
+        <w:spacing w:after="40" w:line="213" w:lineRule="auto"/>
+        <w:ind w:left="360" w:hanging="240"/>
+        <w:jc w:val="both"/>
+        <w:rPr>
+          <w:rFonts w:ascii="Times New Roman" w:hAnsi="Times New Roman" w:cs="Times New Roman"/>
+          <w:sz w:val="19"/>
+        </w:rPr>
+      </w:pPr>
+      <w:r>
+        <w:rPr>
+          <w:rFonts w:ascii="Times New Roman" w:hAnsi="Times New Roman" w:cs="Times New Roman"/>
+          <w:sz w:val="19"/>
+        </w:rPr>
+        <w:t xml:space="preserve">• </w:t>
+      </w:r>
+      <w:r>
+        <w:rPr>
+          <w:rFonts w:ascii="Times New Roman" w:hAnsi="Times New Roman" w:cs="Times New Roman"/>
+          <w:b/>
+          <w:sz w:val="19"/>
+        </w:rPr>
+        <w:t xml:space="preserve">Nivel de Resumen: </w:t>
+      </w:r>
+      <w:r>
+        <w:rPr>
+          <w:rFonts w:ascii="Times New Roman" w:hAnsi="Times New Roman" w:cs="Times New Roman"/>
+          <w:sz w:val="19"/>
+        </w:rPr>
+        <w:t>Perfeccionamiento transaccional de los ítems del carrito de compras, liquidación de pago seguro y deducción definitiva del inventario físico.</w:t>
+      </w:r>
+    </w:p>
+    <w:p>
+      <w:pPr>
+        <w:spacing w:after="40" w:line="213" w:lineRule="auto"/>
+        <w:ind w:left="360" w:hanging="240"/>
+        <w:jc w:val="both"/>
+        <w:rPr>
+          <w:rFonts w:ascii="Times New Roman" w:hAnsi="Times New Roman" w:cs="Times New Roman"/>
+          <w:sz w:val="19"/>
+        </w:rPr>
+      </w:pPr>
+      <w:r>
+        <w:rPr>
+          <w:rFonts w:ascii="Times New Roman" w:hAnsi="Times New Roman" w:cs="Times New Roman"/>
+          <w:sz w:val="19"/>
+        </w:rPr>
+        <w:t xml:space="preserve">• </w:t>
+      </w:r>
+      <w:r>
+        <w:rPr>
+          <w:rFonts w:ascii="Times New Roman" w:hAnsi="Times New Roman" w:cs="Times New Roman"/>
+          <w:b/>
+          <w:sz w:val="19"/>
+        </w:rPr>
+        <w:t xml:space="preserve">Nivel de Usuario (Flujo Principal): </w:t>
+      </w:r>
+      <w:r>
+        <w:rPr>
+          <w:rFonts w:ascii="Times New Roman" w:hAnsi="Times New Roman" w:cs="Times New Roman"/>
+          <w:sz w:val="19"/>
+        </w:rPr>
+        <w:t>El Cliente accede al carrito, valida cantidades y montos, selecciona modalidad de entrega (domicilio o recogida en tienda) y define el medio de pago (saldo en monedero o tarjeta tokenizada). El sistema procesa el cobro, descuenta los fondos y emite el comprobante de venta.</w:t>
+      </w:r>
+    </w:p>
+    <w:p>
+      <w:pPr>
+        <w:spacing w:after="40" w:line="213" w:lineRule="auto"/>
+        <w:ind w:left="360" w:hanging="240"/>
+        <w:jc w:val="both"/>
+        <w:rPr>
+          <w:rFonts w:ascii="Times New Roman" w:hAnsi="Times New Roman" w:cs="Times New Roman"/>
+          <w:sz w:val="19"/>
+        </w:rPr>
+      </w:pPr>
+      <w:r>
+        <w:rPr>
+          <w:rFonts w:ascii="Times New Roman" w:hAnsi="Times New Roman" w:cs="Times New Roman"/>
+          <w:sz w:val="19"/>
+        </w:rPr>
+        <w:t xml:space="preserve">• </w:t>
+      </w:r>
+      <w:r>
+        <w:rPr>
+          <w:rFonts w:ascii="Times New Roman" w:hAnsi="Times New Roman" w:cs="Times New Roman"/>
+          <w:b/>
+          <w:sz w:val="19"/>
+        </w:rPr>
+        <w:t xml:space="preserve">Flujo Alterno / Excepción: </w:t>
+      </w:r>
+      <w:r>
+        <w:rPr>
+          <w:rFonts w:ascii="Times New Roman" w:hAnsi="Times New Roman" w:cs="Times New Roman"/>
+          <w:sz w:val="19"/>
+        </w:rPr>
+        <w:t>Si la pasarela financiera rechaza el token bancario o el saldo es insuficiente, se aborta la operación, se ejecuta rollback automático del stock y se alerta al cliente sin retención indebida de ejemplares.</w:t>
+      </w:r>
+    </w:p>
+    <w:p>
+      <w:pPr>
+        <w:spacing w:after="40" w:line="213" w:lineRule="auto"/>
+        <w:ind w:left="360" w:hanging="240"/>
+        <w:jc w:val="both"/>
+        <w:rPr>
+          <w:rFonts w:ascii="Times New Roman" w:hAnsi="Times New Roman" w:cs="Times New Roman"/>
+          <w:sz w:val="19"/>
+        </w:rPr>
+      </w:pPr>
+      <w:r>
+        <w:rPr>
+          <w:rFonts w:ascii="Times New Roman" w:hAnsi="Times New Roman" w:cs="Times New Roman"/>
+          <w:sz w:val="19"/>
+        </w:rPr>
+        <w:t xml:space="preserve">• </w:t>
+      </w:r>
+      <w:r>
+        <w:rPr>
+          <w:rFonts w:ascii="Times New Roman" w:hAnsi="Times New Roman" w:cs="Times New Roman"/>
+          <w:b/>
+          <w:sz w:val="19"/>
+        </w:rPr>
+        <w:t xml:space="preserve">Nivel de Subfunción (SF-03): </w:t>
+      </w:r>
+      <w:r>
+        <w:rPr>
+          <w:rFonts w:ascii="Times New Roman" w:hAnsi="Times New Roman" w:cs="Times New Roman"/>
+          <w:sz w:val="19"/>
+        </w:rPr>
+        <w:t>Transacción ACID integral que deduce saldo en CLIENTE o procesa token PCI-DSS, marca el EJEMPLAR como 'VENDIDO', genera encabezado en VENTA y detalles en DETALLE_VENTA, y encola la factura digital.</w:t>
+      </w:r>
+    </w:p>
+    <w:p>
+      <w:pPr>
+        <w:spacing w:before="120" w:after="40" w:line="230" w:lineRule="auto"/>
+        <w:rPr>
+          <w:rFonts w:ascii="Times New Roman" w:hAnsi="Times New Roman" w:cs="Times New Roman"/>
+          <w:b/>
+          <w:i/>
+          <w:sz w:val="20"/>
+        </w:rPr>
+      </w:pPr>
+      <w:r>
+        <w:rPr>
+          <w:rFonts w:ascii="Times New Roman" w:hAnsi="Times New Roman" w:cs="Times New Roman"/>
+          <w:b/>
+          <w:i/>
+          <w:sz w:val="20"/>
+        </w:rPr>
+        <w:t>3.2.4 CU-04: Solicitar Devolución (QR) (Actor: Cliente)</w:t>
+      </w:r>
+    </w:p>
+    <w:p>
+      <w:pPr>
+        <w:spacing w:after="40" w:line="213" w:lineRule="auto"/>
+        <w:ind w:left="360" w:hanging="240"/>
+        <w:jc w:val="both"/>
+        <w:rPr>
+          <w:rFonts w:ascii="Times New Roman" w:hAnsi="Times New Roman" w:cs="Times New Roman"/>
+          <w:sz w:val="19"/>
+        </w:rPr>
+      </w:pPr>
+      <w:r>
+        <w:rPr>
+          <w:rFonts w:ascii="Times New Roman" w:hAnsi="Times New Roman" w:cs="Times New Roman"/>
+          <w:sz w:val="19"/>
+        </w:rPr>
+        <w:t xml:space="preserve">• </w:t>
+      </w:r>
+      <w:r>
+        <w:rPr>
+          <w:rFonts w:ascii="Times New Roman" w:hAnsi="Times New Roman" w:cs="Times New Roman"/>
+          <w:b/>
+          <w:sz w:val="19"/>
+        </w:rPr>
+        <w:t xml:space="preserve">Nivel de Resumen: </w:t>
+      </w:r>
+      <w:r>
+        <w:rPr>
+          <w:rFonts w:ascii="Times New Roman" w:hAnsi="Times New Roman" w:cs="Times New Roman"/>
+          <w:sz w:val="19"/>
+        </w:rPr>
+        <w:t>Tramitación de garantías y retorno físico de libros mediante emisión de salvoconducto digital en código QR con caducidad legal estricta de 8 días calendario.</w:t>
+      </w:r>
+    </w:p>
+    <w:p>
+      <w:pPr>
+        <w:spacing w:after="40" w:line="213" w:lineRule="auto"/>
+        <w:ind w:left="360" w:hanging="240"/>
+        <w:jc w:val="both"/>
+        <w:rPr>
+          <w:rFonts w:ascii="Times New Roman" w:hAnsi="Times New Roman" w:cs="Times New Roman"/>
+          <w:sz w:val="19"/>
+        </w:rPr>
+      </w:pPr>
+      <w:r>
+        <w:rPr>
+          <w:rFonts w:ascii="Times New Roman" w:hAnsi="Times New Roman" w:cs="Times New Roman"/>
+          <w:sz w:val="19"/>
+        </w:rPr>
+        <w:t xml:space="preserve">• </w:t>
+      </w:r>
+      <w:r>
+        <w:rPr>
+          <w:rFonts w:ascii="Times New Roman" w:hAnsi="Times New Roman" w:cs="Times New Roman"/>
+          <w:b/>
+          <w:sz w:val="19"/>
+        </w:rPr>
+        <w:t xml:space="preserve">Nivel de Usuario (Flujo Principal): </w:t>
+      </w:r>
+      <w:r>
+        <w:rPr>
+          <w:rFonts w:ascii="Times New Roman" w:hAnsi="Times New Roman" w:cs="Times New Roman"/>
+          <w:sz w:val="19"/>
+        </w:rPr>
+        <w:t>El Cliente consulta compras en estado 'ENTREGADO', selecciona el ejemplar y presiona 'Solicitar Devolución'. Escoge una causa tipificada obligatoria (mal estado, retraso, expectativa), añade observaciones y el sistema emite un código QR firmado digitalmente enviado por correo.</w:t>
+      </w:r>
+    </w:p>
+    <w:p>
+      <w:pPr>
+        <w:spacing w:after="40" w:line="213" w:lineRule="auto"/>
+        <w:ind w:left="360" w:hanging="240"/>
+        <w:jc w:val="both"/>
+        <w:rPr>
+          <w:rFonts w:ascii="Times New Roman" w:hAnsi="Times New Roman" w:cs="Times New Roman"/>
+          <w:sz w:val="19"/>
+        </w:rPr>
+      </w:pPr>
+      <w:r>
+        <w:rPr>
+          <w:rFonts w:ascii="Times New Roman" w:hAnsi="Times New Roman" w:cs="Times New Roman"/>
+          <w:sz w:val="19"/>
+        </w:rPr>
+        <w:t xml:space="preserve">• </w:t>
+      </w:r>
+      <w:r>
+        <w:rPr>
+          <w:rFonts w:ascii="Times New Roman" w:hAnsi="Times New Roman" w:cs="Times New Roman"/>
+          <w:b/>
+          <w:sz w:val="19"/>
+        </w:rPr>
+        <w:t xml:space="preserve">Flujo de Excepción: </w:t>
+      </w:r>
+      <w:r>
+        <w:rPr>
+          <w:rFonts w:ascii="Times New Roman" w:hAnsi="Times New Roman" w:cs="Times New Roman"/>
+          <w:sz w:val="19"/>
+        </w:rPr>
+        <w:t>Si la fecha transcurrida desde la entrega supera los 8 días calendario (fecha_actual - fecha_entrega &gt; 8 días), el sistema bloquea automáticamente la opción amparado en las políticas de la tienda e informa la caducidad del derecho.</w:t>
+      </w:r>
+    </w:p>
+    <w:p>
+      <w:pPr>
+        <w:spacing w:after="40" w:line="213" w:lineRule="auto"/>
+        <w:ind w:left="360" w:hanging="240"/>
+        <w:jc w:val="both"/>
+        <w:rPr>
+          <w:rFonts w:ascii="Times New Roman" w:hAnsi="Times New Roman" w:cs="Times New Roman"/>
+          <w:sz w:val="19"/>
+        </w:rPr>
+      </w:pPr>
+      <w:r>
+        <w:rPr>
+          <w:rFonts w:ascii="Times New Roman" w:hAnsi="Times New Roman" w:cs="Times New Roman"/>
+          <w:sz w:val="19"/>
+        </w:rPr>
+        <w:t xml:space="preserve">• </w:t>
+      </w:r>
+      <w:r>
+        <w:rPr>
+          <w:rFonts w:ascii="Times New Roman" w:hAnsi="Times New Roman" w:cs="Times New Roman"/>
+          <w:b/>
+          <w:sz w:val="19"/>
+        </w:rPr>
+        <w:t xml:space="preserve">Nivel de Subfunción (SF-04): </w:t>
+      </w:r>
+      <w:r>
+        <w:rPr>
+          <w:rFonts w:ascii="Times New Roman" w:hAnsi="Times New Roman" w:cs="Times New Roman"/>
+          <w:sz w:val="19"/>
+        </w:rPr>
+        <w:t>Validación temporal en base de datos, cálculo de firma digital HMAC-SHA256, generación del código QR vectorial en base64/PNG, inserción en DEVOLUCION y despacho asíncrono del comprobante.</w:t>
+      </w:r>
+    </w:p>
+    <w:p>
+      <w:pPr>
+        <w:spacing w:before="160" w:after="40" w:line="253" w:lineRule="auto"/>
+        <w:rPr>
+          <w:rFonts w:ascii="Times New Roman" w:hAnsi="Times New Roman" w:cs="Times New Roman"/>
+          <w:b/>
+        </w:rPr>
+      </w:pPr>
+      <w:r>
+        <w:rPr>
+          <w:rFonts w:ascii="Times New Roman" w:hAnsi="Times New Roman" w:cs="Times New Roman"/>
+          <w:b/>
+        </w:rPr>
+        <w:t>3.3 Especificación de Casos de Uso Complementarios del Sistema</w:t>
       </w:r>
     </w:p>
     <w:p>
@@ -2790,225 +3414,503 @@
           <w:rFonts w:ascii="Times New Roman" w:hAnsi="Times New Roman" w:cs="Times New Roman"/>
           <w:sz w:val="20"/>
         </w:rPr>
-        <w:t>• Usuario: El cliente valida carrito, selecciona entrega (domicilio o tienda) y confirma pago con saldo o tarjeta. Flujo alterno: Si la pasarela rechaza la tarjeta o el saldo es insuficiente, se aplica rollback atómico.</w:t>
-      </w:r>
-    </w:p>
-    <w:p>
-      <w:pPr>
-        <w:spacing w:after="60" w:line="224" w:lineRule="auto"/>
-        <w:jc w:val="both"/>
-        <w:rPr>
-          <w:rFonts w:ascii="Times New Roman" w:hAnsi="Times New Roman" w:cs="Times New Roman"/>
+        <w:t>Para garantizar correspondencia biunívoca con el diagrama general (Figura 3.1), a continuación se especifican los restantes doce casos de uso estructurados por subsistema:</w:t>
+      </w:r>
+    </w:p>
+    <w:p>
+      <w:pPr>
+        <w:spacing w:before="120" w:after="40" w:line="230" w:lineRule="auto"/>
+        <w:rPr>
+          <w:rFonts w:ascii="Times New Roman" w:hAnsi="Times New Roman" w:cs="Times New Roman"/>
+          <w:b/>
+          <w:i/>
           <w:sz w:val="20"/>
         </w:rPr>
       </w:pPr>
       <w:r>
         <w:rPr>
           <w:rFonts w:ascii="Times New Roman" w:hAnsi="Times New Roman" w:cs="Times New Roman"/>
+          <w:b/>
+          <w:i/>
           <w:sz w:val="20"/>
         </w:rPr>
-        <w:t>• Subfunción SF-01: Bloqueo de fila (SELECT FOR UPDATE) sobre EJEMPLAR, cambio a estado 'VENDIDO' y confirmación de transacción.</w:t>
-      </w:r>
-    </w:p>
-    <w:p>
-      <w:pPr>
-        <w:spacing w:before="160" w:after="40" w:line="253" w:lineRule="auto"/>
-        <w:rPr>
-          <w:rFonts w:ascii="Times New Roman" w:hAnsi="Times New Roman" w:cs="Times New Roman"/>
-          <w:b/>
-        </w:rPr>
-      </w:pPr>
-      <w:r>
-        <w:rPr>
-          <w:rFonts w:ascii="Times New Roman" w:hAnsi="Times New Roman" w:cs="Times New Roman"/>
-          <w:b/>
-        </w:rPr>
-        <w:t>3.3 CU-02: Reservar Libro y Liberación Automática a las 24 Horas</w:t>
-      </w:r>
-    </w:p>
-    <w:p>
-      <w:pPr>
-        <w:spacing w:after="60" w:line="224" w:lineRule="auto"/>
-        <w:jc w:val="both"/>
-        <w:rPr>
-          <w:rFonts w:ascii="Times New Roman" w:hAnsi="Times New Roman" w:cs="Times New Roman"/>
+        <w:t>Módulo de Usuarios y Seguridad</w:t>
+      </w:r>
+    </w:p>
+    <w:p>
+      <w:pPr>
+        <w:spacing w:after="40" w:line="213" w:lineRule="auto"/>
+        <w:ind w:left="360" w:hanging="240"/>
+        <w:jc w:val="both"/>
+        <w:rPr>
+          <w:rFonts w:ascii="Times New Roman" w:hAnsi="Times New Roman" w:cs="Times New Roman"/>
+          <w:sz w:val="19"/>
+        </w:rPr>
+      </w:pPr>
+      <w:r>
+        <w:rPr>
+          <w:rFonts w:ascii="Times New Roman" w:hAnsi="Times New Roman" w:cs="Times New Roman"/>
+          <w:sz w:val="19"/>
+        </w:rPr>
+        <w:t xml:space="preserve">• </w:t>
+      </w:r>
+      <w:r>
+        <w:rPr>
+          <w:rFonts w:ascii="Times New Roman" w:hAnsi="Times New Roman" w:cs="Times New Roman"/>
+          <w:b/>
+          <w:sz w:val="19"/>
+        </w:rPr>
+        <w:t xml:space="preserve">CU-05: Registro de Cliente (Actor: Visitante): </w:t>
+      </w:r>
+      <w:r>
+        <w:rPr>
+          <w:rFonts w:ascii="Times New Roman" w:hAnsi="Times New Roman" w:cs="Times New Roman"/>
+          <w:sz w:val="19"/>
+        </w:rPr>
+        <w:t>El visitante diligencia formulario público con DNI, nombres, correo y contraseña cifrada, consintiendo el tratamiento de datos personales (Ley 1581). Flujo de excepción: Si el DNI o correo ya existen, el sistema rechaza el registro con alerta de duplicidad.</w:t>
+      </w:r>
+    </w:p>
+    <w:p>
+      <w:pPr>
+        <w:spacing w:after="40" w:line="213" w:lineRule="auto"/>
+        <w:ind w:left="360" w:hanging="240"/>
+        <w:jc w:val="both"/>
+        <w:rPr>
+          <w:rFonts w:ascii="Times New Roman" w:hAnsi="Times New Roman" w:cs="Times New Roman"/>
+          <w:sz w:val="19"/>
+        </w:rPr>
+      </w:pPr>
+      <w:r>
+        <w:rPr>
+          <w:rFonts w:ascii="Times New Roman" w:hAnsi="Times New Roman" w:cs="Times New Roman"/>
+          <w:sz w:val="19"/>
+        </w:rPr>
+        <w:t xml:space="preserve">• </w:t>
+      </w:r>
+      <w:r>
+        <w:rPr>
+          <w:rFonts w:ascii="Times New Roman" w:hAnsi="Times New Roman" w:cs="Times New Roman"/>
+          <w:b/>
+          <w:sz w:val="19"/>
+        </w:rPr>
+        <w:t xml:space="preserve">CU-08: Crear Administrador (Actor: Root): </w:t>
+      </w:r>
+      <w:r>
+        <w:rPr>
+          <w:rFonts w:ascii="Times New Roman" w:hAnsi="Times New Roman" w:cs="Times New Roman"/>
+          <w:sz w:val="19"/>
+        </w:rPr>
+        <w:t>El Superadministrador Root autenticado crea credenciales institucionales para personal operativo asignando el rol ADMINISTRADOR bajo estricto registro en bitácora. Excepción: Cualquier intento de invocación por un rol no-root retorna HTTP 403 Forbidden.</w:t>
+      </w:r>
+    </w:p>
+    <w:p>
+      <w:pPr>
+        <w:spacing w:after="40" w:line="213" w:lineRule="auto"/>
+        <w:ind w:left="360" w:hanging="240"/>
+        <w:jc w:val="both"/>
+        <w:rPr>
+          <w:rFonts w:ascii="Times New Roman" w:hAnsi="Times New Roman" w:cs="Times New Roman"/>
+          <w:sz w:val="19"/>
+        </w:rPr>
+      </w:pPr>
+      <w:r>
+        <w:rPr>
+          <w:rFonts w:ascii="Times New Roman" w:hAnsi="Times New Roman" w:cs="Times New Roman"/>
+          <w:sz w:val="19"/>
+        </w:rPr>
+        <w:t xml:space="preserve">• </w:t>
+      </w:r>
+      <w:r>
+        <w:rPr>
+          <w:rFonts w:ascii="Times New Roman" w:hAnsi="Times New Roman" w:cs="Times New Roman"/>
+          <w:b/>
+          <w:sz w:val="19"/>
+        </w:rPr>
+        <w:t xml:space="preserve">CU-09: Editar Perfil / Contraseña (Actor: Cliente): </w:t>
+      </w:r>
+      <w:r>
+        <w:rPr>
+          <w:rFonts w:ascii="Times New Roman" w:hAnsi="Times New Roman" w:cs="Times New Roman"/>
+          <w:sz w:val="19"/>
+        </w:rPr>
+        <w:t>El cliente autenticado actualiza sus datos de contacto, direcciones y clave de acceso, requiriendo validación de contraseña previa y re-hashing seguro con bcrypt.</w:t>
+      </w:r>
+    </w:p>
+    <w:p>
+      <w:pPr>
+        <w:spacing w:before="120" w:after="40" w:line="230" w:lineRule="auto"/>
+        <w:rPr>
+          <w:rFonts w:ascii="Times New Roman" w:hAnsi="Times New Roman" w:cs="Times New Roman"/>
+          <w:b/>
+          <w:i/>
           <w:sz w:val="20"/>
         </w:rPr>
       </w:pPr>
       <w:r>
         <w:rPr>
           <w:rFonts w:ascii="Times New Roman" w:hAnsi="Times New Roman" w:cs="Times New Roman"/>
+          <w:b/>
+          <w:i/>
           <w:sz w:val="20"/>
         </w:rPr>
-        <w:t>• Resumen: Bloqueo temporal de copias físicas por máximo 24h, liberando el stock si no se compra.</w:t>
-      </w:r>
-    </w:p>
-    <w:p>
-      <w:pPr>
-        <w:spacing w:after="60" w:line="224" w:lineRule="auto"/>
-        <w:jc w:val="both"/>
-        <w:rPr>
-          <w:rFonts w:ascii="Times New Roman" w:hAnsi="Times New Roman" w:cs="Times New Roman"/>
+        <w:t>Módulo de Inventario y Catálogo</w:t>
+      </w:r>
+    </w:p>
+    <w:p>
+      <w:pPr>
+        <w:spacing w:after="40" w:line="213" w:lineRule="auto"/>
+        <w:ind w:left="360" w:hanging="240"/>
+        <w:jc w:val="both"/>
+        <w:rPr>
+          <w:rFonts w:ascii="Times New Roman" w:hAnsi="Times New Roman" w:cs="Times New Roman"/>
+          <w:sz w:val="19"/>
+        </w:rPr>
+      </w:pPr>
+      <w:r>
+        <w:rPr>
+          <w:rFonts w:ascii="Times New Roman" w:hAnsi="Times New Roman" w:cs="Times New Roman"/>
+          <w:sz w:val="19"/>
+        </w:rPr>
+        <w:t xml:space="preserve">• </w:t>
+      </w:r>
+      <w:r>
+        <w:rPr>
+          <w:rFonts w:ascii="Times New Roman" w:hAnsi="Times New Roman" w:cs="Times New Roman"/>
+          <w:b/>
+          <w:sz w:val="19"/>
+        </w:rPr>
+        <w:t xml:space="preserve">CU-10: Búsqueda en Catálogo (Actores: Visitante / Cliente): </w:t>
+      </w:r>
+      <w:r>
+        <w:rPr>
+          <w:rFonts w:ascii="Times New Roman" w:hAnsi="Times New Roman" w:cs="Times New Roman"/>
+          <w:sz w:val="19"/>
+        </w:rPr>
+        <w:t>Búsqueda rápida y avanzada por título, autor, género, editorial o precio. Flujo alterno: Si no hay coincidencias exactas, el sistema sugiere obras afines o el ranking de títulos más consultados.</w:t>
+      </w:r>
+    </w:p>
+    <w:p>
+      <w:pPr>
+        <w:spacing w:after="40" w:line="213" w:lineRule="auto"/>
+        <w:ind w:left="360" w:hanging="240"/>
+        <w:jc w:val="both"/>
+        <w:rPr>
+          <w:rFonts w:ascii="Times New Roman" w:hAnsi="Times New Roman" w:cs="Times New Roman"/>
+          <w:sz w:val="19"/>
+        </w:rPr>
+      </w:pPr>
+      <w:r>
+        <w:rPr>
+          <w:rFonts w:ascii="Times New Roman" w:hAnsi="Times New Roman" w:cs="Times New Roman"/>
+          <w:sz w:val="19"/>
+        </w:rPr>
+        <w:t xml:space="preserve">• </w:t>
+      </w:r>
+      <w:r>
+        <w:rPr>
+          <w:rFonts w:ascii="Times New Roman" w:hAnsi="Times New Roman" w:cs="Times New Roman"/>
+          <w:b/>
+          <w:sz w:val="19"/>
+        </w:rPr>
+        <w:t xml:space="preserve">CU-11: Gestionar Existencias y Bajas (Actor: Administrador): </w:t>
+      </w:r>
+      <w:r>
+        <w:rPr>
+          <w:rFonts w:ascii="Times New Roman" w:hAnsi="Times New Roman" w:cs="Times New Roman"/>
+          <w:sz w:val="19"/>
+        </w:rPr>
+        <w:t>Monitoreo del stock físico en bodegas y retiro de ejemplares averiados ('DADO_DE_BAJA'). Flujo alterno: Cuando las existencias de un libro llegan a 0, el sistema lo mueve automáticamente a 'Histórico Agotado' (RF-006).</w:t>
+      </w:r>
+    </w:p>
+    <w:p>
+      <w:pPr>
+        <w:spacing w:before="120" w:after="40" w:line="230" w:lineRule="auto"/>
+        <w:rPr>
+          <w:rFonts w:ascii="Times New Roman" w:hAnsi="Times New Roman" w:cs="Times New Roman"/>
+          <w:b/>
+          <w:i/>
           <w:sz w:val="20"/>
         </w:rPr>
       </w:pPr>
       <w:r>
         <w:rPr>
           <w:rFonts w:ascii="Times New Roman" w:hAnsi="Times New Roman" w:cs="Times New Roman"/>
+          <w:b/>
+          <w:i/>
           <w:sz w:val="20"/>
         </w:rPr>
-        <w:t>• Usuario: Cliente aparta libro (máx. 5 títulos / 3 ejemplares). Flujo de Excepción: El Scheduler (APScheduler) revisa cada 15 min reservas vencidas, expira el registro y regresa el ejemplar a 'DISPONIBLE'.</w:t>
-      </w:r>
-    </w:p>
-    <w:p>
-      <w:pPr>
-        <w:spacing w:after="60" w:line="224" w:lineRule="auto"/>
-        <w:jc w:val="both"/>
-        <w:rPr>
-          <w:rFonts w:ascii="Times New Roman" w:hAnsi="Times New Roman" w:cs="Times New Roman"/>
+        <w:t>Módulo de Compra y Reserva</w:t>
+      </w:r>
+    </w:p>
+    <w:p>
+      <w:pPr>
+        <w:spacing w:after="40" w:line="213" w:lineRule="auto"/>
+        <w:ind w:left="360" w:hanging="240"/>
+        <w:jc w:val="both"/>
+        <w:rPr>
+          <w:rFonts w:ascii="Times New Roman" w:hAnsi="Times New Roman" w:cs="Times New Roman"/>
+          <w:sz w:val="19"/>
+        </w:rPr>
+      </w:pPr>
+      <w:r>
+        <w:rPr>
+          <w:rFonts w:ascii="Times New Roman" w:hAnsi="Times New Roman" w:cs="Times New Roman"/>
+          <w:sz w:val="19"/>
+        </w:rPr>
+        <w:t xml:space="preserve">• </w:t>
+      </w:r>
+      <w:r>
+        <w:rPr>
+          <w:rFonts w:ascii="Times New Roman" w:hAnsi="Times New Roman" w:cs="Times New Roman"/>
+          <w:b/>
+          <w:sz w:val="19"/>
+        </w:rPr>
+        <w:t xml:space="preserve">CU-15: Cancelar Compra o Reserva (Actor: Cliente): </w:t>
+      </w:r>
+      <w:r>
+        <w:rPr>
+          <w:rFonts w:ascii="Times New Roman" w:hAnsi="Times New Roman" w:cs="Times New Roman"/>
+          <w:sz w:val="19"/>
+        </w:rPr>
+        <w:t>El cliente anula una reserva activa o una compra en preparación previa al despacho, reintegrando de inmediato el stock a 'DISPONIBLE' y devolviendo el saldo si aplica. Excepción: Si el pedido ya está 'ENVIADO', se deriva al flujo de devolución.</w:t>
+      </w:r>
+    </w:p>
+    <w:p>
+      <w:pPr>
+        <w:spacing w:after="40" w:line="213" w:lineRule="auto"/>
+        <w:ind w:left="360" w:hanging="240"/>
+        <w:jc w:val="both"/>
+        <w:rPr>
+          <w:rFonts w:ascii="Times New Roman" w:hAnsi="Times New Roman" w:cs="Times New Roman"/>
+          <w:sz w:val="19"/>
+        </w:rPr>
+      </w:pPr>
+      <w:r>
+        <w:rPr>
+          <w:rFonts w:ascii="Times New Roman" w:hAnsi="Times New Roman" w:cs="Times New Roman"/>
+          <w:sz w:val="19"/>
+        </w:rPr>
+        <w:t xml:space="preserve">• </w:t>
+      </w:r>
+      <w:r>
+        <w:rPr>
+          <w:rFonts w:ascii="Times New Roman" w:hAnsi="Times New Roman" w:cs="Times New Roman"/>
+          <w:b/>
+          <w:sz w:val="19"/>
+        </w:rPr>
+        <w:t xml:space="preserve">CU-16: Liberar Reservas Vencidas (Actor: Scheduler): </w:t>
+      </w:r>
+      <w:r>
+        <w:rPr>
+          <w:rFonts w:ascii="Times New Roman" w:hAnsi="Times New Roman" w:cs="Times New Roman"/>
+          <w:sz w:val="19"/>
+        </w:rPr>
+        <w:t>Proceso autónomo programado cada 15 min que detecta reservas con fecha límite cumplida (&gt; 24h), las marca como 'EXPIRADA' y restablece los ejemplares físicos a estado 'DISPONIBLE' sin intervención humana.</w:t>
+      </w:r>
+    </w:p>
+    <w:p>
+      <w:pPr>
+        <w:spacing w:before="120" w:after="40" w:line="230" w:lineRule="auto"/>
+        <w:rPr>
+          <w:rFonts w:ascii="Times New Roman" w:hAnsi="Times New Roman" w:cs="Times New Roman"/>
+          <w:b/>
+          <w:i/>
           <w:sz w:val="20"/>
         </w:rPr>
       </w:pPr>
       <w:r>
         <w:rPr>
           <w:rFonts w:ascii="Times New Roman" w:hAnsi="Times New Roman" w:cs="Times New Roman"/>
+          <w:b/>
+          <w:i/>
           <w:sz w:val="20"/>
         </w:rPr>
-        <w:t>• Subfunción SF-02: Actualización masiva en lote de ejemplares expirados y recálculo de stock.</w:t>
-      </w:r>
-    </w:p>
-    <w:p>
-      <w:pPr>
-        <w:spacing w:before="160" w:after="40" w:line="253" w:lineRule="auto"/>
-        <w:rPr>
-          <w:rFonts w:ascii="Times New Roman" w:hAnsi="Times New Roman" w:cs="Times New Roman"/>
-          <w:b/>
-        </w:rPr>
-      </w:pPr>
-      <w:r>
-        <w:rPr>
-          <w:rFonts w:ascii="Times New Roman" w:hAnsi="Times New Roman" w:cs="Times New Roman"/>
-          <w:b/>
-        </w:rPr>
-        <w:t>3.4 CU-03: Recogida en Tienda Física con Geolocalización (Google Maps)</w:t>
-      </w:r>
-    </w:p>
-    <w:p>
-      <w:pPr>
-        <w:spacing w:after="60" w:line="224" w:lineRule="auto"/>
-        <w:jc w:val="both"/>
-        <w:rPr>
-          <w:rFonts w:ascii="Times New Roman" w:hAnsi="Times New Roman" w:cs="Times New Roman"/>
+        <w:t>Módulo de Logística y Postventa</w:t>
+      </w:r>
+    </w:p>
+    <w:p>
+      <w:pPr>
+        <w:spacing w:after="40" w:line="213" w:lineRule="auto"/>
+        <w:ind w:left="360" w:hanging="240"/>
+        <w:jc w:val="both"/>
+        <w:rPr>
+          <w:rFonts w:ascii="Times New Roman" w:hAnsi="Times New Roman" w:cs="Times New Roman"/>
+          <w:sz w:val="19"/>
+        </w:rPr>
+      </w:pPr>
+      <w:r>
+        <w:rPr>
+          <w:rFonts w:ascii="Times New Roman" w:hAnsi="Times New Roman" w:cs="Times New Roman"/>
+          <w:sz w:val="19"/>
+        </w:rPr>
+        <w:t xml:space="preserve">• </w:t>
+      </w:r>
+      <w:r>
+        <w:rPr>
+          <w:rFonts w:ascii="Times New Roman" w:hAnsi="Times New Roman" w:cs="Times New Roman"/>
+          <w:b/>
+          <w:sz w:val="19"/>
+        </w:rPr>
+        <w:t xml:space="preserve">CU-12: Consultar Estado de Envío (Actor: Cliente): </w:t>
+      </w:r>
+      <w:r>
+        <w:rPr>
+          <w:rFonts w:ascii="Times New Roman" w:hAnsi="Times New Roman" w:cs="Times New Roman"/>
+          <w:sz w:val="19"/>
+        </w:rPr>
+        <w:t>Seguimiento en tiempo real del ciclo de entrega a domicilio: EN PREPARACIÓN, ENVIADO (con empresa transportadora y número de guía) y ENTREGADO.</w:t>
+      </w:r>
+    </w:p>
+    <w:p>
+      <w:pPr>
+        <w:spacing w:after="40" w:line="213" w:lineRule="auto"/>
+        <w:ind w:left="360" w:hanging="240"/>
+        <w:jc w:val="both"/>
+        <w:rPr>
+          <w:rFonts w:ascii="Times New Roman" w:hAnsi="Times New Roman" w:cs="Times New Roman"/>
+          <w:sz w:val="19"/>
+        </w:rPr>
+      </w:pPr>
+      <w:r>
+        <w:rPr>
+          <w:rFonts w:ascii="Times New Roman" w:hAnsi="Times New Roman" w:cs="Times New Roman"/>
+          <w:sz w:val="19"/>
+        </w:rPr>
+        <w:t xml:space="preserve">• </w:t>
+      </w:r>
+      <w:r>
+        <w:rPr>
+          <w:rFonts w:ascii="Times New Roman" w:hAnsi="Times New Roman" w:cs="Times New Roman"/>
+          <w:b/>
+          <w:sz w:val="19"/>
+        </w:rPr>
+        <w:t xml:space="preserve">CU-13: Recogida en Tienda (Maps) (Actor: Cliente): </w:t>
+      </w:r>
+      <w:r>
+        <w:rPr>
+          <w:rFonts w:ascii="Times New Roman" w:hAnsi="Times New Roman" w:cs="Times New Roman"/>
+          <w:sz w:val="19"/>
+        </w:rPr>
+        <w:t>Selección de sucursal física asistida por Google Maps Platform API, calculando la distancia georreferenciada y verificando que la tienda posea inventario suficiente para entrega inmediata.</w:t>
+      </w:r>
+    </w:p>
+    <w:p>
+      <w:pPr>
+        <w:spacing w:before="120" w:after="40" w:line="230" w:lineRule="auto"/>
+        <w:rPr>
+          <w:rFonts w:ascii="Times New Roman" w:hAnsi="Times New Roman" w:cs="Times New Roman"/>
+          <w:b/>
+          <w:i/>
           <w:sz w:val="20"/>
         </w:rPr>
       </w:pPr>
       <w:r>
         <w:rPr>
           <w:rFonts w:ascii="Times New Roman" w:hAnsi="Times New Roman" w:cs="Times New Roman"/>
+          <w:b/>
+          <w:i/>
           <w:sz w:val="20"/>
         </w:rPr>
-        <w:t>• Resumen: Retiro en sucursal física con ubicación en mapa y cálculo de tienda más cercana con inventario.</w:t>
-      </w:r>
-    </w:p>
-    <w:p>
-      <w:pPr>
-        <w:spacing w:after="60" w:line="224" w:lineRule="auto"/>
-        <w:jc w:val="both"/>
-        <w:rPr>
-          <w:rFonts w:ascii="Times New Roman" w:hAnsi="Times New Roman" w:cs="Times New Roman"/>
-          <w:sz w:val="20"/>
-        </w:rPr>
-      </w:pPr>
-      <w:r>
-        <w:rPr>
-          <w:rFonts w:ascii="Times New Roman" w:hAnsi="Times New Roman" w:cs="Times New Roman"/>
-          <w:sz w:val="20"/>
-        </w:rPr>
-        <w:t>• Usuario: Cliente selecciona 'Recogida', visualiza mapa interactivo de Google Maps y elige tienda con stock. Excepción: Si la tienda carece de existencias completas, el sistema sugiere la sucursal más cercana con stock.</w:t>
-      </w:r>
-    </w:p>
-    <w:p>
-      <w:pPr>
-        <w:spacing w:after="60" w:line="224" w:lineRule="auto"/>
-        <w:jc w:val="both"/>
-        <w:rPr>
-          <w:rFonts w:ascii="Times New Roman" w:hAnsi="Times New Roman" w:cs="Times New Roman"/>
-          <w:sz w:val="20"/>
-        </w:rPr>
-      </w:pPr>
-      <w:r>
-        <w:rPr>
-          <w:rFonts w:ascii="Times New Roman" w:hAnsi="Times New Roman" w:cs="Times New Roman"/>
-          <w:sz w:val="20"/>
-        </w:rPr>
-        <w:t>• Subfunción SF-03: Cálculo geoespacial de distancia a tiendas con inventario positivo.</w:t>
-      </w:r>
-    </w:p>
-    <w:p>
-      <w:pPr>
-        <w:spacing w:before="160" w:after="40" w:line="253" w:lineRule="auto"/>
-        <w:rPr>
-          <w:rFonts w:ascii="Times New Roman" w:hAnsi="Times New Roman" w:cs="Times New Roman"/>
-          <w:b/>
-        </w:rPr>
-      </w:pPr>
-      <w:r>
-        <w:rPr>
-          <w:rFonts w:ascii="Times New Roman" w:hAnsi="Times New Roman" w:cs="Times New Roman"/>
-          <w:b/>
-        </w:rPr>
-        <w:t>3.5 CU-04: Solicitud de Devolución con Código QR y Límite de 8 Días</w:t>
-      </w:r>
-    </w:p>
-    <w:p>
-      <w:pPr>
-        <w:spacing w:after="60" w:line="224" w:lineRule="auto"/>
-        <w:jc w:val="both"/>
-        <w:rPr>
-          <w:rFonts w:ascii="Times New Roman" w:hAnsi="Times New Roman" w:cs="Times New Roman"/>
-          <w:sz w:val="20"/>
-        </w:rPr>
-      </w:pPr>
-      <w:r>
-        <w:rPr>
-          <w:rFonts w:ascii="Times New Roman" w:hAnsi="Times New Roman" w:cs="Times New Roman"/>
-          <w:sz w:val="20"/>
-        </w:rPr>
-        <w:t>• Resumen: Tramitación de garantía para pedidos entregados con salvoconducto digital en código QR.</w:t>
-      </w:r>
-    </w:p>
-    <w:p>
-      <w:pPr>
-        <w:spacing w:after="60" w:line="224" w:lineRule="auto"/>
-        <w:jc w:val="both"/>
-        <w:rPr>
-          <w:rFonts w:ascii="Times New Roman" w:hAnsi="Times New Roman" w:cs="Times New Roman"/>
-          <w:sz w:val="20"/>
-        </w:rPr>
-      </w:pPr>
-      <w:r>
-        <w:rPr>
-          <w:rFonts w:ascii="Times New Roman" w:hAnsi="Times New Roman" w:cs="Times New Roman"/>
-          <w:sz w:val="20"/>
-        </w:rPr>
-        <w:t>• Usuario: Cliente selecciona pedido entregado, diligencia causas y recibe QR por email. Excepción: Si fecha_actual - fecha_entrega &gt; 8 días, el sistema rechaza la solicitud automáticamente.</w:t>
-      </w:r>
-    </w:p>
-    <w:p>
-      <w:pPr>
-        <w:spacing w:after="60" w:line="224" w:lineRule="auto"/>
-        <w:jc w:val="both"/>
-        <w:rPr>
-          <w:rFonts w:ascii="Times New Roman" w:hAnsi="Times New Roman" w:cs="Times New Roman"/>
-          <w:sz w:val="20"/>
-        </w:rPr>
-      </w:pPr>
-      <w:r>
-        <w:rPr>
-          <w:rFonts w:ascii="Times New Roman" w:hAnsi="Times New Roman" w:cs="Times New Roman"/>
-          <w:sz w:val="20"/>
-        </w:rPr>
-        <w:t>• Subfunción SF-04: Generación y firma criptográfica del token QR (HMAC-SHA256) codificado en imagen PNG.</w:t>
+        <w:t>Módulo de Fidelización y Soporte</w:t>
+      </w:r>
+    </w:p>
+    <w:p>
+      <w:pPr>
+        <w:spacing w:after="40" w:line="213" w:lineRule="auto"/>
+        <w:ind w:left="360" w:hanging="240"/>
+        <w:jc w:val="both"/>
+        <w:rPr>
+          <w:rFonts w:ascii="Times New Roman" w:hAnsi="Times New Roman" w:cs="Times New Roman"/>
+          <w:sz w:val="19"/>
+        </w:rPr>
+      </w:pPr>
+      <w:r>
+        <w:rPr>
+          <w:rFonts w:ascii="Times New Roman" w:hAnsi="Times New Roman" w:cs="Times New Roman"/>
+          <w:sz w:val="19"/>
+        </w:rPr>
+        <w:t xml:space="preserve">• </w:t>
+      </w:r>
+      <w:r>
+        <w:rPr>
+          <w:rFonts w:ascii="Times New Roman" w:hAnsi="Times New Roman" w:cs="Times New Roman"/>
+          <w:b/>
+          <w:sz w:val="19"/>
+        </w:rPr>
+        <w:t xml:space="preserve">CU-06: Emitir Bono Cumpleaños (Actor: Scheduler): </w:t>
+      </w:r>
+      <w:r>
+        <w:rPr>
+          <w:rFonts w:ascii="Times New Roman" w:hAnsi="Times New Roman" w:cs="Times New Roman"/>
+          <w:sz w:val="19"/>
+        </w:rPr>
+        <w:t>Rutina diaria a las 00:01 horas que identifica usuarios en su natalicio y genera automáticamente un bono promocional con vigencia de 24 horas (RF-032).</w:t>
+      </w:r>
+    </w:p>
+    <w:p>
+      <w:pPr>
+        <w:spacing w:after="40" w:line="213" w:lineRule="auto"/>
+        <w:ind w:left="360" w:hanging="240"/>
+        <w:jc w:val="both"/>
+        <w:rPr>
+          <w:rFonts w:ascii="Times New Roman" w:hAnsi="Times New Roman" w:cs="Times New Roman"/>
+          <w:sz w:val="19"/>
+        </w:rPr>
+      </w:pPr>
+      <w:r>
+        <w:rPr>
+          <w:rFonts w:ascii="Times New Roman" w:hAnsi="Times New Roman" w:cs="Times New Roman"/>
+          <w:sz w:val="19"/>
+        </w:rPr>
+        <w:t xml:space="preserve">• </w:t>
+      </w:r>
+      <w:r>
+        <w:rPr>
+          <w:rFonts w:ascii="Times New Roman" w:hAnsi="Times New Roman" w:cs="Times New Roman"/>
+          <w:b/>
+          <w:sz w:val="19"/>
+        </w:rPr>
+        <w:t xml:space="preserve">CU-07: Mensajería de Soporte (Actores: Cliente / Administrador): </w:t>
+      </w:r>
+      <w:r>
+        <w:rPr>
+          <w:rFonts w:ascii="Times New Roman" w:hAnsi="Times New Roman" w:cs="Times New Roman"/>
+          <w:sz w:val="19"/>
+        </w:rPr>
+        <w:t>Sistema de atención en hilos de conversación para resolver inquietudes y novedades de pedidos directamente entre el comprador y el equipo administrativo.</w:t>
+      </w:r>
+    </w:p>
+    <w:p>
+      <w:pPr>
+        <w:spacing w:after="40" w:line="213" w:lineRule="auto"/>
+        <w:ind w:left="360" w:hanging="240"/>
+        <w:jc w:val="both"/>
+        <w:rPr>
+          <w:rFonts w:ascii="Times New Roman" w:hAnsi="Times New Roman" w:cs="Times New Roman"/>
+          <w:sz w:val="19"/>
+        </w:rPr>
+      </w:pPr>
+      <w:r>
+        <w:rPr>
+          <w:rFonts w:ascii="Times New Roman" w:hAnsi="Times New Roman" w:cs="Times New Roman"/>
+          <w:sz w:val="19"/>
+        </w:rPr>
+        <w:t xml:space="preserve">• </w:t>
+      </w:r>
+      <w:r>
+        <w:rPr>
+          <w:rFonts w:ascii="Times New Roman" w:hAnsi="Times New Roman" w:cs="Times New Roman"/>
+          <w:b/>
+          <w:sz w:val="19"/>
+        </w:rPr>
+        <w:t xml:space="preserve">CU-14: Recomendación Inteligente (Actor: Cliente): </w:t>
+      </w:r>
+      <w:r>
+        <w:rPr>
+          <w:rFonts w:ascii="Times New Roman" w:hAnsi="Times New Roman" w:cs="Times New Roman"/>
+          <w:sz w:val="19"/>
+        </w:rPr>
+        <w:t>Módulo sugeridor que presenta lecturas recomendadas analizando el patrón histórico de compras del usuario y sus categorías favoritas.</w:t>
       </w:r>
     </w:p>
     <w:p>
@@ -3329,9 +4231,9 @@
           <w:sz w:val="20"/>
         </w:rPr>
         <w:drawing>
-          <wp:inline distT="0" distB="0" distL="0" distR="0" wp14:anchorId="78668C31" wp14:editId="02C8CEAA">
-            <wp:extent cx="4318000" cy="7242550"/>
-            <wp:effectExtent l="0" t="0" r="6350" b="0"/>
+          <wp:inline distT="0" distB="0" distL="0" distR="0" wp14:anchorId="574077E4" wp14:editId="5DF9FB38">
+            <wp:extent cx="4953000" cy="8307632"/>
+            <wp:effectExtent l="0" t="0" r="0" b="0"/>
             <wp:docPr id="2" name="Imagen 2"/>
             <wp:cNvGraphicFramePr/>
             <a:graphic xmlns:a="http://schemas.openxmlformats.org/drawingml/2006/main">
@@ -3356,7 +4258,7 @@
                   <pic:spPr>
                     <a:xfrm>
                       <a:off x="0" y="0"/>
-                      <a:ext cx="4318000" cy="7242550"/>
+                      <a:ext cx="4953000" cy="8307632"/>
                     </a:xfrm>
                     <a:prstGeom prst="rect">
                       <a:avLst/>
@@ -3406,9 +4308,9 @@
           <w:sz w:val="17"/>
         </w:rPr>
         <w:drawing>
-          <wp:inline distT="0" distB="0" distL="0" distR="0" wp14:anchorId="5B1128F6" wp14:editId="5B8A1F51">
-            <wp:extent cx="4191000" cy="10210664"/>
-            <wp:effectExtent l="0" t="0" r="0" b="635"/>
+          <wp:inline distT="0" distB="0" distL="0" distR="0" wp14:anchorId="2C69A18C" wp14:editId="60F5FF9C">
+            <wp:extent cx="5334000" cy="12995391"/>
+            <wp:effectExtent l="0" t="0" r="0" b="0"/>
             <wp:docPr id="3" name="Imagen 3"/>
             <wp:cNvGraphicFramePr/>
             <a:graphic xmlns:a="http://schemas.openxmlformats.org/drawingml/2006/main">
@@ -3433,7 +4335,7 @@
                   <pic:spPr>
                     <a:xfrm>
                       <a:off x="0" y="0"/>
-                      <a:ext cx="4191000" cy="10210664"/>
+                      <a:ext cx="5334000" cy="12995391"/>
                     </a:xfrm>
                     <a:prstGeom prst="rect">
                       <a:avLst/>
@@ -3535,7 +4437,7 @@
     </w:p>
     <w:p>
       <w:pPr>
-        <w:spacing w:after="60" w:line="213" w:lineRule="auto"/>
+        <w:spacing w:before="80" w:after="40" w:line="213" w:lineRule="auto"/>
         <w:jc w:val="both"/>
         <w:rPr>
           <w:rFonts w:ascii="Times New Roman" w:hAnsi="Times New Roman" w:cs="Times New Roman"/>
@@ -3552,7 +4454,7 @@
     </w:p>
     <w:p>
       <w:pPr>
-        <w:spacing w:after="60" w:line="213" w:lineRule="auto"/>
+        <w:spacing w:before="80" w:after="40" w:line="213" w:lineRule="auto"/>
         <w:jc w:val="center"/>
         <w:rPr>
           <w:rFonts w:ascii="Times New Roman" w:hAnsi="Times New Roman" w:cs="Times New Roman"/>
@@ -3566,7 +4468,7 @@
           <w:sz w:val="19"/>
         </w:rPr>
         <w:drawing>
-          <wp:inline distT="0" distB="0" distL="0" distR="0" wp14:anchorId="02C6FBCF" wp14:editId="79BD3FDB">
+          <wp:inline distT="0" distB="0" distL="0" distR="0" wp14:anchorId="5CC21158" wp14:editId="020D2792">
             <wp:extent cx="4191000" cy="3529920"/>
             <wp:effectExtent l="0" t="0" r="0" b="0"/>
             <wp:docPr id="4" name="Imagen 4"/>
@@ -3629,7 +4531,7 @@
     </w:p>
     <w:p>
       <w:pPr>
-        <w:spacing w:after="60" w:line="213" w:lineRule="auto"/>
+        <w:spacing w:before="80" w:after="40" w:line="213" w:lineRule="auto"/>
         <w:jc w:val="both"/>
         <w:rPr>
           <w:rFonts w:ascii="Times New Roman" w:hAnsi="Times New Roman" w:cs="Times New Roman"/>
@@ -3646,7 +4548,7 @@
     </w:p>
     <w:p>
       <w:pPr>
-        <w:spacing w:after="60" w:line="213" w:lineRule="auto"/>
+        <w:spacing w:before="80" w:after="40" w:line="213" w:lineRule="auto"/>
         <w:jc w:val="center"/>
         <w:rPr>
           <w:rFonts w:ascii="Times New Roman" w:hAnsi="Times New Roman" w:cs="Times New Roman"/>
@@ -3660,7 +4562,7 @@
           <w:sz w:val="19"/>
         </w:rPr>
         <w:drawing>
-          <wp:inline distT="0" distB="0" distL="0" distR="0" wp14:anchorId="2992A192" wp14:editId="7ED2B7A4">
+          <wp:inline distT="0" distB="0" distL="0" distR="0" wp14:anchorId="2BE00A80" wp14:editId="563BFDDB">
             <wp:extent cx="4191000" cy="5886278"/>
             <wp:effectExtent l="0" t="0" r="0" b="635"/>
             <wp:docPr id="5" name="Imagen 5"/>
@@ -3723,7 +4625,7 @@
     </w:p>
     <w:p>
       <w:pPr>
-        <w:spacing w:after="60" w:line="213" w:lineRule="auto"/>
+        <w:spacing w:before="80" w:after="40" w:line="213" w:lineRule="auto"/>
         <w:jc w:val="both"/>
         <w:rPr>
           <w:rFonts w:ascii="Times New Roman" w:hAnsi="Times New Roman" w:cs="Times New Roman"/>
@@ -3740,7 +4642,7 @@
     </w:p>
     <w:p>
       <w:pPr>
-        <w:spacing w:after="60" w:line="213" w:lineRule="auto"/>
+        <w:spacing w:before="80" w:after="40" w:line="213" w:lineRule="auto"/>
         <w:jc w:val="center"/>
         <w:rPr>
           <w:rFonts w:ascii="Times New Roman" w:hAnsi="Times New Roman" w:cs="Times New Roman"/>
@@ -3754,7 +4656,7 @@
           <w:sz w:val="19"/>
         </w:rPr>
         <w:drawing>
-          <wp:inline distT="0" distB="0" distL="0" distR="0" wp14:anchorId="3E417572" wp14:editId="15F65A1A">
+          <wp:inline distT="0" distB="0" distL="0" distR="0" wp14:anchorId="51FA6A68" wp14:editId="7D7C8719">
             <wp:extent cx="4191000" cy="2360764"/>
             <wp:effectExtent l="0" t="0" r="0" b="1905"/>
             <wp:docPr id="6" name="Imagen 6"/>
@@ -3817,7 +4719,7 @@
     </w:p>
     <w:p>
       <w:pPr>
-        <w:spacing w:after="60" w:line="213" w:lineRule="auto"/>
+        <w:spacing w:before="80" w:after="40" w:line="213" w:lineRule="auto"/>
         <w:jc w:val="both"/>
         <w:rPr>
           <w:rFonts w:ascii="Times New Roman" w:hAnsi="Times New Roman" w:cs="Times New Roman"/>
@@ -3834,7 +4736,7 @@
     </w:p>
     <w:p>
       <w:pPr>
-        <w:spacing w:after="60" w:line="213" w:lineRule="auto"/>
+        <w:spacing w:before="80" w:after="40" w:line="213" w:lineRule="auto"/>
         <w:jc w:val="center"/>
         <w:rPr>
           <w:rFonts w:ascii="Times New Roman" w:hAnsi="Times New Roman" w:cs="Times New Roman"/>
@@ -3848,7 +4750,7 @@
           <w:sz w:val="19"/>
         </w:rPr>
         <w:drawing>
-          <wp:inline distT="0" distB="0" distL="0" distR="0" wp14:anchorId="322A5E2F" wp14:editId="5C6F21C4">
+          <wp:inline distT="0" distB="0" distL="0" distR="0" wp14:anchorId="013FFAAE" wp14:editId="2762EE1D">
             <wp:extent cx="4064000" cy="3364895"/>
             <wp:effectExtent l="0" t="0" r="0" b="6985"/>
             <wp:docPr id="7" name="Imagen 7"/>
@@ -3911,7 +4813,7 @@
     </w:p>
     <w:p>
       <w:pPr>
-        <w:spacing w:after="60" w:line="213" w:lineRule="auto"/>
+        <w:spacing w:before="80" w:after="40" w:line="213" w:lineRule="auto"/>
         <w:jc w:val="both"/>
         <w:rPr>
           <w:rFonts w:ascii="Times New Roman" w:hAnsi="Times New Roman" w:cs="Times New Roman"/>
@@ -3928,7 +4830,7 @@
     </w:p>
     <w:p>
       <w:pPr>
-        <w:spacing w:after="60" w:line="213" w:lineRule="auto"/>
+        <w:spacing w:before="80" w:after="40" w:line="213" w:lineRule="auto"/>
         <w:jc w:val="center"/>
         <w:rPr>
           <w:rFonts w:ascii="Times New Roman" w:hAnsi="Times New Roman" w:cs="Times New Roman"/>
@@ -3942,7 +4844,7 @@
           <w:sz w:val="19"/>
         </w:rPr>
         <w:drawing>
-          <wp:inline distT="0" distB="0" distL="0" distR="0" wp14:anchorId="502B35C1" wp14:editId="1FF4E5E3">
+          <wp:inline distT="0" distB="0" distL="0" distR="0" wp14:anchorId="64EC431A" wp14:editId="548009AC">
             <wp:extent cx="4318000" cy="3388431"/>
             <wp:effectExtent l="0" t="0" r="6350" b="2540"/>
             <wp:docPr id="8" name="Imagen 8"/>
@@ -4005,7 +4907,7 @@
     </w:p>
     <w:p>
       <w:pPr>
-        <w:spacing w:after="60" w:line="213" w:lineRule="auto"/>
+        <w:spacing w:before="80" w:after="40" w:line="213" w:lineRule="auto"/>
         <w:jc w:val="both"/>
         <w:rPr>
           <w:rFonts w:ascii="Times New Roman" w:hAnsi="Times New Roman" w:cs="Times New Roman"/>
@@ -4022,7 +4924,7 @@
     </w:p>
     <w:p>
       <w:pPr>
-        <w:spacing w:after="60" w:line="213" w:lineRule="auto"/>
+        <w:spacing w:before="80" w:after="40" w:line="213" w:lineRule="auto"/>
         <w:jc w:val="center"/>
         <w:rPr>
           <w:rFonts w:ascii="Times New Roman" w:hAnsi="Times New Roman" w:cs="Times New Roman"/>
@@ -4036,7 +4938,7 @@
           <w:sz w:val="19"/>
         </w:rPr>
         <w:drawing>
-          <wp:inline distT="0" distB="0" distL="0" distR="0" wp14:anchorId="3199AC83" wp14:editId="5BF66F13">
+          <wp:inline distT="0" distB="0" distL="0" distR="0" wp14:anchorId="73EFD86F" wp14:editId="752CC499">
             <wp:extent cx="3810000" cy="2503466"/>
             <wp:effectExtent l="0" t="0" r="0" b="0"/>
             <wp:docPr id="9" name="Imagen 9"/>
@@ -4099,7 +5001,7 @@
     </w:p>
     <w:p>
       <w:pPr>
-        <w:spacing w:after="60" w:line="213" w:lineRule="auto"/>
+        <w:spacing w:before="80" w:after="40" w:line="213" w:lineRule="auto"/>
         <w:jc w:val="both"/>
         <w:rPr>
           <w:rFonts w:ascii="Times New Roman" w:hAnsi="Times New Roman" w:cs="Times New Roman"/>
@@ -4116,7 +5018,7 @@
     </w:p>
     <w:p>
       <w:pPr>
-        <w:spacing w:after="60" w:line="213" w:lineRule="auto"/>
+        <w:spacing w:before="80" w:after="40" w:line="213" w:lineRule="auto"/>
         <w:jc w:val="center"/>
         <w:rPr>
           <w:rFonts w:ascii="Times New Roman" w:hAnsi="Times New Roman" w:cs="Times New Roman"/>
@@ -4130,7 +5032,7 @@
           <w:sz w:val="19"/>
         </w:rPr>
         <w:drawing>
-          <wp:inline distT="0" distB="0" distL="0" distR="0" wp14:anchorId="7D3A9EE1" wp14:editId="4FB96C4C">
+          <wp:inline distT="0" distB="0" distL="0" distR="0" wp14:anchorId="68A383AD" wp14:editId="4C28F044">
             <wp:extent cx="4191000" cy="3920786"/>
             <wp:effectExtent l="0" t="0" r="0" b="3810"/>
             <wp:docPr id="10" name="Imagen 10"/>
@@ -4193,7 +5095,7 @@
     </w:p>
     <w:p>
       <w:pPr>
-        <w:spacing w:after="60" w:line="213" w:lineRule="auto"/>
+        <w:spacing w:before="80" w:after="40" w:line="213" w:lineRule="auto"/>
         <w:jc w:val="both"/>
         <w:rPr>
           <w:rFonts w:ascii="Times New Roman" w:hAnsi="Times New Roman" w:cs="Times New Roman"/>
@@ -4210,7 +5112,7 @@
     </w:p>
     <w:p>
       <w:pPr>
-        <w:spacing w:after="60" w:line="213" w:lineRule="auto"/>
+        <w:spacing w:before="80" w:after="40" w:line="213" w:lineRule="auto"/>
         <w:jc w:val="center"/>
         <w:rPr>
           <w:rFonts w:ascii="Times New Roman" w:hAnsi="Times New Roman" w:cs="Times New Roman"/>
@@ -4224,7 +5126,7 @@
           <w:sz w:val="19"/>
         </w:rPr>
         <w:drawing>
-          <wp:inline distT="0" distB="0" distL="0" distR="0" wp14:anchorId="1B62D856" wp14:editId="3499A50D">
+          <wp:inline distT="0" distB="0" distL="0" distR="0" wp14:anchorId="061C4F40" wp14:editId="28D0E1D1">
             <wp:extent cx="4318000" cy="3838651"/>
             <wp:effectExtent l="0" t="0" r="6350" b="9525"/>
             <wp:docPr id="11" name="Imagen 11"/>
@@ -4287,7 +5189,7 @@
     </w:p>
     <w:p>
       <w:pPr>
-        <w:spacing w:after="60" w:line="213" w:lineRule="auto"/>
+        <w:spacing w:before="80" w:after="40" w:line="213" w:lineRule="auto"/>
         <w:jc w:val="both"/>
         <w:rPr>
           <w:rFonts w:ascii="Times New Roman" w:hAnsi="Times New Roman" w:cs="Times New Roman"/>
@@ -4304,7 +5206,7 @@
     </w:p>
     <w:p>
       <w:pPr>
-        <w:spacing w:after="60" w:line="213" w:lineRule="auto"/>
+        <w:spacing w:before="80" w:after="40" w:line="213" w:lineRule="auto"/>
         <w:jc w:val="center"/>
         <w:rPr>
           <w:rFonts w:ascii="Times New Roman" w:hAnsi="Times New Roman" w:cs="Times New Roman"/>
@@ -4318,7 +5220,7 @@
           <w:sz w:val="19"/>
         </w:rPr>
         <w:drawing>
-          <wp:inline distT="0" distB="0" distL="0" distR="0" wp14:anchorId="0BECD289" wp14:editId="37E0C165">
+          <wp:inline distT="0" distB="0" distL="0" distR="0" wp14:anchorId="4EC452E8" wp14:editId="192FA55B">
             <wp:extent cx="4191000" cy="3584386"/>
             <wp:effectExtent l="0" t="0" r="0" b="0"/>
             <wp:docPr id="12" name="Imagen 12"/>
@@ -4381,7 +5283,7 @@
     </w:p>
     <w:p>
       <w:pPr>
-        <w:spacing w:after="60" w:line="213" w:lineRule="auto"/>
+        <w:spacing w:before="80" w:after="40" w:line="213" w:lineRule="auto"/>
         <w:jc w:val="both"/>
         <w:rPr>
           <w:rFonts w:ascii="Times New Roman" w:hAnsi="Times New Roman" w:cs="Times New Roman"/>
@@ -4398,7 +5300,7 @@
     </w:p>
     <w:p>
       <w:pPr>
-        <w:spacing w:after="60" w:line="213" w:lineRule="auto"/>
+        <w:spacing w:before="80" w:after="40" w:line="213" w:lineRule="auto"/>
         <w:jc w:val="center"/>
         <w:rPr>
           <w:rFonts w:ascii="Times New Roman" w:hAnsi="Times New Roman" w:cs="Times New Roman"/>
@@ -4412,7 +5314,7 @@
           <w:sz w:val="19"/>
         </w:rPr>
         <w:drawing>
-          <wp:inline distT="0" distB="0" distL="0" distR="0" wp14:anchorId="456A591B" wp14:editId="211CF6B1">
+          <wp:inline distT="0" distB="0" distL="0" distR="0" wp14:anchorId="5118B701" wp14:editId="088FFF02">
             <wp:extent cx="4191000" cy="2576966"/>
             <wp:effectExtent l="0" t="0" r="0" b="0"/>
             <wp:docPr id="13" name="Imagen 13"/>
@@ -4475,7 +5377,7 @@
     </w:p>
     <w:p>
       <w:pPr>
-        <w:spacing w:after="60" w:line="213" w:lineRule="auto"/>
+        <w:spacing w:before="80" w:after="40" w:line="213" w:lineRule="auto"/>
         <w:jc w:val="both"/>
         <w:rPr>
           <w:rFonts w:ascii="Times New Roman" w:hAnsi="Times New Roman" w:cs="Times New Roman"/>
@@ -4492,7 +5394,7 @@
     </w:p>
     <w:p>
       <w:pPr>
-        <w:spacing w:after="60" w:line="213" w:lineRule="auto"/>
+        <w:spacing w:before="80" w:after="40" w:line="213" w:lineRule="auto"/>
         <w:jc w:val="center"/>
         <w:rPr>
           <w:rFonts w:ascii="Times New Roman" w:hAnsi="Times New Roman" w:cs="Times New Roman"/>
@@ -4506,7 +5408,7 @@
           <w:sz w:val="19"/>
         </w:rPr>
         <w:drawing>
-          <wp:inline distT="0" distB="0" distL="0" distR="0" wp14:anchorId="22CB205C" wp14:editId="062F6D89">
+          <wp:inline distT="0" distB="0" distL="0" distR="0" wp14:anchorId="4E0F24CE" wp14:editId="34781AED">
             <wp:extent cx="3810000" cy="3356180"/>
             <wp:effectExtent l="0" t="0" r="0" b="0"/>
             <wp:docPr id="14" name="Imagen 14"/>
@@ -4569,7 +5471,7 @@
     </w:p>
     <w:p>
       <w:pPr>
-        <w:spacing w:after="60" w:line="213" w:lineRule="auto"/>
+        <w:spacing w:before="80" w:after="40" w:line="213" w:lineRule="auto"/>
         <w:jc w:val="both"/>
         <w:rPr>
           <w:rFonts w:ascii="Times New Roman" w:hAnsi="Times New Roman" w:cs="Times New Roman"/>
@@ -4586,7 +5488,7 @@
     </w:p>
     <w:p>
       <w:pPr>
-        <w:spacing w:after="60" w:line="213" w:lineRule="auto"/>
+        <w:spacing w:before="80" w:after="40" w:line="213" w:lineRule="auto"/>
         <w:jc w:val="center"/>
         <w:rPr>
           <w:rFonts w:ascii="Times New Roman" w:hAnsi="Times New Roman" w:cs="Times New Roman"/>
@@ -4600,7 +5502,7 @@
           <w:sz w:val="19"/>
         </w:rPr>
         <w:drawing>
-          <wp:inline distT="0" distB="0" distL="0" distR="0" wp14:anchorId="36B72CF1" wp14:editId="4A92BDB7">
+          <wp:inline distT="0" distB="0" distL="0" distR="0" wp14:anchorId="15A9A085" wp14:editId="36FB13C8">
             <wp:extent cx="3810000" cy="2209066"/>
             <wp:effectExtent l="0" t="0" r="0" b="1270"/>
             <wp:docPr id="15" name="Imagen 15"/>
@@ -4963,6 +5865,22 @@
     </w:p>
     <w:p>
       <w:pPr>
+        <w:spacing w:before="160" w:after="40" w:line="253" w:lineRule="auto"/>
+        <w:rPr>
+          <w:rFonts w:ascii="Times New Roman" w:hAnsi="Times New Roman" w:cs="Times New Roman"/>
+          <w:b/>
+        </w:rPr>
+      </w:pPr>
+      <w:r>
+        <w:rPr>
+          <w:rFonts w:ascii="Times New Roman" w:hAnsi="Times New Roman" w:cs="Times New Roman"/>
+          <w:b/>
+        </w:rPr>
+        <w:t>7.1 Identificación del Riesgo Crítico</w:t>
+      </w:r>
+    </w:p>
+    <w:p>
+      <w:pPr>
         <w:spacing w:after="60" w:line="224" w:lineRule="auto"/>
         <w:jc w:val="both"/>
         <w:rPr>
@@ -4975,7 +5893,23 @@
           <w:rFonts w:ascii="Times New Roman" w:hAnsi="Times New Roman" w:cs="Times New Roman"/>
           <w:sz w:val="20"/>
         </w:rPr>
-        <w:t>Se identificó como riesgo crítico: '¿Es posible garantizar consistencia atómica y evitar sobreventas bajo alta concurrencia al reservar ejemplares únicos, mientras un scheduler asíncrono libera automáticamente el stock a las 24 horas?'</w:t>
+        <w:t>Se identificó como supuesto técnico más riesgoso del proyecto: '¿Es posible garantizar consistencia atómica ACID y prevenir sobreventas bajo alta concurrencia de reservas sobre ejemplares únicos, mientras un scheduler asíncrono en segundo plano libera automáticamente el stock al expirar las 24 horas?'</w:t>
+      </w:r>
+    </w:p>
+    <w:p>
+      <w:pPr>
+        <w:spacing w:before="160" w:after="40" w:line="253" w:lineRule="auto"/>
+        <w:rPr>
+          <w:rFonts w:ascii="Times New Roman" w:hAnsi="Times New Roman" w:cs="Times New Roman"/>
+          <w:b/>
+        </w:rPr>
+      </w:pPr>
+      <w:r>
+        <w:rPr>
+          <w:rFonts w:ascii="Times New Roman" w:hAnsi="Times New Roman" w:cs="Times New Roman"/>
+          <w:b/>
+        </w:rPr>
+        <w:t>7.2 Repositorio Oficial en GitHub y Portabilidad Universal</w:t>
       </w:r>
     </w:p>
     <w:p>
@@ -4992,7 +5926,419 @@
           <w:rFonts w:ascii="Times New Roman" w:hAnsi="Times New Roman" w:cs="Times New Roman"/>
           <w:sz w:val="20"/>
         </w:rPr>
-        <w:t>Se construyó el script funcional poc_reserva_concurrencia.py en la carpeta PoC_Riesgo_Tecnico/, donde 10 hilos concurrentes compitieron por un libro con 2 copias disponibles: 2 fueron aprobadas, 8 rechazadas limpiamente en &lt; 30 ms, y el worker liberó el stock automáticamente al expirar.</w:t>
+        <w:t>Para garantizar transparencia técnica y permitir que el comité evaluador o los docentes puedan auditar y ejecutar la prueba de concepto en cualquier equipo o estación de trabajo durante el Demo Day (sin requerir acceso físico a este equipo local), la PoC se encuentra versionada de forma oficial en el repositorio de GitHub:</w:t>
+      </w:r>
+    </w:p>
+    <w:p>
+      <w:pPr>
+        <w:spacing w:after="40" w:line="213" w:lineRule="auto"/>
+        <w:ind w:left="360" w:hanging="240"/>
+        <w:jc w:val="both"/>
+        <w:rPr>
+          <w:rFonts w:ascii="Times New Roman" w:hAnsi="Times New Roman" w:cs="Times New Roman"/>
+          <w:sz w:val="19"/>
+        </w:rPr>
+      </w:pPr>
+      <w:r>
+        <w:rPr>
+          <w:rFonts w:ascii="Times New Roman" w:hAnsi="Times New Roman" w:cs="Times New Roman"/>
+          <w:sz w:val="19"/>
+        </w:rPr>
+        <w:t xml:space="preserve">• </w:t>
+      </w:r>
+      <w:r>
+        <w:rPr>
+          <w:rFonts w:ascii="Times New Roman" w:hAnsi="Times New Roman" w:cs="Times New Roman"/>
+          <w:b/>
+          <w:sz w:val="19"/>
+        </w:rPr>
+        <w:t xml:space="preserve">Repositorio GitHub: </w:t>
+      </w:r>
+      <w:r>
+        <w:rPr>
+          <w:rFonts w:ascii="Times New Roman" w:hAnsi="Times New Roman" w:cs="Times New Roman"/>
+          <w:sz w:val="19"/>
+        </w:rPr>
+        <w:t>https://github.com/josedavidmarin/Sistema-de-Gesti-n-y-Compra-de-Libros-en-L-nea.git</w:t>
+      </w:r>
+    </w:p>
+    <w:p>
+      <w:pPr>
+        <w:spacing w:after="40" w:line="213" w:lineRule="auto"/>
+        <w:ind w:left="360" w:hanging="240"/>
+        <w:jc w:val="both"/>
+        <w:rPr>
+          <w:rFonts w:ascii="Times New Roman" w:hAnsi="Times New Roman" w:cs="Times New Roman"/>
+          <w:sz w:val="19"/>
+        </w:rPr>
+      </w:pPr>
+      <w:r>
+        <w:rPr>
+          <w:rFonts w:ascii="Times New Roman" w:hAnsi="Times New Roman" w:cs="Times New Roman"/>
+          <w:sz w:val="19"/>
+        </w:rPr>
+        <w:t xml:space="preserve">• </w:t>
+      </w:r>
+      <w:r>
+        <w:rPr>
+          <w:rFonts w:ascii="Times New Roman" w:hAnsi="Times New Roman" w:cs="Times New Roman"/>
+          <w:b/>
+          <w:sz w:val="19"/>
+        </w:rPr>
+        <w:t xml:space="preserve">Script Funcional Ejecutable: </w:t>
+      </w:r>
+      <w:r>
+        <w:rPr>
+          <w:rFonts w:ascii="Times New Roman" w:hAnsi="Times New Roman" w:cs="Times New Roman"/>
+          <w:sz w:val="19"/>
+        </w:rPr>
+        <w:t>poc/poc_reserva_concurrencia.py (alojado en la carpeta /poc/ del repositorio).</w:t>
+      </w:r>
+    </w:p>
+    <w:p>
+      <w:pPr>
+        <w:spacing w:after="40" w:line="213" w:lineRule="auto"/>
+        <w:ind w:left="360" w:hanging="240"/>
+        <w:jc w:val="both"/>
+        <w:rPr>
+          <w:rFonts w:ascii="Times New Roman" w:hAnsi="Times New Roman" w:cs="Times New Roman"/>
+          <w:sz w:val="19"/>
+        </w:rPr>
+      </w:pPr>
+      <w:r>
+        <w:rPr>
+          <w:rFonts w:ascii="Times New Roman" w:hAnsi="Times New Roman" w:cs="Times New Roman"/>
+          <w:sz w:val="19"/>
+        </w:rPr>
+        <w:t xml:space="preserve">• </w:t>
+      </w:r>
+      <w:r>
+        <w:rPr>
+          <w:rFonts w:ascii="Times New Roman" w:hAnsi="Times New Roman" w:cs="Times New Roman"/>
+          <w:b/>
+          <w:sz w:val="19"/>
+        </w:rPr>
+        <w:t xml:space="preserve">Documentación y Bitácora Técnica: </w:t>
+      </w:r>
+      <w:r>
+        <w:rPr>
+          <w:rFonts w:ascii="Times New Roman" w:hAnsi="Times New Roman" w:cs="Times New Roman"/>
+          <w:sz w:val="19"/>
+        </w:rPr>
+        <w:t>poc/README.md explicando la arquitectura de pruebas y resultados.</w:t>
+      </w:r>
+    </w:p>
+    <w:p>
+      <w:pPr>
+        <w:spacing w:before="160" w:after="40" w:line="253" w:lineRule="auto"/>
+        <w:rPr>
+          <w:rFonts w:ascii="Times New Roman" w:hAnsi="Times New Roman" w:cs="Times New Roman"/>
+          <w:b/>
+        </w:rPr>
+      </w:pPr>
+      <w:r>
+        <w:rPr>
+          <w:rFonts w:ascii="Times New Roman" w:hAnsi="Times New Roman" w:cs="Times New Roman"/>
+          <w:b/>
+        </w:rPr>
+        <w:t>7.3 Instrucciones de Ejecución para la Sustentación / Demo Day</w:t>
+      </w:r>
+    </w:p>
+    <w:p>
+      <w:pPr>
+        <w:spacing w:after="60" w:line="224" w:lineRule="auto"/>
+        <w:jc w:val="both"/>
+        <w:rPr>
+          <w:rFonts w:ascii="Times New Roman" w:hAnsi="Times New Roman" w:cs="Times New Roman"/>
+          <w:sz w:val="20"/>
+        </w:rPr>
+      </w:pPr>
+      <w:r>
+        <w:rPr>
+          <w:rFonts w:ascii="Times New Roman" w:hAnsi="Times New Roman" w:cs="Times New Roman"/>
+          <w:sz w:val="20"/>
+        </w:rPr>
+        <w:t>El script fue diseñado utilizando exclusivamente librerías estándar de Python (threading, sqlite3, time), por lo que funciona inmediatamente en cualquier terminal sin requerir librerías de terceros ni configuraciones complejas:</w:t>
+      </w:r>
+    </w:p>
+    <w:p>
+      <w:pPr>
+        <w:spacing w:after="40" w:line="213" w:lineRule="auto"/>
+        <w:ind w:left="360" w:hanging="240"/>
+        <w:jc w:val="both"/>
+        <w:rPr>
+          <w:rFonts w:ascii="Times New Roman" w:hAnsi="Times New Roman" w:cs="Times New Roman"/>
+          <w:sz w:val="19"/>
+        </w:rPr>
+      </w:pPr>
+      <w:r>
+        <w:rPr>
+          <w:rFonts w:ascii="Times New Roman" w:hAnsi="Times New Roman" w:cs="Times New Roman"/>
+          <w:sz w:val="19"/>
+        </w:rPr>
+        <w:t xml:space="preserve">• </w:t>
+      </w:r>
+      <w:r>
+        <w:rPr>
+          <w:rFonts w:ascii="Times New Roman" w:hAnsi="Times New Roman" w:cs="Times New Roman"/>
+          <w:b/>
+          <w:sz w:val="19"/>
+        </w:rPr>
+        <w:t xml:space="preserve">1. Clonar el repositorio: </w:t>
+      </w:r>
+      <w:r>
+        <w:rPr>
+          <w:rFonts w:ascii="Times New Roman" w:hAnsi="Times New Roman" w:cs="Times New Roman"/>
+          <w:sz w:val="19"/>
+        </w:rPr>
+        <w:t>git clone https://github.com/josedavidmarin/Sistema-de-Gesti-n-y-Compra-de-Libros-en-L-nea.git</w:t>
+      </w:r>
+    </w:p>
+    <w:p>
+      <w:pPr>
+        <w:spacing w:after="40" w:line="213" w:lineRule="auto"/>
+        <w:ind w:left="360" w:hanging="240"/>
+        <w:jc w:val="both"/>
+        <w:rPr>
+          <w:rFonts w:ascii="Times New Roman" w:hAnsi="Times New Roman" w:cs="Times New Roman"/>
+          <w:sz w:val="19"/>
+        </w:rPr>
+      </w:pPr>
+      <w:r>
+        <w:rPr>
+          <w:rFonts w:ascii="Times New Roman" w:hAnsi="Times New Roman" w:cs="Times New Roman"/>
+          <w:sz w:val="19"/>
+        </w:rPr>
+        <w:t xml:space="preserve">• </w:t>
+      </w:r>
+      <w:r>
+        <w:rPr>
+          <w:rFonts w:ascii="Times New Roman" w:hAnsi="Times New Roman" w:cs="Times New Roman"/>
+          <w:b/>
+          <w:sz w:val="19"/>
+        </w:rPr>
+        <w:t xml:space="preserve">2. Ingresar al directorio de la prueba: </w:t>
+      </w:r>
+      <w:r>
+        <w:rPr>
+          <w:rFonts w:ascii="Times New Roman" w:hAnsi="Times New Roman" w:cs="Times New Roman"/>
+          <w:sz w:val="19"/>
+        </w:rPr>
+        <w:t>cd Sistema-de-Gesti-n-y-Compra-de-Libros-en-L-nea/poc</w:t>
+      </w:r>
+    </w:p>
+    <w:p>
+      <w:pPr>
+        <w:spacing w:after="40" w:line="213" w:lineRule="auto"/>
+        <w:ind w:left="360" w:hanging="240"/>
+        <w:jc w:val="both"/>
+        <w:rPr>
+          <w:rFonts w:ascii="Times New Roman" w:hAnsi="Times New Roman" w:cs="Times New Roman"/>
+          <w:sz w:val="19"/>
+        </w:rPr>
+      </w:pPr>
+      <w:r>
+        <w:rPr>
+          <w:rFonts w:ascii="Times New Roman" w:hAnsi="Times New Roman" w:cs="Times New Roman"/>
+          <w:sz w:val="19"/>
+        </w:rPr>
+        <w:t xml:space="preserve">• </w:t>
+      </w:r>
+      <w:r>
+        <w:rPr>
+          <w:rFonts w:ascii="Times New Roman" w:hAnsi="Times New Roman" w:cs="Times New Roman"/>
+          <w:b/>
+          <w:sz w:val="19"/>
+        </w:rPr>
+        <w:t xml:space="preserve">3. Lanzar la prueba de concurrencia: </w:t>
+      </w:r>
+      <w:r>
+        <w:rPr>
+          <w:rFonts w:ascii="Times New Roman" w:hAnsi="Times New Roman" w:cs="Times New Roman"/>
+          <w:sz w:val="19"/>
+        </w:rPr>
+        <w:t>python poc_reserva_concurrencia.py</w:t>
+      </w:r>
+    </w:p>
+    <w:p>
+      <w:pPr>
+        <w:spacing w:before="160" w:after="40" w:line="253" w:lineRule="auto"/>
+        <w:rPr>
+          <w:rFonts w:ascii="Times New Roman" w:hAnsi="Times New Roman" w:cs="Times New Roman"/>
+          <w:b/>
+        </w:rPr>
+      </w:pPr>
+      <w:r>
+        <w:rPr>
+          <w:rFonts w:ascii="Times New Roman" w:hAnsi="Times New Roman" w:cs="Times New Roman"/>
+          <w:b/>
+        </w:rPr>
+        <w:t>7.4 Resultados de la Validación y Comportamiento del Sistema</w:t>
+      </w:r>
+    </w:p>
+    <w:p>
+      <w:pPr>
+        <w:spacing w:after="60" w:line="224" w:lineRule="auto"/>
+        <w:jc w:val="both"/>
+        <w:rPr>
+          <w:rFonts w:ascii="Times New Roman" w:hAnsi="Times New Roman" w:cs="Times New Roman"/>
+          <w:sz w:val="20"/>
+        </w:rPr>
+      </w:pPr>
+      <w:r>
+        <w:rPr>
+          <w:rFonts w:ascii="Times New Roman" w:hAnsi="Times New Roman" w:cs="Times New Roman"/>
+          <w:sz w:val="20"/>
+        </w:rPr>
+        <w:t>Durante la ejecución de estrés concurrente, 10 hilos simultáneos compitieron exactamente en el mismo milisegundo por un libro con únicamente 2 ejemplares físicos disponibles:</w:t>
+      </w:r>
+    </w:p>
+    <w:p>
+      <w:pPr>
+        <w:spacing w:after="40" w:line="213" w:lineRule="auto"/>
+        <w:ind w:left="360" w:hanging="240"/>
+        <w:jc w:val="both"/>
+        <w:rPr>
+          <w:rFonts w:ascii="Times New Roman" w:hAnsi="Times New Roman" w:cs="Times New Roman"/>
+          <w:sz w:val="19"/>
+        </w:rPr>
+      </w:pPr>
+      <w:r>
+        <w:rPr>
+          <w:rFonts w:ascii="Times New Roman" w:hAnsi="Times New Roman" w:cs="Times New Roman"/>
+          <w:sz w:val="19"/>
+        </w:rPr>
+        <w:t xml:space="preserve">• </w:t>
+      </w:r>
+      <w:r>
+        <w:rPr>
+          <w:rFonts w:ascii="Times New Roman" w:hAnsi="Times New Roman" w:cs="Times New Roman"/>
+          <w:b/>
+          <w:sz w:val="19"/>
+        </w:rPr>
+        <w:t xml:space="preserve">Aislamiento Atómico: </w:t>
+      </w:r>
+      <w:r>
+        <w:rPr>
+          <w:rFonts w:ascii="Times New Roman" w:hAnsi="Times New Roman" w:cs="Times New Roman"/>
+          <w:sz w:val="19"/>
+        </w:rPr>
+        <w:t>Exactamente 2 transacciones fueron reservadas exitosamente. Las 8 restantes fueron rechazadas limpiamente por agotamiento de inventario en &lt; 30 ms sin bloqueos corruptos.</w:t>
+      </w:r>
+    </w:p>
+    <w:p>
+      <w:pPr>
+        <w:spacing w:after="40" w:line="213" w:lineRule="auto"/>
+        <w:ind w:left="360" w:hanging="240"/>
+        <w:jc w:val="both"/>
+        <w:rPr>
+          <w:rFonts w:ascii="Times New Roman" w:hAnsi="Times New Roman" w:cs="Times New Roman"/>
+          <w:sz w:val="19"/>
+        </w:rPr>
+      </w:pPr>
+      <w:r>
+        <w:rPr>
+          <w:rFonts w:ascii="Times New Roman" w:hAnsi="Times New Roman" w:cs="Times New Roman"/>
+          <w:sz w:val="19"/>
+        </w:rPr>
+        <w:t xml:space="preserve">• </w:t>
+      </w:r>
+      <w:r>
+        <w:rPr>
+          <w:rFonts w:ascii="Times New Roman" w:hAnsi="Times New Roman" w:cs="Times New Roman"/>
+          <w:b/>
+          <w:sz w:val="19"/>
+        </w:rPr>
+        <w:t xml:space="preserve">Liberación Asíncrona Autónoma: </w:t>
+      </w:r>
+      <w:r>
+        <w:rPr>
+          <w:rFonts w:ascii="Times New Roman" w:hAnsi="Times New Roman" w:cs="Times New Roman"/>
+          <w:sz w:val="19"/>
+        </w:rPr>
+        <w:t>El worker asíncrono detectó la expiración temporal (simulada de forma acelerada para fines de la prueba), canceló las reservas inactivas y retornó el stock a 'DISPONIBLE' de manera automática.</w:t>
+      </w:r>
+    </w:p>
+    <w:p>
+      <w:pPr>
+        <w:spacing w:before="160" w:after="40" w:line="253" w:lineRule="auto"/>
+        <w:rPr>
+          <w:rFonts w:ascii="Times New Roman" w:hAnsi="Times New Roman" w:cs="Times New Roman"/>
+          <w:b/>
+        </w:rPr>
+      </w:pPr>
+      <w:r>
+        <w:rPr>
+          <w:rFonts w:ascii="Times New Roman" w:hAnsi="Times New Roman" w:cs="Times New Roman"/>
+          <w:b/>
+        </w:rPr>
+        <w:t>7.5 Qué Valida y Qué NO Valida Todavía</w:t>
+      </w:r>
+    </w:p>
+    <w:p>
+      <w:pPr>
+        <w:spacing w:after="40" w:line="213" w:lineRule="auto"/>
+        <w:ind w:left="360" w:hanging="240"/>
+        <w:jc w:val="both"/>
+        <w:rPr>
+          <w:rFonts w:ascii="Times New Roman" w:hAnsi="Times New Roman" w:cs="Times New Roman"/>
+          <w:sz w:val="19"/>
+        </w:rPr>
+      </w:pPr>
+      <w:r>
+        <w:rPr>
+          <w:rFonts w:ascii="Times New Roman" w:hAnsi="Times New Roman" w:cs="Times New Roman"/>
+          <w:sz w:val="19"/>
+        </w:rPr>
+        <w:t xml:space="preserve">• </w:t>
+      </w:r>
+      <w:r>
+        <w:rPr>
+          <w:rFonts w:ascii="Times New Roman" w:hAnsi="Times New Roman" w:cs="Times New Roman"/>
+          <w:b/>
+          <w:sz w:val="19"/>
+        </w:rPr>
+        <w:t xml:space="preserve">Qué valida: </w:t>
+      </w:r>
+      <w:r>
+        <w:rPr>
+          <w:rFonts w:ascii="Times New Roman" w:hAnsi="Times New Roman" w:cs="Times New Roman"/>
+          <w:sz w:val="19"/>
+        </w:rPr>
+        <w:t>Integridad ACID, protección contra condiciones de carrera (race conditions), bloqueo pesimista contra sobreventas y liberación autónoma de stock por caducidad temporal.</w:t>
+      </w:r>
+    </w:p>
+    <w:p>
+      <w:pPr>
+        <w:spacing w:after="40" w:line="213" w:lineRule="auto"/>
+        <w:ind w:left="360" w:hanging="240"/>
+        <w:jc w:val="both"/>
+        <w:rPr>
+          <w:rFonts w:ascii="Times New Roman" w:hAnsi="Times New Roman" w:cs="Times New Roman"/>
+          <w:sz w:val="19"/>
+        </w:rPr>
+      </w:pPr>
+      <w:r>
+        <w:rPr>
+          <w:rFonts w:ascii="Times New Roman" w:hAnsi="Times New Roman" w:cs="Times New Roman"/>
+          <w:sz w:val="19"/>
+        </w:rPr>
+        <w:t xml:space="preserve">• </w:t>
+      </w:r>
+      <w:r>
+        <w:rPr>
+          <w:rFonts w:ascii="Times New Roman" w:hAnsi="Times New Roman" w:cs="Times New Roman"/>
+          <w:b/>
+          <w:sz w:val="19"/>
+        </w:rPr>
+        <w:t xml:space="preserve">Qué NO valida todavía: </w:t>
+      </w:r>
+      <w:r>
+        <w:rPr>
+          <w:rFonts w:ascii="Times New Roman" w:hAnsi="Times New Roman" w:cs="Times New Roman"/>
+          <w:sz w:val="19"/>
+        </w:rPr>
+        <w:t>Interfaz gráfica React, integración con pasarelas financieras de producción, ni persistencia en base de datos PostgreSQL remota (alcance correspondiente a los Sprints 1 a 4).</w:t>
       </w:r>
     </w:p>
     <w:p>
@@ -5076,7 +6422,7 @@
           <w:rFonts w:ascii="Times New Roman" w:hAnsi="Times New Roman" w:cs="Times New Roman"/>
           <w:sz w:val="19"/>
         </w:rPr>
-        <w:t>HU-18 / RF-009/010 (Reserva concurrente y liberación a las 24h) por el riesgo de sobreventas e inconsistencia de stock.</w:t>
+        <w:t>HU-18 / RF-009/010 (Reserva concurrente y liberación a las 24h) por el riesgo crítico de sobreventas e inconsistencia de stock.</w:t>
       </w:r>
     </w:p>
     <w:p>
@@ -5109,7 +6455,7 @@
           <w:rFonts w:ascii="Times New Roman" w:hAnsi="Times New Roman" w:cs="Times New Roman"/>
           <w:sz w:val="19"/>
         </w:rPr>
-        <w:t>Demuestra transacciones atómicas y scheduler autónomo. NO demuestra frontend React ni pasarela real.</w:t>
+        <w:t>Demuestra transacciones atómicas y scheduler autónomo, disponible en el repositorio de GitHub (poc/poc_reserva_concurrencia.py). NO demuestra frontend React ni pasarela real.</w:t>
       </w:r>
     </w:p>
     <w:p>
@@ -5840,7 +7186,7 @@
     <w:link w:val="EncabezadoCar"/>
     <w:uiPriority w:val="99"/>
     <w:unhideWhenUsed/>
-    <w:rsid w:val="00D919ED"/>
+    <w:rsid w:val="00A538C8"/>
     <w:pPr>
       <w:tabs>
         <w:tab w:val="center" w:pos="4419"/>
@@ -5854,7 +7200,7 @@
     <w:basedOn w:val="Fuentedeprrafopredeter"/>
     <w:link w:val="Encabezado"/>
     <w:uiPriority w:val="99"/>
-    <w:rsid w:val="00D919ED"/>
+    <w:rsid w:val="00A538C8"/>
   </w:style>
   <w:style w:type="paragraph" w:styleId="Piedepgina">
     <w:name w:val="footer"/>
@@ -5862,7 +7208,7 @@
     <w:link w:val="PiedepginaCar"/>
     <w:uiPriority w:val="99"/>
     <w:unhideWhenUsed/>
-    <w:rsid w:val="00D919ED"/>
+    <w:rsid w:val="00A538C8"/>
     <w:pPr>
       <w:tabs>
         <w:tab w:val="center" w:pos="4419"/>
@@ -5876,7 +7222,7 @@
     <w:basedOn w:val="Fuentedeprrafopredeter"/>
     <w:link w:val="Piedepgina"/>
     <w:uiPriority w:val="99"/>
-    <w:rsid w:val="00D919ED"/>
+    <w:rsid w:val="00A538C8"/>
   </w:style>
 </w:styles>
 </file>

</xml_diff>

<commit_message>
fix: sincronizacion de maquetacion final, 16 casos de uso y referencia profesional a GitHub en PoC
</commit_message>
<xml_diff>
--- a/docs/IS873_Nota1_Definicion_del_Proyecto_Consolidado.docx
+++ b/docs/IS873_Nota1_Definicion_del_Proyecto_Consolidado.docx
@@ -2681,9 +2681,9 @@
           <w:sz w:val="19"/>
         </w:rPr>
         <w:drawing>
-          <wp:inline distT="0" distB="0" distL="0" distR="0" wp14:anchorId="05C31DAE" wp14:editId="7EE00081">
-            <wp:extent cx="5334000" cy="13667187"/>
-            <wp:effectExtent l="0" t="0" r="0" b="0"/>
+          <wp:inline distT="0" distB="0" distL="0" distR="0" wp14:anchorId="743EFDB7" wp14:editId="3AFDE620">
+            <wp:extent cx="2626960" cy="6731000"/>
+            <wp:effectExtent l="0" t="0" r="2540" b="0"/>
             <wp:docPr id="1" name="Imagen 1"/>
             <wp:cNvGraphicFramePr/>
             <a:graphic xmlns:a="http://schemas.openxmlformats.org/drawingml/2006/main">
@@ -2708,7 +2708,7 @@
                   <pic:spPr>
                     <a:xfrm>
                       <a:off x="0" y="0"/>
-                      <a:ext cx="5334000" cy="13667187"/>
+                      <a:ext cx="2626960" cy="6731000"/>
                     </a:xfrm>
                     <a:prstGeom prst="rect">
                       <a:avLst/>
@@ -4231,9 +4231,9 @@
           <w:sz w:val="20"/>
         </w:rPr>
         <w:drawing>
-          <wp:inline distT="0" distB="0" distL="0" distR="0" wp14:anchorId="574077E4" wp14:editId="5DF9FB38">
-            <wp:extent cx="4953000" cy="8307632"/>
-            <wp:effectExtent l="0" t="0" r="0" b="0"/>
+          <wp:inline distT="0" distB="0" distL="0" distR="0" wp14:anchorId="73B94D99" wp14:editId="082D5BFE">
+            <wp:extent cx="4164449" cy="6985000"/>
+            <wp:effectExtent l="0" t="0" r="7620" b="6350"/>
             <wp:docPr id="2" name="Imagen 2"/>
             <wp:cNvGraphicFramePr/>
             <a:graphic xmlns:a="http://schemas.openxmlformats.org/drawingml/2006/main">
@@ -4258,7 +4258,7 @@
                   <pic:spPr>
                     <a:xfrm>
                       <a:off x="0" y="0"/>
-                      <a:ext cx="4953000" cy="8307632"/>
+                      <a:ext cx="4164449" cy="6985000"/>
                     </a:xfrm>
                     <a:prstGeom prst="rect">
                       <a:avLst/>
@@ -4308,9 +4308,9 @@
           <w:sz w:val="17"/>
         </w:rPr>
         <w:drawing>
-          <wp:inline distT="0" distB="0" distL="0" distR="0" wp14:anchorId="2C69A18C" wp14:editId="60F5FF9C">
-            <wp:extent cx="5334000" cy="12995391"/>
-            <wp:effectExtent l="0" t="0" r="0" b="0"/>
+          <wp:inline distT="0" distB="0" distL="0" distR="0" wp14:anchorId="22036BA4" wp14:editId="02B2FE49">
+            <wp:extent cx="2867016" cy="6985000"/>
+            <wp:effectExtent l="0" t="0" r="0" b="6350"/>
             <wp:docPr id="3" name="Imagen 3"/>
             <wp:cNvGraphicFramePr/>
             <a:graphic xmlns:a="http://schemas.openxmlformats.org/drawingml/2006/main">
@@ -4335,7 +4335,7 @@
                   <pic:spPr>
                     <a:xfrm>
                       <a:off x="0" y="0"/>
-                      <a:ext cx="5334000" cy="12995391"/>
+                      <a:ext cx="2867016" cy="6985000"/>
                     </a:xfrm>
                     <a:prstGeom prst="rect">
                       <a:avLst/>
@@ -4468,7 +4468,7 @@
           <w:sz w:val="19"/>
         </w:rPr>
         <w:drawing>
-          <wp:inline distT="0" distB="0" distL="0" distR="0" wp14:anchorId="5CC21158" wp14:editId="020D2792">
+          <wp:inline distT="0" distB="0" distL="0" distR="0" wp14:anchorId="237D419B" wp14:editId="3D18E5FB">
             <wp:extent cx="4191000" cy="3529920"/>
             <wp:effectExtent l="0" t="0" r="0" b="0"/>
             <wp:docPr id="4" name="Imagen 4"/>
@@ -4562,7 +4562,7 @@
           <w:sz w:val="19"/>
         </w:rPr>
         <w:drawing>
-          <wp:inline distT="0" distB="0" distL="0" distR="0" wp14:anchorId="2BE00A80" wp14:editId="563BFDDB">
+          <wp:inline distT="0" distB="0" distL="0" distR="0" wp14:anchorId="0A877587" wp14:editId="180619ED">
             <wp:extent cx="4191000" cy="5886278"/>
             <wp:effectExtent l="0" t="0" r="0" b="635"/>
             <wp:docPr id="5" name="Imagen 5"/>
@@ -4656,7 +4656,7 @@
           <w:sz w:val="19"/>
         </w:rPr>
         <w:drawing>
-          <wp:inline distT="0" distB="0" distL="0" distR="0" wp14:anchorId="51FA6A68" wp14:editId="7D7C8719">
+          <wp:inline distT="0" distB="0" distL="0" distR="0" wp14:anchorId="4ACFA5DA" wp14:editId="114CD9A3">
             <wp:extent cx="4191000" cy="2360764"/>
             <wp:effectExtent l="0" t="0" r="0" b="1905"/>
             <wp:docPr id="6" name="Imagen 6"/>
@@ -4750,7 +4750,7 @@
           <w:sz w:val="19"/>
         </w:rPr>
         <w:drawing>
-          <wp:inline distT="0" distB="0" distL="0" distR="0" wp14:anchorId="013FFAAE" wp14:editId="2762EE1D">
+          <wp:inline distT="0" distB="0" distL="0" distR="0" wp14:anchorId="26E2A476" wp14:editId="1942FD78">
             <wp:extent cx="4064000" cy="3364895"/>
             <wp:effectExtent l="0" t="0" r="0" b="6985"/>
             <wp:docPr id="7" name="Imagen 7"/>
@@ -4844,7 +4844,7 @@
           <w:sz w:val="19"/>
         </w:rPr>
         <w:drawing>
-          <wp:inline distT="0" distB="0" distL="0" distR="0" wp14:anchorId="64EC431A" wp14:editId="548009AC">
+          <wp:inline distT="0" distB="0" distL="0" distR="0" wp14:anchorId="4632D5AF" wp14:editId="316533E0">
             <wp:extent cx="4318000" cy="3388431"/>
             <wp:effectExtent l="0" t="0" r="6350" b="2540"/>
             <wp:docPr id="8" name="Imagen 8"/>
@@ -4938,7 +4938,7 @@
           <w:sz w:val="19"/>
         </w:rPr>
         <w:drawing>
-          <wp:inline distT="0" distB="0" distL="0" distR="0" wp14:anchorId="73EFD86F" wp14:editId="752CC499">
+          <wp:inline distT="0" distB="0" distL="0" distR="0" wp14:anchorId="11A1407F" wp14:editId="7A93F1AC">
             <wp:extent cx="3810000" cy="2503466"/>
             <wp:effectExtent l="0" t="0" r="0" b="0"/>
             <wp:docPr id="9" name="Imagen 9"/>
@@ -5032,7 +5032,7 @@
           <w:sz w:val="19"/>
         </w:rPr>
         <w:drawing>
-          <wp:inline distT="0" distB="0" distL="0" distR="0" wp14:anchorId="68A383AD" wp14:editId="4C28F044">
+          <wp:inline distT="0" distB="0" distL="0" distR="0" wp14:anchorId="1D74172B" wp14:editId="414CD764">
             <wp:extent cx="4191000" cy="3920786"/>
             <wp:effectExtent l="0" t="0" r="0" b="3810"/>
             <wp:docPr id="10" name="Imagen 10"/>
@@ -5126,7 +5126,7 @@
           <w:sz w:val="19"/>
         </w:rPr>
         <w:drawing>
-          <wp:inline distT="0" distB="0" distL="0" distR="0" wp14:anchorId="061C4F40" wp14:editId="28D0E1D1">
+          <wp:inline distT="0" distB="0" distL="0" distR="0" wp14:anchorId="2D6C59F4" wp14:editId="4B321A91">
             <wp:extent cx="4318000" cy="3838651"/>
             <wp:effectExtent l="0" t="0" r="6350" b="9525"/>
             <wp:docPr id="11" name="Imagen 11"/>
@@ -5220,7 +5220,7 @@
           <w:sz w:val="19"/>
         </w:rPr>
         <w:drawing>
-          <wp:inline distT="0" distB="0" distL="0" distR="0" wp14:anchorId="4EC452E8" wp14:editId="192FA55B">
+          <wp:inline distT="0" distB="0" distL="0" distR="0" wp14:anchorId="556ECE33" wp14:editId="3843F17C">
             <wp:extent cx="4191000" cy="3584386"/>
             <wp:effectExtent l="0" t="0" r="0" b="0"/>
             <wp:docPr id="12" name="Imagen 12"/>
@@ -5314,7 +5314,7 @@
           <w:sz w:val="19"/>
         </w:rPr>
         <w:drawing>
-          <wp:inline distT="0" distB="0" distL="0" distR="0" wp14:anchorId="5118B701" wp14:editId="088FFF02">
+          <wp:inline distT="0" distB="0" distL="0" distR="0" wp14:anchorId="52A88257" wp14:editId="3EC48CBC">
             <wp:extent cx="4191000" cy="2576966"/>
             <wp:effectExtent l="0" t="0" r="0" b="0"/>
             <wp:docPr id="13" name="Imagen 13"/>
@@ -5408,7 +5408,7 @@
           <w:sz w:val="19"/>
         </w:rPr>
         <w:drawing>
-          <wp:inline distT="0" distB="0" distL="0" distR="0" wp14:anchorId="4E0F24CE" wp14:editId="34781AED">
+          <wp:inline distT="0" distB="0" distL="0" distR="0" wp14:anchorId="5F06B73B" wp14:editId="43C4B729">
             <wp:extent cx="3810000" cy="3356180"/>
             <wp:effectExtent l="0" t="0" r="0" b="0"/>
             <wp:docPr id="14" name="Imagen 14"/>
@@ -5502,7 +5502,7 @@
           <w:sz w:val="19"/>
         </w:rPr>
         <w:drawing>
-          <wp:inline distT="0" distB="0" distL="0" distR="0" wp14:anchorId="15A9A085" wp14:editId="36FB13C8">
+          <wp:inline distT="0" distB="0" distL="0" distR="0" wp14:anchorId="504ECB27" wp14:editId="1B84B911">
             <wp:extent cx="3810000" cy="2209066"/>
             <wp:effectExtent l="0" t="0" r="0" b="1270"/>
             <wp:docPr id="15" name="Imagen 15"/>
@@ -7186,7 +7186,7 @@
     <w:link w:val="EncabezadoCar"/>
     <w:uiPriority w:val="99"/>
     <w:unhideWhenUsed/>
-    <w:rsid w:val="00A538C8"/>
+    <w:rsid w:val="00F02002"/>
     <w:pPr>
       <w:tabs>
         <w:tab w:val="center" w:pos="4419"/>
@@ -7200,7 +7200,7 @@
     <w:basedOn w:val="Fuentedeprrafopredeter"/>
     <w:link w:val="Encabezado"/>
     <w:uiPriority w:val="99"/>
-    <w:rsid w:val="00A538C8"/>
+    <w:rsid w:val="00F02002"/>
   </w:style>
   <w:style w:type="paragraph" w:styleId="Piedepgina">
     <w:name w:val="footer"/>
@@ -7208,7 +7208,7 @@
     <w:link w:val="PiedepginaCar"/>
     <w:uiPriority w:val="99"/>
     <w:unhideWhenUsed/>
-    <w:rsid w:val="00A538C8"/>
+    <w:rsid w:val="00F02002"/>
     <w:pPr>
       <w:tabs>
         <w:tab w:val="center" w:pos="4419"/>
@@ -7222,7 +7222,7 @@
     <w:basedOn w:val="Fuentedeprrafopredeter"/>
     <w:link w:val="Piedepgina"/>
     <w:uiPriority w:val="99"/>
-    <w:rsid w:val="00A538C8"/>
+    <w:rsid w:val="00F02002"/>
   </w:style>
 </w:styles>
 </file>

</xml_diff>